<commit_message>
Please provide the diff or a description of the changes so I can generate the commit message for you.
</commit_message>
<xml_diff>
--- a/iuh/môn/hkh-4/dinhTuyenChuyenMach/lab/lab3/lab3-LeThanhLong.docx
+++ b/iuh/môn/hkh-4/dinhTuyenChuyenMach/lab/lab3/lab3-LeThanhLong.docx
@@ -3132,6 +3132,318 @@
           <w:lang w:val="vi-VN"/>
         </w:rPr>
       </w:pPr>
+      <w:r>
+        <w:rPr>
+          <w:bCs/>
+          <w:sz w:val="26"/>
+          <w:szCs w:val="26"/>
+          <w:lang w:val="vi-VN"/>
+        </w:rPr>
+        <w:t>câu 3/</w:t>
+      </w:r>
+    </w:p>
+    <w:p>
+      <w:pPr>
+        <w:tabs>
+          <w:tab w:val="left" w:pos="3116"/>
+        </w:tabs>
+        <w:rPr>
+          <w:bCs/>
+          <w:sz w:val="26"/>
+          <w:szCs w:val="26"/>
+          <w:lang w:val="vi-VN"/>
+        </w:rPr>
+      </w:pPr>
+    </w:p>
+    <w:p>
+      <w:pPr>
+        <w:tabs>
+          <w:tab w:val="left" w:pos="3116"/>
+        </w:tabs>
+        <w:rPr>
+          <w:bCs/>
+          <w:sz w:val="26"/>
+          <w:szCs w:val="26"/>
+          <w:lang w:val="vi-VN"/>
+        </w:rPr>
+      </w:pPr>
+    </w:p>
+    <w:p>
+      <w:pPr>
+        <w:tabs>
+          <w:tab w:val="left" w:pos="3116"/>
+        </w:tabs>
+        <w:rPr>
+          <w:bCs/>
+          <w:sz w:val="26"/>
+          <w:szCs w:val="26"/>
+          <w:lang w:val="vi-VN"/>
+        </w:rPr>
+      </w:pPr>
+      <w:r>
+        <w:rPr>
+          <w:bCs/>
+          <w:sz w:val="26"/>
+          <w:szCs w:val="26"/>
+          <w:lang w:val="vi-VN"/>
+        </w:rPr>
+        <w:t>Quan sát bảng định tuyến của R1, ta sẽ thấy các dòng chứa chữ O. Chữ O ở đây đại diện cho giao thức định tuyến OSPF (Open Shortest Path First).</w:t>
+      </w:r>
+    </w:p>
+    <w:p>
+      <w:pPr>
+        <w:tabs>
+          <w:tab w:val="left" w:pos="3116"/>
+        </w:tabs>
+        <w:rPr>
+          <w:bCs/>
+          <w:sz w:val="26"/>
+          <w:szCs w:val="26"/>
+          <w:lang w:val="vi-VN"/>
+        </w:rPr>
+      </w:pPr>
+      <w:r>
+        <w:rPr>
+          <w:bCs/>
+          <w:sz w:val="26"/>
+          <w:szCs w:val="26"/>
+          <w:lang w:val="vi-VN"/>
+        </w:rPr>
+        <w:t xml:space="preserve">- Lấy ví dụ thực tế một dòng tuyến đường học được qua OSPF trong hình chụp của bạn: </w:t>
+      </w:r>
+    </w:p>
+    <w:p>
+      <w:pPr>
+        <w:tabs>
+          <w:tab w:val="left" w:pos="3116"/>
+        </w:tabs>
+        <w:rPr>
+          <w:bCs/>
+          <w:sz w:val="26"/>
+          <w:szCs w:val="26"/>
+          <w:lang w:val="vi-VN"/>
+        </w:rPr>
+      </w:pPr>
+      <w:r>
+        <w:rPr>
+          <w:bCs/>
+          <w:sz w:val="26"/>
+          <w:szCs w:val="26"/>
+          <w:lang w:val="vi-VN"/>
+        </w:rPr>
+        <w:t xml:space="preserve">  O     192.168.2.0/24 [110/20] via 192.168.123.2, 00:27:00, Ethernet0/0</w:t>
+      </w:r>
+    </w:p>
+    <w:p>
+      <w:pPr>
+        <w:tabs>
+          <w:tab w:val="left" w:pos="3116"/>
+        </w:tabs>
+        <w:rPr>
+          <w:bCs/>
+          <w:sz w:val="26"/>
+          <w:szCs w:val="26"/>
+          <w:lang w:val="vi-VN"/>
+        </w:rPr>
+      </w:pPr>
+    </w:p>
+    <w:p>
+      <w:pPr>
+        <w:tabs>
+          <w:tab w:val="left" w:pos="3116"/>
+        </w:tabs>
+        <w:rPr>
+          <w:bCs/>
+          <w:sz w:val="26"/>
+          <w:szCs w:val="26"/>
+          <w:lang w:val="vi-VN"/>
+        </w:rPr>
+      </w:pPr>
+      <w:r>
+        <w:rPr>
+          <w:bCs/>
+          <w:sz w:val="26"/>
+          <w:szCs w:val="26"/>
+          <w:lang w:val="vi-VN"/>
+        </w:rPr>
+        <w:t>- Giải thích chi tiết các thành phần:</w:t>
+      </w:r>
+    </w:p>
+    <w:p>
+      <w:pPr>
+        <w:tabs>
+          <w:tab w:val="left" w:pos="3116"/>
+        </w:tabs>
+        <w:rPr>
+          <w:bCs/>
+          <w:sz w:val="26"/>
+          <w:szCs w:val="26"/>
+          <w:lang w:val="vi-VN"/>
+        </w:rPr>
+      </w:pPr>
+      <w:r>
+        <w:rPr>
+          <w:bCs/>
+          <w:sz w:val="26"/>
+          <w:szCs w:val="26"/>
+          <w:lang w:val="vi-VN"/>
+        </w:rPr>
+        <w:t xml:space="preserve">  + O: Tuyến đường này được học tự động thông qua giao thức định tuyến động OSPF.</w:t>
+      </w:r>
+    </w:p>
+    <w:p>
+      <w:pPr>
+        <w:tabs>
+          <w:tab w:val="left" w:pos="3116"/>
+        </w:tabs>
+        <w:rPr>
+          <w:bCs/>
+          <w:sz w:val="26"/>
+          <w:szCs w:val="26"/>
+          <w:lang w:val="vi-VN"/>
+        </w:rPr>
+      </w:pPr>
+      <w:r>
+        <w:rPr>
+          <w:bCs/>
+          <w:sz w:val="26"/>
+          <w:szCs w:val="26"/>
+          <w:lang w:val="vi-VN"/>
+        </w:rPr>
+        <w:t xml:space="preserve">  + 192.168.2.0/24: Địa chỉ IP của mạng đích cần đến (Ví dụ: mạng LAN của PC VPC6).</w:t>
+      </w:r>
+    </w:p>
+    <w:p>
+      <w:pPr>
+        <w:tabs>
+          <w:tab w:val="left" w:pos="3116"/>
+        </w:tabs>
+        <w:rPr>
+          <w:bCs/>
+          <w:sz w:val="26"/>
+          <w:szCs w:val="26"/>
+          <w:lang w:val="vi-VN"/>
+        </w:rPr>
+      </w:pPr>
+      <w:r>
+        <w:rPr>
+          <w:bCs/>
+          <w:sz w:val="26"/>
+          <w:szCs w:val="26"/>
+          <w:lang w:val="vi-VN"/>
+        </w:rPr>
+        <w:t xml:space="preserve">  + [110/20]: </w:t>
+      </w:r>
+    </w:p>
+    <w:p>
+      <w:pPr>
+        <w:tabs>
+          <w:tab w:val="left" w:pos="3116"/>
+        </w:tabs>
+        <w:rPr>
+          <w:bCs/>
+          <w:sz w:val="26"/>
+          <w:szCs w:val="26"/>
+          <w:lang w:val="vi-VN"/>
+        </w:rPr>
+      </w:pPr>
+      <w:r>
+        <w:rPr>
+          <w:bCs/>
+          <w:sz w:val="26"/>
+          <w:szCs w:val="26"/>
+          <w:lang w:val="vi-VN"/>
+        </w:rPr>
+        <w:t xml:space="preserve">     110 là Administrative Distance (Độ tin cậy) mặc định của OSPF. </w:t>
+      </w:r>
+    </w:p>
+    <w:p>
+      <w:pPr>
+        <w:tabs>
+          <w:tab w:val="left" w:pos="3116"/>
+        </w:tabs>
+        <w:rPr>
+          <w:bCs/>
+          <w:sz w:val="26"/>
+          <w:szCs w:val="26"/>
+          <w:lang w:val="vi-VN"/>
+        </w:rPr>
+      </w:pPr>
+      <w:r>
+        <w:rPr>
+          <w:bCs/>
+          <w:sz w:val="26"/>
+          <w:szCs w:val="26"/>
+          <w:lang w:val="vi-VN"/>
+        </w:rPr>
+        <w:t xml:space="preserve">     20 là Metric / Cost (Chi phí đường đi). Do cáp Ethernet có băng thông 10Mbps (Cost=10), đi qua 2 chặng R1-R5 và R5-R2 nên tổng Cost = 20.</w:t>
+      </w:r>
+    </w:p>
+    <w:p>
+      <w:pPr>
+        <w:tabs>
+          <w:tab w:val="left" w:pos="3116"/>
+        </w:tabs>
+        <w:rPr>
+          <w:bCs/>
+          <w:sz w:val="26"/>
+          <w:szCs w:val="26"/>
+          <w:lang w:val="vi-VN"/>
+        </w:rPr>
+      </w:pPr>
+      <w:r>
+        <w:rPr>
+          <w:bCs/>
+          <w:sz w:val="26"/>
+          <w:szCs w:val="26"/>
+          <w:lang w:val="vi-VN"/>
+        </w:rPr>
+        <w:t xml:space="preserve">  + via 192.168.123.2: Địa chỉ IP của trạm kế tiếp (Next-hop) để chuyển tiếp gói tin. Ở đây OSPF đã khôn ngoan chọn đi qua ngõ 192.168.123.2 (đường Switch R5) thay vì đi qua đường Serial (192.168.12.2).</w:t>
+      </w:r>
+    </w:p>
+    <w:p>
+      <w:pPr>
+        <w:tabs>
+          <w:tab w:val="left" w:pos="3116"/>
+        </w:tabs>
+        <w:rPr>
+          <w:bCs/>
+          <w:sz w:val="26"/>
+          <w:szCs w:val="26"/>
+          <w:lang w:val="vi-VN"/>
+        </w:rPr>
+      </w:pPr>
+      <w:r>
+        <w:rPr>
+          <w:bCs/>
+          <w:sz w:val="26"/>
+          <w:szCs w:val="26"/>
+          <w:lang w:val="vi-VN"/>
+        </w:rPr>
+        <w:t xml:space="preserve">  + 00:27:00: Thời gian (Timers) kể từ lần cuối cùng tuyến đường này được cập nhật.</w:t>
+      </w:r>
+    </w:p>
+    <w:p>
+      <w:pPr>
+        <w:tabs>
+          <w:tab w:val="left" w:pos="3116"/>
+        </w:tabs>
+        <w:rPr>
+          <w:bCs/>
+          <w:sz w:val="26"/>
+          <w:szCs w:val="26"/>
+          <w:lang w:val="vi-VN"/>
+        </w:rPr>
+      </w:pPr>
+      <w:r>
+        <w:rPr>
+          <w:bCs/>
+          <w:sz w:val="26"/>
+          <w:szCs w:val="26"/>
+          <w:lang w:val="vi-VN"/>
+        </w:rPr>
+        <w:t xml:space="preserve">  + Ethernet0/0: Gói tin sẽ được đẩy ra khỏi Router thông qua cổng cáp này để đi đến đích, hoàn toàn né con đường cáp Serial chậm chạp.</w:t>
+      </w:r>
     </w:p>
     <w:p>
       <w:pPr>
@@ -3202,14 +3514,3809 @@
           <w:lang w:val="vi-VN"/>
         </w:rPr>
       </w:pPr>
-      <w:r>
-        <w:rPr>
-          <w:bCs/>
-          <w:sz w:val="26"/>
-          <w:szCs w:val="26"/>
-          <w:lang w:val="vi-VN"/>
-        </w:rPr>
-        <w:t xml:space="preserve">Bảng định tuyến r2 </w:t>
+    </w:p>
+    <w:p>
+      <w:pPr>
+        <w:tabs>
+          <w:tab w:val="left" w:pos="3116"/>
+        </w:tabs>
+        <w:rPr>
+          <w:bCs/>
+          <w:sz w:val="26"/>
+          <w:szCs w:val="26"/>
+          <w:lang w:val="vi-VN"/>
+        </w:rPr>
+      </w:pPr>
+      <w:r>
+        <w:rPr>
+          <w:bCs/>
+          <w:sz w:val="26"/>
+          <w:szCs w:val="26"/>
+          <w:lang w:val="vi-VN"/>
+        </w:rPr>
+        <w:t>Câu 4</w:t>
+      </w:r>
+    </w:p>
+    <w:p>
+      <w:pPr>
+        <w:tabs>
+          <w:tab w:val="left" w:pos="3116"/>
+        </w:tabs>
+        <w:rPr>
+          <w:bCs/>
+          <w:sz w:val="26"/>
+          <w:szCs w:val="26"/>
+          <w:lang w:val="vi-VN"/>
+        </w:rPr>
+      </w:pPr>
+      <w:r>
+        <w:rPr>
+          <w:bCs/>
+          <w:sz w:val="26"/>
+          <w:szCs w:val="26"/>
+          <w:lang w:val="vi-VN"/>
+        </w:rPr>
+        <w:t>- Trái ngược với giao thức RIP (đếm số trạm nhảy), giao thức OSPF là giao thức định tuyến theo trạng thái liên kết (Link-State). Nó dùng thuật toán Dijkstra để tính toán đường đi có tổng chi phí (Cost) thấp nhất, trong đó Cost phụ thuộc hoàn toàn vào tốc độ băng thông (Bandwidth) của sợi cáp.</w:t>
+      </w:r>
+    </w:p>
+    <w:p>
+      <w:pPr>
+        <w:tabs>
+          <w:tab w:val="left" w:pos="3116"/>
+        </w:tabs>
+        <w:rPr>
+          <w:bCs/>
+          <w:sz w:val="26"/>
+          <w:szCs w:val="26"/>
+          <w:lang w:val="vi-VN"/>
+        </w:rPr>
+      </w:pPr>
+      <w:r>
+        <w:rPr>
+          <w:bCs/>
+          <w:sz w:val="26"/>
+          <w:szCs w:val="26"/>
+          <w:lang w:val="vi-VN"/>
+        </w:rPr>
+        <w:t xml:space="preserve">- Đường đi thực tế của gói tin dựa trên kết quả Trace: </w:t>
+      </w:r>
+    </w:p>
+    <w:p>
+      <w:pPr>
+        <w:tabs>
+          <w:tab w:val="left" w:pos="3116"/>
+        </w:tabs>
+        <w:rPr>
+          <w:bCs/>
+          <w:sz w:val="26"/>
+          <w:szCs w:val="26"/>
+          <w:lang w:val="vi-VN"/>
+        </w:rPr>
+      </w:pPr>
+      <w:r>
+        <w:rPr>
+          <w:bCs/>
+          <w:sz w:val="26"/>
+          <w:szCs w:val="26"/>
+          <w:lang w:val="vi-VN"/>
+        </w:rPr>
+        <w:t xml:space="preserve">  Lấy ví dụ kết quả Trace từ VPC7 sang VPC6 (192.168.2.10), gói tin đi qua các trạm:</w:t>
+      </w:r>
+    </w:p>
+    <w:p>
+      <w:pPr>
+        <w:tabs>
+          <w:tab w:val="left" w:pos="3116"/>
+        </w:tabs>
+        <w:rPr>
+          <w:bCs/>
+          <w:sz w:val="26"/>
+          <w:szCs w:val="26"/>
+          <w:lang w:val="vi-VN"/>
+        </w:rPr>
+      </w:pPr>
+      <w:r>
+        <w:rPr>
+          <w:bCs/>
+          <w:sz w:val="26"/>
+          <w:szCs w:val="26"/>
+          <w:lang w:val="vi-VN"/>
+        </w:rPr>
+        <w:t xml:space="preserve">  + Hop 1: 192.168.1.1 (Đi lên cổng Gateway của Router R1).</w:t>
+      </w:r>
+    </w:p>
+    <w:p>
+      <w:pPr>
+        <w:tabs>
+          <w:tab w:val="left" w:pos="3116"/>
+        </w:tabs>
+        <w:rPr>
+          <w:bCs/>
+          <w:sz w:val="26"/>
+          <w:szCs w:val="26"/>
+          <w:lang w:val="vi-VN"/>
+        </w:rPr>
+      </w:pPr>
+      <w:r>
+        <w:rPr>
+          <w:bCs/>
+          <w:sz w:val="26"/>
+          <w:szCs w:val="26"/>
+          <w:lang w:val="vi-VN"/>
+        </w:rPr>
+        <w:t xml:space="preserve">  + Hop 2: 192.168.123.2 (Từ R1 đi ngang qua cáp Ethernet nối vào Switch R5 để sang Router R2). Dù R1 và R2 có cáp Serial nối trực tiếp với nhau, gói tin vẫn không thèm chọn đi qua đường cáp Serial đó.</w:t>
+      </w:r>
+    </w:p>
+    <w:p>
+      <w:pPr>
+        <w:tabs>
+          <w:tab w:val="left" w:pos="3116"/>
+        </w:tabs>
+        <w:rPr>
+          <w:bCs/>
+          <w:sz w:val="26"/>
+          <w:szCs w:val="26"/>
+          <w:lang w:val="vi-VN"/>
+        </w:rPr>
+      </w:pPr>
+      <w:r>
+        <w:rPr>
+          <w:bCs/>
+          <w:sz w:val="26"/>
+          <w:szCs w:val="26"/>
+          <w:lang w:val="vi-VN"/>
+        </w:rPr>
+        <w:t xml:space="preserve">  + Hop 3: 192.168.2.10 (Destination port unreachable) (Đã chạm đến máy đích VPC6 thành công. Thông báo báo lỗi Unreachable ở bước cuối là đặc trưng bình thường của VPCS khi trace bằng UDP).</w:t>
+      </w:r>
+    </w:p>
+    <w:p>
+      <w:pPr>
+        <w:tabs>
+          <w:tab w:val="left" w:pos="3116"/>
+        </w:tabs>
+        <w:rPr>
+          <w:bCs/>
+          <w:sz w:val="26"/>
+          <w:szCs w:val="26"/>
+          <w:lang w:val="vi-VN"/>
+        </w:rPr>
+      </w:pPr>
+      <w:r>
+        <w:rPr>
+          <w:bCs/>
+          <w:sz w:val="26"/>
+          <w:szCs w:val="26"/>
+          <w:lang w:val="vi-VN"/>
+        </w:rPr>
+        <w:t xml:space="preserve">  (Trường hợp từ VPC9 trace sang VPC6 cũng cho ra kết quả y hệt: nhảy qua Gateway 192.168.3.1 rồi đi vòng qua R2 bằng đường 192.168.123.2 qua Switch R5).</w:t>
+      </w:r>
+    </w:p>
+    <w:p>
+      <w:pPr>
+        <w:tabs>
+          <w:tab w:val="left" w:pos="3116"/>
+        </w:tabs>
+        <w:rPr>
+          <w:bCs/>
+          <w:sz w:val="26"/>
+          <w:szCs w:val="26"/>
+          <w:lang w:val="vi-VN"/>
+        </w:rPr>
+      </w:pPr>
+      <w:r>
+        <w:rPr>
+          <w:bCs/>
+          <w:sz w:val="26"/>
+          <w:szCs w:val="26"/>
+          <w:lang w:val="vi-VN"/>
+        </w:rPr>
+        <w:lastRenderedPageBreak/>
+        <w:t>- Kết luận: Tại sao OSPF lại chọn đi vòng qua Switch R5? Vì cáp FastEthernet/Ethernet có băng thông 100Mbps/10Mbps (Cost rất thấp, chỉ bằng 1 hoặc 10). Trong khi cáp Serial có băng thông cực kỳ hẹp chỉ 1.544Mbps (Cost lên tới 64). OSPF đủ thông minh để chê con đường Serial "đường hẹp kẹt xe" và dồn toàn bộ gói tin đi qua con đường cao tốc Ethernet băng thông rộng. Đi qua Switch R5 chính là con đường tối ưu và nhanh nhất!</w:t>
+      </w:r>
+    </w:p>
+    <w:p>
+      <w:pPr>
+        <w:tabs>
+          <w:tab w:val="left" w:pos="3116"/>
+        </w:tabs>
+        <w:rPr>
+          <w:bCs/>
+          <w:sz w:val="26"/>
+          <w:szCs w:val="26"/>
+          <w:lang w:val="vi-VN"/>
+        </w:rPr>
+      </w:pPr>
+      <w:r>
+        <w:rPr>
+          <w:bCs/>
+          <w:sz w:val="26"/>
+          <w:szCs w:val="26"/>
+          <w:lang w:val="vi-VN"/>
+        </w:rPr>
+        <w:drawing>
+          <wp:inline distT="0" distB="0" distL="0" distR="0" wp14:anchorId="48D05A26" wp14:editId="0384943C">
+            <wp:extent cx="5943600" cy="3785870"/>
+            <wp:effectExtent l="0" t="0" r="0" b="5080"/>
+            <wp:docPr id="1645429765" name="Picture 1"/>
+            <wp:cNvGraphicFramePr>
+              <a:graphicFrameLocks xmlns:a="http://schemas.openxmlformats.org/drawingml/2006/main" noChangeAspect="1"/>
+            </wp:cNvGraphicFramePr>
+            <a:graphic xmlns:a="http://schemas.openxmlformats.org/drawingml/2006/main">
+              <a:graphicData uri="http://schemas.openxmlformats.org/drawingml/2006/picture">
+                <pic:pic xmlns:pic="http://schemas.openxmlformats.org/drawingml/2006/picture">
+                  <pic:nvPicPr>
+                    <pic:cNvPr id="1645429765" name=""/>
+                    <pic:cNvPicPr/>
+                  </pic:nvPicPr>
+                  <pic:blipFill>
+                    <a:blip r:embed="rId13"/>
+                    <a:stretch>
+                      <a:fillRect/>
+                    </a:stretch>
+                  </pic:blipFill>
+                  <pic:spPr>
+                    <a:xfrm>
+                      <a:off x="0" y="0"/>
+                      <a:ext cx="5943600" cy="3785870"/>
+                    </a:xfrm>
+                    <a:prstGeom prst="rect">
+                      <a:avLst/>
+                    </a:prstGeom>
+                  </pic:spPr>
+                </pic:pic>
+              </a:graphicData>
+            </a:graphic>
+          </wp:inline>
+        </w:drawing>
+      </w:r>
+    </w:p>
+    <w:p>
+      <w:pPr>
+        <w:tabs>
+          <w:tab w:val="left" w:pos="3116"/>
+        </w:tabs>
+        <w:rPr>
+          <w:bCs/>
+          <w:sz w:val="26"/>
+          <w:szCs w:val="26"/>
+          <w:lang w:val="vi-VN"/>
+        </w:rPr>
+      </w:pPr>
+    </w:p>
+    <w:p>
+      <w:pPr>
+        <w:tabs>
+          <w:tab w:val="left" w:pos="3116"/>
+        </w:tabs>
+        <w:rPr>
+          <w:bCs/>
+          <w:sz w:val="26"/>
+          <w:szCs w:val="26"/>
+          <w:lang w:val="vi-VN"/>
+        </w:rPr>
+      </w:pPr>
+      <w:r>
+        <w:rPr>
+          <w:bCs/>
+          <w:sz w:val="26"/>
+          <w:szCs w:val="26"/>
+          <w:lang w:val="vi-VN"/>
+        </w:rPr>
+        <w:lastRenderedPageBreak/>
+        <w:drawing>
+          <wp:inline distT="0" distB="0" distL="0" distR="0" wp14:anchorId="521238DD" wp14:editId="70F9A28E">
+            <wp:extent cx="5943600" cy="3695700"/>
+            <wp:effectExtent l="0" t="0" r="0" b="0"/>
+            <wp:docPr id="1162938378" name="Picture 1"/>
+            <wp:cNvGraphicFramePr>
+              <a:graphicFrameLocks xmlns:a="http://schemas.openxmlformats.org/drawingml/2006/main" noChangeAspect="1"/>
+            </wp:cNvGraphicFramePr>
+            <a:graphic xmlns:a="http://schemas.openxmlformats.org/drawingml/2006/main">
+              <a:graphicData uri="http://schemas.openxmlformats.org/drawingml/2006/picture">
+                <pic:pic xmlns:pic="http://schemas.openxmlformats.org/drawingml/2006/picture">
+                  <pic:nvPicPr>
+                    <pic:cNvPr id="1162938378" name=""/>
+                    <pic:cNvPicPr/>
+                  </pic:nvPicPr>
+                  <pic:blipFill>
+                    <a:blip r:embed="rId14"/>
+                    <a:stretch>
+                      <a:fillRect/>
+                    </a:stretch>
+                  </pic:blipFill>
+                  <pic:spPr>
+                    <a:xfrm>
+                      <a:off x="0" y="0"/>
+                      <a:ext cx="5943600" cy="3695700"/>
+                    </a:xfrm>
+                    <a:prstGeom prst="rect">
+                      <a:avLst/>
+                    </a:prstGeom>
+                  </pic:spPr>
+                </pic:pic>
+              </a:graphicData>
+            </a:graphic>
+          </wp:inline>
+        </w:drawing>
+      </w:r>
+    </w:p>
+    <w:p>
+      <w:pPr>
+        <w:tabs>
+          <w:tab w:val="left" w:pos="3116"/>
+        </w:tabs>
+        <w:rPr>
+          <w:bCs/>
+          <w:sz w:val="26"/>
+          <w:szCs w:val="26"/>
+          <w:lang w:val="vi-VN"/>
+        </w:rPr>
+      </w:pPr>
+    </w:p>
+    <w:p>
+      <w:pPr>
+        <w:tabs>
+          <w:tab w:val="left" w:pos="3116"/>
+        </w:tabs>
+        <w:rPr>
+          <w:bCs/>
+          <w:sz w:val="26"/>
+          <w:szCs w:val="26"/>
+          <w:lang w:val="vi-VN"/>
+        </w:rPr>
+      </w:pPr>
+      <w:r>
+        <w:rPr>
+          <w:bCs/>
+          <w:sz w:val="26"/>
+          <w:szCs w:val="26"/>
+          <w:lang w:val="vi-VN"/>
+        </w:rPr>
+        <w:t>Bài 2</w:t>
+      </w:r>
+    </w:p>
+    <w:p>
+      <w:pPr>
+        <w:tabs>
+          <w:tab w:val="left" w:pos="3116"/>
+        </w:tabs>
+        <w:rPr>
+          <w:bCs/>
+          <w:sz w:val="26"/>
+          <w:szCs w:val="26"/>
+          <w:lang w:val="vi-VN"/>
+        </w:rPr>
+      </w:pPr>
+    </w:p>
+    <w:p>
+      <w:pPr>
+        <w:tabs>
+          <w:tab w:val="left" w:pos="3116"/>
+        </w:tabs>
+        <w:rPr>
+          <w:bCs/>
+          <w:sz w:val="26"/>
+          <w:szCs w:val="26"/>
+          <w:lang w:val="vi-VN"/>
+        </w:rPr>
+      </w:pPr>
+      <w:r>
+        <w:rPr>
+          <w:bCs/>
+          <w:sz w:val="26"/>
+          <w:szCs w:val="26"/>
+          <w:lang w:val="vi-VN"/>
+        </w:rPr>
+        <w:lastRenderedPageBreak/>
+        <w:drawing>
+          <wp:inline distT="0" distB="0" distL="0" distR="0" wp14:anchorId="36DE665C" wp14:editId="58D79F21">
+            <wp:extent cx="5943600" cy="3829685"/>
+            <wp:effectExtent l="0" t="0" r="0" b="0"/>
+            <wp:docPr id="294653332" name="Picture 1"/>
+            <wp:cNvGraphicFramePr>
+              <a:graphicFrameLocks xmlns:a="http://schemas.openxmlformats.org/drawingml/2006/main" noChangeAspect="1"/>
+            </wp:cNvGraphicFramePr>
+            <a:graphic xmlns:a="http://schemas.openxmlformats.org/drawingml/2006/main">
+              <a:graphicData uri="http://schemas.openxmlformats.org/drawingml/2006/picture">
+                <pic:pic xmlns:pic="http://schemas.openxmlformats.org/drawingml/2006/picture">
+                  <pic:nvPicPr>
+                    <pic:cNvPr id="294653332" name=""/>
+                    <pic:cNvPicPr/>
+                  </pic:nvPicPr>
+                  <pic:blipFill>
+                    <a:blip r:embed="rId15"/>
+                    <a:stretch>
+                      <a:fillRect/>
+                    </a:stretch>
+                  </pic:blipFill>
+                  <pic:spPr>
+                    <a:xfrm>
+                      <a:off x="0" y="0"/>
+                      <a:ext cx="5943600" cy="3829685"/>
+                    </a:xfrm>
+                    <a:prstGeom prst="rect">
+                      <a:avLst/>
+                    </a:prstGeom>
+                  </pic:spPr>
+                </pic:pic>
+              </a:graphicData>
+            </a:graphic>
+          </wp:inline>
+        </w:drawing>
+      </w:r>
+      <w:r>
+        <w:rPr>
+          <w:bCs/>
+          <w:sz w:val="26"/>
+          <w:szCs w:val="26"/>
+          <w:lang w:val="vi-VN"/>
+        </w:rPr>
+        <w:drawing>
+          <wp:inline distT="0" distB="0" distL="0" distR="0" wp14:anchorId="34A7916C" wp14:editId="1B82B327">
+            <wp:extent cx="5363323" cy="4039164"/>
+            <wp:effectExtent l="0" t="0" r="0" b="0"/>
+            <wp:docPr id="645718222" name="Picture 1"/>
+            <wp:cNvGraphicFramePr>
+              <a:graphicFrameLocks xmlns:a="http://schemas.openxmlformats.org/drawingml/2006/main" noChangeAspect="1"/>
+            </wp:cNvGraphicFramePr>
+            <a:graphic xmlns:a="http://schemas.openxmlformats.org/drawingml/2006/main">
+              <a:graphicData uri="http://schemas.openxmlformats.org/drawingml/2006/picture">
+                <pic:pic xmlns:pic="http://schemas.openxmlformats.org/drawingml/2006/picture">
+                  <pic:nvPicPr>
+                    <pic:cNvPr id="645718222" name=""/>
+                    <pic:cNvPicPr/>
+                  </pic:nvPicPr>
+                  <pic:blipFill>
+                    <a:blip r:embed="rId16"/>
+                    <a:stretch>
+                      <a:fillRect/>
+                    </a:stretch>
+                  </pic:blipFill>
+                  <pic:spPr>
+                    <a:xfrm>
+                      <a:off x="0" y="0"/>
+                      <a:ext cx="5363323" cy="4039164"/>
+                    </a:xfrm>
+                    <a:prstGeom prst="rect">
+                      <a:avLst/>
+                    </a:prstGeom>
+                  </pic:spPr>
+                </pic:pic>
+              </a:graphicData>
+            </a:graphic>
+          </wp:inline>
+        </w:drawing>
+      </w:r>
+    </w:p>
+    <w:p>
+      <w:pPr>
+        <w:tabs>
+          <w:tab w:val="left" w:pos="3116"/>
+        </w:tabs>
+        <w:rPr>
+          <w:bCs/>
+          <w:sz w:val="26"/>
+          <w:szCs w:val="26"/>
+          <w:lang w:val="vi-VN"/>
+        </w:rPr>
+      </w:pPr>
+    </w:p>
+    <w:p>
+      <w:pPr>
+        <w:tabs>
+          <w:tab w:val="left" w:pos="3116"/>
+        </w:tabs>
+        <w:rPr>
+          <w:bCs/>
+          <w:sz w:val="26"/>
+          <w:szCs w:val="26"/>
+          <w:lang w:val="vi-VN"/>
+        </w:rPr>
+      </w:pPr>
+      <w:r>
+        <w:rPr>
+          <w:bCs/>
+          <w:sz w:val="26"/>
+          <w:szCs w:val="26"/>
+          <w:lang w:val="vi-VN"/>
+        </w:rPr>
+        <w:lastRenderedPageBreak/>
+        <w:t>========== RAW CONFIGURATION COMMANDS ==========</w:t>
+      </w:r>
+    </w:p>
+    <w:p>
+      <w:pPr>
+        <w:tabs>
+          <w:tab w:val="left" w:pos="3116"/>
+        </w:tabs>
+        <w:rPr>
+          <w:bCs/>
+          <w:sz w:val="26"/>
+          <w:szCs w:val="26"/>
+          <w:lang w:val="vi-VN"/>
+        </w:rPr>
+      </w:pPr>
+    </w:p>
+    <w:p>
+      <w:pPr>
+        <w:tabs>
+          <w:tab w:val="left" w:pos="3116"/>
+        </w:tabs>
+        <w:rPr>
+          <w:bCs/>
+          <w:sz w:val="26"/>
+          <w:szCs w:val="26"/>
+          <w:lang w:val="vi-VN"/>
+        </w:rPr>
+      </w:pPr>
+      <w:r>
+        <w:rPr>
+          <w:bCs/>
+          <w:sz w:val="26"/>
+          <w:szCs w:val="26"/>
+          <w:lang w:val="vi-VN"/>
+        </w:rPr>
+        <w:t>========== Tên thiết bị: R1 (router) ==========</w:t>
+      </w:r>
+    </w:p>
+    <w:p>
+      <w:pPr>
+        <w:tabs>
+          <w:tab w:val="left" w:pos="3116"/>
+        </w:tabs>
+        <w:rPr>
+          <w:bCs/>
+          <w:sz w:val="26"/>
+          <w:szCs w:val="26"/>
+          <w:lang w:val="vi-VN"/>
+        </w:rPr>
+      </w:pPr>
+      <w:r>
+        <w:rPr>
+          <w:bCs/>
+          <w:sz w:val="26"/>
+          <w:szCs w:val="26"/>
+          <w:lang w:val="vi-VN"/>
+        </w:rPr>
+        <w:t>enable</w:t>
+      </w:r>
+    </w:p>
+    <w:p>
+      <w:pPr>
+        <w:tabs>
+          <w:tab w:val="left" w:pos="3116"/>
+        </w:tabs>
+        <w:rPr>
+          <w:bCs/>
+          <w:sz w:val="26"/>
+          <w:szCs w:val="26"/>
+          <w:lang w:val="vi-VN"/>
+        </w:rPr>
+      </w:pPr>
+      <w:r>
+        <w:rPr>
+          <w:bCs/>
+          <w:sz w:val="26"/>
+          <w:szCs w:val="26"/>
+          <w:lang w:val="vi-VN"/>
+        </w:rPr>
+        <w:t>configure terminal</w:t>
+      </w:r>
+    </w:p>
+    <w:p>
+      <w:pPr>
+        <w:tabs>
+          <w:tab w:val="left" w:pos="3116"/>
+        </w:tabs>
+        <w:rPr>
+          <w:bCs/>
+          <w:sz w:val="26"/>
+          <w:szCs w:val="26"/>
+          <w:lang w:val="vi-VN"/>
+        </w:rPr>
+      </w:pPr>
+      <w:r>
+        <w:rPr>
+          <w:bCs/>
+          <w:sz w:val="26"/>
+          <w:szCs w:val="26"/>
+          <w:lang w:val="vi-VN"/>
+        </w:rPr>
+        <w:t>interface s1/0</w:t>
+      </w:r>
+    </w:p>
+    <w:p>
+      <w:pPr>
+        <w:tabs>
+          <w:tab w:val="left" w:pos="3116"/>
+        </w:tabs>
+        <w:rPr>
+          <w:bCs/>
+          <w:sz w:val="26"/>
+          <w:szCs w:val="26"/>
+          <w:lang w:val="vi-VN"/>
+        </w:rPr>
+      </w:pPr>
+      <w:r>
+        <w:rPr>
+          <w:bCs/>
+          <w:sz w:val="26"/>
+          <w:szCs w:val="26"/>
+          <w:lang w:val="vi-VN"/>
+        </w:rPr>
+        <w:t>ip address 192.168.23.1 255.255.255.0</w:t>
+      </w:r>
+    </w:p>
+    <w:p>
+      <w:pPr>
+        <w:tabs>
+          <w:tab w:val="left" w:pos="3116"/>
+        </w:tabs>
+        <w:rPr>
+          <w:bCs/>
+          <w:sz w:val="26"/>
+          <w:szCs w:val="26"/>
+          <w:lang w:val="vi-VN"/>
+        </w:rPr>
+      </w:pPr>
+      <w:r>
+        <w:rPr>
+          <w:bCs/>
+          <w:sz w:val="26"/>
+          <w:szCs w:val="26"/>
+          <w:lang w:val="vi-VN"/>
+        </w:rPr>
+        <w:t>no shutdown</w:t>
+      </w:r>
+    </w:p>
+    <w:p>
+      <w:pPr>
+        <w:tabs>
+          <w:tab w:val="left" w:pos="3116"/>
+        </w:tabs>
+        <w:rPr>
+          <w:bCs/>
+          <w:sz w:val="26"/>
+          <w:szCs w:val="26"/>
+          <w:lang w:val="vi-VN"/>
+        </w:rPr>
+      </w:pPr>
+      <w:r>
+        <w:rPr>
+          <w:bCs/>
+          <w:sz w:val="26"/>
+          <w:szCs w:val="26"/>
+          <w:lang w:val="vi-VN"/>
+        </w:rPr>
+        <w:t>interface s1/1</w:t>
+      </w:r>
+    </w:p>
+    <w:p>
+      <w:pPr>
+        <w:tabs>
+          <w:tab w:val="left" w:pos="3116"/>
+        </w:tabs>
+        <w:rPr>
+          <w:bCs/>
+          <w:sz w:val="26"/>
+          <w:szCs w:val="26"/>
+          <w:lang w:val="vi-VN"/>
+        </w:rPr>
+      </w:pPr>
+      <w:r>
+        <w:rPr>
+          <w:bCs/>
+          <w:sz w:val="26"/>
+          <w:szCs w:val="26"/>
+          <w:lang w:val="vi-VN"/>
+        </w:rPr>
+        <w:t>ip address 10.0.1.1 255.255.255.0</w:t>
+      </w:r>
+    </w:p>
+    <w:p>
+      <w:pPr>
+        <w:tabs>
+          <w:tab w:val="left" w:pos="3116"/>
+        </w:tabs>
+        <w:rPr>
+          <w:bCs/>
+          <w:sz w:val="26"/>
+          <w:szCs w:val="26"/>
+          <w:lang w:val="vi-VN"/>
+        </w:rPr>
+      </w:pPr>
+      <w:r>
+        <w:rPr>
+          <w:bCs/>
+          <w:sz w:val="26"/>
+          <w:szCs w:val="26"/>
+          <w:lang w:val="vi-VN"/>
+        </w:rPr>
+        <w:t>no shutdown</w:t>
+      </w:r>
+    </w:p>
+    <w:p>
+      <w:pPr>
+        <w:tabs>
+          <w:tab w:val="left" w:pos="3116"/>
+        </w:tabs>
+        <w:rPr>
+          <w:bCs/>
+          <w:sz w:val="26"/>
+          <w:szCs w:val="26"/>
+          <w:lang w:val="vi-VN"/>
+        </w:rPr>
+      </w:pPr>
+      <w:r>
+        <w:rPr>
+          <w:bCs/>
+          <w:sz w:val="26"/>
+          <w:szCs w:val="26"/>
+          <w:lang w:val="vi-VN"/>
+        </w:rPr>
+        <w:t>router ospf 1</w:t>
+      </w:r>
+    </w:p>
+    <w:p>
+      <w:pPr>
+        <w:tabs>
+          <w:tab w:val="left" w:pos="3116"/>
+        </w:tabs>
+        <w:rPr>
+          <w:bCs/>
+          <w:sz w:val="26"/>
+          <w:szCs w:val="26"/>
+          <w:lang w:val="vi-VN"/>
+        </w:rPr>
+      </w:pPr>
+      <w:r>
+        <w:rPr>
+          <w:bCs/>
+          <w:sz w:val="26"/>
+          <w:szCs w:val="26"/>
+          <w:lang w:val="vi-VN"/>
+        </w:rPr>
+        <w:t>network 192.168.23.0 0.0.0.255 area 0</w:t>
+      </w:r>
+    </w:p>
+    <w:p>
+      <w:pPr>
+        <w:tabs>
+          <w:tab w:val="left" w:pos="3116"/>
+        </w:tabs>
+        <w:rPr>
+          <w:bCs/>
+          <w:sz w:val="26"/>
+          <w:szCs w:val="26"/>
+          <w:lang w:val="vi-VN"/>
+        </w:rPr>
+      </w:pPr>
+      <w:r>
+        <w:rPr>
+          <w:bCs/>
+          <w:sz w:val="26"/>
+          <w:szCs w:val="26"/>
+          <w:lang w:val="vi-VN"/>
+        </w:rPr>
+        <w:t>network 10.0.1.0 0.0.0.255 area 1</w:t>
+      </w:r>
+    </w:p>
+    <w:p>
+      <w:pPr>
+        <w:tabs>
+          <w:tab w:val="left" w:pos="3116"/>
+        </w:tabs>
+        <w:rPr>
+          <w:bCs/>
+          <w:sz w:val="26"/>
+          <w:szCs w:val="26"/>
+          <w:lang w:val="vi-VN"/>
+        </w:rPr>
+      </w:pPr>
+      <w:r>
+        <w:rPr>
+          <w:bCs/>
+          <w:sz w:val="26"/>
+          <w:szCs w:val="26"/>
+          <w:lang w:val="vi-VN"/>
+        </w:rPr>
+        <w:t>end</w:t>
+      </w:r>
+    </w:p>
+    <w:p>
+      <w:pPr>
+        <w:tabs>
+          <w:tab w:val="left" w:pos="3116"/>
+        </w:tabs>
+        <w:rPr>
+          <w:bCs/>
+          <w:sz w:val="26"/>
+          <w:szCs w:val="26"/>
+          <w:lang w:val="vi-VN"/>
+        </w:rPr>
+      </w:pPr>
+      <w:r>
+        <w:rPr>
+          <w:bCs/>
+          <w:sz w:val="26"/>
+          <w:szCs w:val="26"/>
+          <w:lang w:val="vi-VN"/>
+        </w:rPr>
+        <w:t>write memory</w:t>
+      </w:r>
+    </w:p>
+    <w:p>
+      <w:pPr>
+        <w:tabs>
+          <w:tab w:val="left" w:pos="3116"/>
+        </w:tabs>
+        <w:rPr>
+          <w:bCs/>
+          <w:sz w:val="26"/>
+          <w:szCs w:val="26"/>
+          <w:lang w:val="vi-VN"/>
+        </w:rPr>
+      </w:pPr>
+    </w:p>
+    <w:p>
+      <w:pPr>
+        <w:tabs>
+          <w:tab w:val="left" w:pos="3116"/>
+        </w:tabs>
+        <w:rPr>
+          <w:bCs/>
+          <w:sz w:val="26"/>
+          <w:szCs w:val="26"/>
+          <w:lang w:val="vi-VN"/>
+        </w:rPr>
+      </w:pPr>
+      <w:r>
+        <w:rPr>
+          <w:bCs/>
+          <w:sz w:val="26"/>
+          <w:szCs w:val="26"/>
+          <w:lang w:val="vi-VN"/>
+        </w:rPr>
+        <w:t>========== Tên thiết bị: R2 (router) ==========</w:t>
+      </w:r>
+    </w:p>
+    <w:p>
+      <w:pPr>
+        <w:tabs>
+          <w:tab w:val="left" w:pos="3116"/>
+        </w:tabs>
+        <w:rPr>
+          <w:bCs/>
+          <w:sz w:val="26"/>
+          <w:szCs w:val="26"/>
+          <w:lang w:val="vi-VN"/>
+        </w:rPr>
+      </w:pPr>
+      <w:r>
+        <w:rPr>
+          <w:bCs/>
+          <w:sz w:val="26"/>
+          <w:szCs w:val="26"/>
+          <w:lang w:val="vi-VN"/>
+        </w:rPr>
+        <w:t>enable</w:t>
+      </w:r>
+    </w:p>
+    <w:p>
+      <w:pPr>
+        <w:tabs>
+          <w:tab w:val="left" w:pos="3116"/>
+        </w:tabs>
+        <w:rPr>
+          <w:bCs/>
+          <w:sz w:val="26"/>
+          <w:szCs w:val="26"/>
+          <w:lang w:val="vi-VN"/>
+        </w:rPr>
+      </w:pPr>
+      <w:r>
+        <w:rPr>
+          <w:bCs/>
+          <w:sz w:val="26"/>
+          <w:szCs w:val="26"/>
+          <w:lang w:val="vi-VN"/>
+        </w:rPr>
+        <w:t>configure terminal</w:t>
+      </w:r>
+    </w:p>
+    <w:p>
+      <w:pPr>
+        <w:tabs>
+          <w:tab w:val="left" w:pos="3116"/>
+        </w:tabs>
+        <w:rPr>
+          <w:bCs/>
+          <w:sz w:val="26"/>
+          <w:szCs w:val="26"/>
+          <w:lang w:val="vi-VN"/>
+        </w:rPr>
+      </w:pPr>
+      <w:r>
+        <w:rPr>
+          <w:bCs/>
+          <w:sz w:val="26"/>
+          <w:szCs w:val="26"/>
+          <w:lang w:val="vi-VN"/>
+        </w:rPr>
+        <w:t>interface s1/0</w:t>
+      </w:r>
+    </w:p>
+    <w:p>
+      <w:pPr>
+        <w:tabs>
+          <w:tab w:val="left" w:pos="3116"/>
+        </w:tabs>
+        <w:rPr>
+          <w:bCs/>
+          <w:sz w:val="26"/>
+          <w:szCs w:val="26"/>
+          <w:lang w:val="vi-VN"/>
+        </w:rPr>
+      </w:pPr>
+      <w:r>
+        <w:rPr>
+          <w:bCs/>
+          <w:sz w:val="26"/>
+          <w:szCs w:val="26"/>
+          <w:lang w:val="vi-VN"/>
+        </w:rPr>
+        <w:t>ip address 192.168.23.2 255.255.255.0</w:t>
+      </w:r>
+    </w:p>
+    <w:p>
+      <w:pPr>
+        <w:tabs>
+          <w:tab w:val="left" w:pos="3116"/>
+        </w:tabs>
+        <w:rPr>
+          <w:bCs/>
+          <w:sz w:val="26"/>
+          <w:szCs w:val="26"/>
+          <w:lang w:val="vi-VN"/>
+        </w:rPr>
+      </w:pPr>
+      <w:r>
+        <w:rPr>
+          <w:bCs/>
+          <w:sz w:val="26"/>
+          <w:szCs w:val="26"/>
+          <w:lang w:val="vi-VN"/>
+        </w:rPr>
+        <w:t>no shutdown</w:t>
+      </w:r>
+    </w:p>
+    <w:p>
+      <w:pPr>
+        <w:tabs>
+          <w:tab w:val="left" w:pos="3116"/>
+        </w:tabs>
+        <w:rPr>
+          <w:bCs/>
+          <w:sz w:val="26"/>
+          <w:szCs w:val="26"/>
+          <w:lang w:val="vi-VN"/>
+        </w:rPr>
+      </w:pPr>
+      <w:r>
+        <w:rPr>
+          <w:bCs/>
+          <w:sz w:val="26"/>
+          <w:szCs w:val="26"/>
+          <w:lang w:val="vi-VN"/>
+        </w:rPr>
+        <w:t>interface s1/1</w:t>
+      </w:r>
+    </w:p>
+    <w:p>
+      <w:pPr>
+        <w:tabs>
+          <w:tab w:val="left" w:pos="3116"/>
+        </w:tabs>
+        <w:rPr>
+          <w:bCs/>
+          <w:sz w:val="26"/>
+          <w:szCs w:val="26"/>
+          <w:lang w:val="vi-VN"/>
+        </w:rPr>
+      </w:pPr>
+      <w:r>
+        <w:rPr>
+          <w:bCs/>
+          <w:sz w:val="26"/>
+          <w:szCs w:val="26"/>
+          <w:lang w:val="vi-VN"/>
+        </w:rPr>
+        <w:t>ip address 172.16.34.2 255.255.255.0</w:t>
+      </w:r>
+    </w:p>
+    <w:p>
+      <w:pPr>
+        <w:tabs>
+          <w:tab w:val="left" w:pos="3116"/>
+        </w:tabs>
+        <w:rPr>
+          <w:bCs/>
+          <w:sz w:val="26"/>
+          <w:szCs w:val="26"/>
+          <w:lang w:val="vi-VN"/>
+        </w:rPr>
+      </w:pPr>
+      <w:r>
+        <w:rPr>
+          <w:bCs/>
+          <w:sz w:val="26"/>
+          <w:szCs w:val="26"/>
+          <w:lang w:val="vi-VN"/>
+        </w:rPr>
+        <w:t>no shutdown</w:t>
+      </w:r>
+    </w:p>
+    <w:p>
+      <w:pPr>
+        <w:tabs>
+          <w:tab w:val="left" w:pos="3116"/>
+        </w:tabs>
+        <w:rPr>
+          <w:bCs/>
+          <w:sz w:val="26"/>
+          <w:szCs w:val="26"/>
+          <w:lang w:val="vi-VN"/>
+        </w:rPr>
+      </w:pPr>
+      <w:r>
+        <w:rPr>
+          <w:bCs/>
+          <w:sz w:val="26"/>
+          <w:szCs w:val="26"/>
+          <w:lang w:val="vi-VN"/>
+        </w:rPr>
+        <w:t>router ospf 1</w:t>
+      </w:r>
+    </w:p>
+    <w:p>
+      <w:pPr>
+        <w:tabs>
+          <w:tab w:val="left" w:pos="3116"/>
+        </w:tabs>
+        <w:rPr>
+          <w:bCs/>
+          <w:sz w:val="26"/>
+          <w:szCs w:val="26"/>
+          <w:lang w:val="vi-VN"/>
+        </w:rPr>
+      </w:pPr>
+      <w:r>
+        <w:rPr>
+          <w:bCs/>
+          <w:sz w:val="26"/>
+          <w:szCs w:val="26"/>
+          <w:lang w:val="vi-VN"/>
+        </w:rPr>
+        <w:lastRenderedPageBreak/>
+        <w:t>network 192.168.23.0 0.0.0.255 area 0</w:t>
+      </w:r>
+    </w:p>
+    <w:p>
+      <w:pPr>
+        <w:tabs>
+          <w:tab w:val="left" w:pos="3116"/>
+        </w:tabs>
+        <w:rPr>
+          <w:bCs/>
+          <w:sz w:val="26"/>
+          <w:szCs w:val="26"/>
+          <w:lang w:val="vi-VN"/>
+        </w:rPr>
+      </w:pPr>
+      <w:r>
+        <w:rPr>
+          <w:bCs/>
+          <w:sz w:val="26"/>
+          <w:szCs w:val="26"/>
+          <w:lang w:val="vi-VN"/>
+        </w:rPr>
+        <w:t>network 172.16.34.0 0.0.0.255 area 2</w:t>
+      </w:r>
+    </w:p>
+    <w:p>
+      <w:pPr>
+        <w:tabs>
+          <w:tab w:val="left" w:pos="3116"/>
+        </w:tabs>
+        <w:rPr>
+          <w:bCs/>
+          <w:sz w:val="26"/>
+          <w:szCs w:val="26"/>
+          <w:lang w:val="vi-VN"/>
+        </w:rPr>
+      </w:pPr>
+      <w:r>
+        <w:rPr>
+          <w:bCs/>
+          <w:sz w:val="26"/>
+          <w:szCs w:val="26"/>
+          <w:lang w:val="vi-VN"/>
+        </w:rPr>
+        <w:t>end</w:t>
+      </w:r>
+    </w:p>
+    <w:p>
+      <w:pPr>
+        <w:tabs>
+          <w:tab w:val="left" w:pos="3116"/>
+        </w:tabs>
+        <w:rPr>
+          <w:bCs/>
+          <w:sz w:val="26"/>
+          <w:szCs w:val="26"/>
+          <w:lang w:val="vi-VN"/>
+        </w:rPr>
+      </w:pPr>
+      <w:r>
+        <w:rPr>
+          <w:bCs/>
+          <w:sz w:val="26"/>
+          <w:szCs w:val="26"/>
+          <w:lang w:val="vi-VN"/>
+        </w:rPr>
+        <w:t>write memory</w:t>
+      </w:r>
+    </w:p>
+    <w:p>
+      <w:pPr>
+        <w:tabs>
+          <w:tab w:val="left" w:pos="3116"/>
+        </w:tabs>
+        <w:rPr>
+          <w:bCs/>
+          <w:sz w:val="26"/>
+          <w:szCs w:val="26"/>
+          <w:lang w:val="vi-VN"/>
+        </w:rPr>
+      </w:pPr>
+    </w:p>
+    <w:p>
+      <w:pPr>
+        <w:tabs>
+          <w:tab w:val="left" w:pos="3116"/>
+        </w:tabs>
+        <w:rPr>
+          <w:bCs/>
+          <w:sz w:val="26"/>
+          <w:szCs w:val="26"/>
+          <w:lang w:val="vi-VN"/>
+        </w:rPr>
+      </w:pPr>
+      <w:r>
+        <w:rPr>
+          <w:bCs/>
+          <w:sz w:val="26"/>
+          <w:szCs w:val="26"/>
+          <w:lang w:val="vi-VN"/>
+        </w:rPr>
+        <w:t>========== Tên thiết bị: R3 (router) ==========</w:t>
+      </w:r>
+    </w:p>
+    <w:p>
+      <w:pPr>
+        <w:tabs>
+          <w:tab w:val="left" w:pos="3116"/>
+        </w:tabs>
+        <w:rPr>
+          <w:bCs/>
+          <w:sz w:val="26"/>
+          <w:szCs w:val="26"/>
+          <w:lang w:val="vi-VN"/>
+        </w:rPr>
+      </w:pPr>
+      <w:r>
+        <w:rPr>
+          <w:bCs/>
+          <w:sz w:val="26"/>
+          <w:szCs w:val="26"/>
+          <w:lang w:val="vi-VN"/>
+        </w:rPr>
+        <w:t>enable</w:t>
+      </w:r>
+    </w:p>
+    <w:p>
+      <w:pPr>
+        <w:tabs>
+          <w:tab w:val="left" w:pos="3116"/>
+        </w:tabs>
+        <w:rPr>
+          <w:bCs/>
+          <w:sz w:val="26"/>
+          <w:szCs w:val="26"/>
+          <w:lang w:val="vi-VN"/>
+        </w:rPr>
+      </w:pPr>
+      <w:r>
+        <w:rPr>
+          <w:bCs/>
+          <w:sz w:val="26"/>
+          <w:szCs w:val="26"/>
+          <w:lang w:val="vi-VN"/>
+        </w:rPr>
+        <w:t>configure terminal</w:t>
+      </w:r>
+    </w:p>
+    <w:p>
+      <w:pPr>
+        <w:tabs>
+          <w:tab w:val="left" w:pos="3116"/>
+        </w:tabs>
+        <w:rPr>
+          <w:bCs/>
+          <w:sz w:val="26"/>
+          <w:szCs w:val="26"/>
+          <w:lang w:val="vi-VN"/>
+        </w:rPr>
+      </w:pPr>
+      <w:r>
+        <w:rPr>
+          <w:bCs/>
+          <w:sz w:val="26"/>
+          <w:szCs w:val="26"/>
+          <w:lang w:val="vi-VN"/>
+        </w:rPr>
+        <w:t>interface s1/0</w:t>
+      </w:r>
+    </w:p>
+    <w:p>
+      <w:pPr>
+        <w:tabs>
+          <w:tab w:val="left" w:pos="3116"/>
+        </w:tabs>
+        <w:rPr>
+          <w:bCs/>
+          <w:sz w:val="26"/>
+          <w:szCs w:val="26"/>
+          <w:lang w:val="vi-VN"/>
+        </w:rPr>
+      </w:pPr>
+      <w:r>
+        <w:rPr>
+          <w:bCs/>
+          <w:sz w:val="26"/>
+          <w:szCs w:val="26"/>
+          <w:lang w:val="vi-VN"/>
+        </w:rPr>
+        <w:t>ip address 10.0.1.3 255.255.255.0</w:t>
+      </w:r>
+    </w:p>
+    <w:p>
+      <w:pPr>
+        <w:tabs>
+          <w:tab w:val="left" w:pos="3116"/>
+        </w:tabs>
+        <w:rPr>
+          <w:bCs/>
+          <w:sz w:val="26"/>
+          <w:szCs w:val="26"/>
+          <w:lang w:val="vi-VN"/>
+        </w:rPr>
+      </w:pPr>
+      <w:r>
+        <w:rPr>
+          <w:bCs/>
+          <w:sz w:val="26"/>
+          <w:szCs w:val="26"/>
+          <w:lang w:val="vi-VN"/>
+        </w:rPr>
+        <w:t>no shutdown</w:t>
+      </w:r>
+    </w:p>
+    <w:p>
+      <w:pPr>
+        <w:tabs>
+          <w:tab w:val="left" w:pos="3116"/>
+        </w:tabs>
+        <w:rPr>
+          <w:bCs/>
+          <w:sz w:val="26"/>
+          <w:szCs w:val="26"/>
+          <w:lang w:val="vi-VN"/>
+        </w:rPr>
+      </w:pPr>
+      <w:r>
+        <w:rPr>
+          <w:bCs/>
+          <w:sz w:val="26"/>
+          <w:szCs w:val="26"/>
+          <w:lang w:val="vi-VN"/>
+        </w:rPr>
+        <w:t>interface e0/0</w:t>
+      </w:r>
+    </w:p>
+    <w:p>
+      <w:pPr>
+        <w:tabs>
+          <w:tab w:val="left" w:pos="3116"/>
+        </w:tabs>
+        <w:rPr>
+          <w:bCs/>
+          <w:sz w:val="26"/>
+          <w:szCs w:val="26"/>
+          <w:lang w:val="vi-VN"/>
+        </w:rPr>
+      </w:pPr>
+      <w:r>
+        <w:rPr>
+          <w:bCs/>
+          <w:sz w:val="26"/>
+          <w:szCs w:val="26"/>
+          <w:lang w:val="vi-VN"/>
+        </w:rPr>
+        <w:t>ip address 10.0.2.1 255.255.255.0</w:t>
+      </w:r>
+    </w:p>
+    <w:p>
+      <w:pPr>
+        <w:tabs>
+          <w:tab w:val="left" w:pos="3116"/>
+        </w:tabs>
+        <w:rPr>
+          <w:bCs/>
+          <w:sz w:val="26"/>
+          <w:szCs w:val="26"/>
+          <w:lang w:val="vi-VN"/>
+        </w:rPr>
+      </w:pPr>
+      <w:r>
+        <w:rPr>
+          <w:bCs/>
+          <w:sz w:val="26"/>
+          <w:szCs w:val="26"/>
+          <w:lang w:val="vi-VN"/>
+        </w:rPr>
+        <w:t>no shutdown</w:t>
+      </w:r>
+    </w:p>
+    <w:p>
+      <w:pPr>
+        <w:tabs>
+          <w:tab w:val="left" w:pos="3116"/>
+        </w:tabs>
+        <w:rPr>
+          <w:bCs/>
+          <w:sz w:val="26"/>
+          <w:szCs w:val="26"/>
+          <w:lang w:val="vi-VN"/>
+        </w:rPr>
+      </w:pPr>
+      <w:r>
+        <w:rPr>
+          <w:bCs/>
+          <w:sz w:val="26"/>
+          <w:szCs w:val="26"/>
+          <w:lang w:val="vi-VN"/>
+        </w:rPr>
+        <w:t>router ospf 1</w:t>
+      </w:r>
+    </w:p>
+    <w:p>
+      <w:pPr>
+        <w:tabs>
+          <w:tab w:val="left" w:pos="3116"/>
+        </w:tabs>
+        <w:rPr>
+          <w:bCs/>
+          <w:sz w:val="26"/>
+          <w:szCs w:val="26"/>
+          <w:lang w:val="vi-VN"/>
+        </w:rPr>
+      </w:pPr>
+      <w:r>
+        <w:rPr>
+          <w:bCs/>
+          <w:sz w:val="26"/>
+          <w:szCs w:val="26"/>
+          <w:lang w:val="vi-VN"/>
+        </w:rPr>
+        <w:t>network 10.0.1.0 0.0.0.255 area 1</w:t>
+      </w:r>
+    </w:p>
+    <w:p>
+      <w:pPr>
+        <w:tabs>
+          <w:tab w:val="left" w:pos="3116"/>
+        </w:tabs>
+        <w:rPr>
+          <w:bCs/>
+          <w:sz w:val="26"/>
+          <w:szCs w:val="26"/>
+          <w:lang w:val="vi-VN"/>
+        </w:rPr>
+      </w:pPr>
+      <w:r>
+        <w:rPr>
+          <w:bCs/>
+          <w:sz w:val="26"/>
+          <w:szCs w:val="26"/>
+          <w:lang w:val="vi-VN"/>
+        </w:rPr>
+        <w:t>network 10.0.2.0 0.0.0.255 area 1</w:t>
+      </w:r>
+    </w:p>
+    <w:p>
+      <w:pPr>
+        <w:tabs>
+          <w:tab w:val="left" w:pos="3116"/>
+        </w:tabs>
+        <w:rPr>
+          <w:bCs/>
+          <w:sz w:val="26"/>
+          <w:szCs w:val="26"/>
+          <w:lang w:val="vi-VN"/>
+        </w:rPr>
+      </w:pPr>
+      <w:r>
+        <w:rPr>
+          <w:bCs/>
+          <w:sz w:val="26"/>
+          <w:szCs w:val="26"/>
+          <w:lang w:val="vi-VN"/>
+        </w:rPr>
+        <w:t>end</w:t>
+      </w:r>
+    </w:p>
+    <w:p>
+      <w:pPr>
+        <w:tabs>
+          <w:tab w:val="left" w:pos="3116"/>
+        </w:tabs>
+        <w:rPr>
+          <w:bCs/>
+          <w:sz w:val="26"/>
+          <w:szCs w:val="26"/>
+          <w:lang w:val="vi-VN"/>
+        </w:rPr>
+      </w:pPr>
+      <w:r>
+        <w:rPr>
+          <w:bCs/>
+          <w:sz w:val="26"/>
+          <w:szCs w:val="26"/>
+          <w:lang w:val="vi-VN"/>
+        </w:rPr>
+        <w:t>write memory</w:t>
+      </w:r>
+    </w:p>
+    <w:p>
+      <w:pPr>
+        <w:tabs>
+          <w:tab w:val="left" w:pos="3116"/>
+        </w:tabs>
+        <w:rPr>
+          <w:bCs/>
+          <w:sz w:val="26"/>
+          <w:szCs w:val="26"/>
+          <w:lang w:val="vi-VN"/>
+        </w:rPr>
+      </w:pPr>
+    </w:p>
+    <w:p>
+      <w:pPr>
+        <w:tabs>
+          <w:tab w:val="left" w:pos="3116"/>
+        </w:tabs>
+        <w:rPr>
+          <w:bCs/>
+          <w:sz w:val="26"/>
+          <w:szCs w:val="26"/>
+          <w:lang w:val="vi-VN"/>
+        </w:rPr>
+      </w:pPr>
+      <w:r>
+        <w:rPr>
+          <w:bCs/>
+          <w:sz w:val="26"/>
+          <w:szCs w:val="26"/>
+          <w:lang w:val="vi-VN"/>
+        </w:rPr>
+        <w:t>========== Tên thiết bị: R4 (router) ==========</w:t>
+      </w:r>
+    </w:p>
+    <w:p>
+      <w:pPr>
+        <w:tabs>
+          <w:tab w:val="left" w:pos="3116"/>
+        </w:tabs>
+        <w:rPr>
+          <w:bCs/>
+          <w:sz w:val="26"/>
+          <w:szCs w:val="26"/>
+          <w:lang w:val="vi-VN"/>
+        </w:rPr>
+      </w:pPr>
+      <w:r>
+        <w:rPr>
+          <w:bCs/>
+          <w:sz w:val="26"/>
+          <w:szCs w:val="26"/>
+          <w:lang w:val="vi-VN"/>
+        </w:rPr>
+        <w:t>enable</w:t>
+      </w:r>
+    </w:p>
+    <w:p>
+      <w:pPr>
+        <w:tabs>
+          <w:tab w:val="left" w:pos="3116"/>
+        </w:tabs>
+        <w:rPr>
+          <w:bCs/>
+          <w:sz w:val="26"/>
+          <w:szCs w:val="26"/>
+          <w:lang w:val="vi-VN"/>
+        </w:rPr>
+      </w:pPr>
+      <w:r>
+        <w:rPr>
+          <w:bCs/>
+          <w:sz w:val="26"/>
+          <w:szCs w:val="26"/>
+          <w:lang w:val="vi-VN"/>
+        </w:rPr>
+        <w:t>configure terminal</w:t>
+      </w:r>
+    </w:p>
+    <w:p>
+      <w:pPr>
+        <w:tabs>
+          <w:tab w:val="left" w:pos="3116"/>
+        </w:tabs>
+        <w:rPr>
+          <w:bCs/>
+          <w:sz w:val="26"/>
+          <w:szCs w:val="26"/>
+          <w:lang w:val="vi-VN"/>
+        </w:rPr>
+      </w:pPr>
+      <w:r>
+        <w:rPr>
+          <w:bCs/>
+          <w:sz w:val="26"/>
+          <w:szCs w:val="26"/>
+          <w:lang w:val="vi-VN"/>
+        </w:rPr>
+        <w:t>interface s1/0</w:t>
+      </w:r>
+    </w:p>
+    <w:p>
+      <w:pPr>
+        <w:tabs>
+          <w:tab w:val="left" w:pos="3116"/>
+        </w:tabs>
+        <w:rPr>
+          <w:bCs/>
+          <w:sz w:val="26"/>
+          <w:szCs w:val="26"/>
+          <w:lang w:val="vi-VN"/>
+        </w:rPr>
+      </w:pPr>
+      <w:r>
+        <w:rPr>
+          <w:bCs/>
+          <w:sz w:val="26"/>
+          <w:szCs w:val="26"/>
+          <w:lang w:val="vi-VN"/>
+        </w:rPr>
+        <w:t>ip address 172.16.34.4 255.255.255.0</w:t>
+      </w:r>
+    </w:p>
+    <w:p>
+      <w:pPr>
+        <w:tabs>
+          <w:tab w:val="left" w:pos="3116"/>
+        </w:tabs>
+        <w:rPr>
+          <w:bCs/>
+          <w:sz w:val="26"/>
+          <w:szCs w:val="26"/>
+          <w:lang w:val="vi-VN"/>
+        </w:rPr>
+      </w:pPr>
+      <w:r>
+        <w:rPr>
+          <w:bCs/>
+          <w:sz w:val="26"/>
+          <w:szCs w:val="26"/>
+          <w:lang w:val="vi-VN"/>
+        </w:rPr>
+        <w:t>no shutdown</w:t>
+      </w:r>
+    </w:p>
+    <w:p>
+      <w:pPr>
+        <w:tabs>
+          <w:tab w:val="left" w:pos="3116"/>
+        </w:tabs>
+        <w:rPr>
+          <w:bCs/>
+          <w:sz w:val="26"/>
+          <w:szCs w:val="26"/>
+          <w:lang w:val="vi-VN"/>
+        </w:rPr>
+      </w:pPr>
+      <w:r>
+        <w:rPr>
+          <w:bCs/>
+          <w:sz w:val="26"/>
+          <w:szCs w:val="26"/>
+          <w:lang w:val="vi-VN"/>
+        </w:rPr>
+        <w:t>interface e0/0</w:t>
+      </w:r>
+    </w:p>
+    <w:p>
+      <w:pPr>
+        <w:tabs>
+          <w:tab w:val="left" w:pos="3116"/>
+        </w:tabs>
+        <w:rPr>
+          <w:bCs/>
+          <w:sz w:val="26"/>
+          <w:szCs w:val="26"/>
+          <w:lang w:val="vi-VN"/>
+        </w:rPr>
+      </w:pPr>
+      <w:r>
+        <w:rPr>
+          <w:bCs/>
+          <w:sz w:val="26"/>
+          <w:szCs w:val="26"/>
+          <w:lang w:val="vi-VN"/>
+        </w:rPr>
+        <w:lastRenderedPageBreak/>
+        <w:t>ip address 172.16.35.1 255.255.255.0</w:t>
+      </w:r>
+    </w:p>
+    <w:p>
+      <w:pPr>
+        <w:tabs>
+          <w:tab w:val="left" w:pos="3116"/>
+        </w:tabs>
+        <w:rPr>
+          <w:bCs/>
+          <w:sz w:val="26"/>
+          <w:szCs w:val="26"/>
+          <w:lang w:val="vi-VN"/>
+        </w:rPr>
+      </w:pPr>
+      <w:r>
+        <w:rPr>
+          <w:bCs/>
+          <w:sz w:val="26"/>
+          <w:szCs w:val="26"/>
+          <w:lang w:val="vi-VN"/>
+        </w:rPr>
+        <w:t>no shutdown</w:t>
+      </w:r>
+    </w:p>
+    <w:p>
+      <w:pPr>
+        <w:tabs>
+          <w:tab w:val="left" w:pos="3116"/>
+        </w:tabs>
+        <w:rPr>
+          <w:bCs/>
+          <w:sz w:val="26"/>
+          <w:szCs w:val="26"/>
+          <w:lang w:val="vi-VN"/>
+        </w:rPr>
+      </w:pPr>
+      <w:r>
+        <w:rPr>
+          <w:bCs/>
+          <w:sz w:val="26"/>
+          <w:szCs w:val="26"/>
+          <w:lang w:val="vi-VN"/>
+        </w:rPr>
+        <w:t>router ospf 1</w:t>
+      </w:r>
+    </w:p>
+    <w:p>
+      <w:pPr>
+        <w:tabs>
+          <w:tab w:val="left" w:pos="3116"/>
+        </w:tabs>
+        <w:rPr>
+          <w:bCs/>
+          <w:sz w:val="26"/>
+          <w:szCs w:val="26"/>
+          <w:lang w:val="vi-VN"/>
+        </w:rPr>
+      </w:pPr>
+      <w:r>
+        <w:rPr>
+          <w:bCs/>
+          <w:sz w:val="26"/>
+          <w:szCs w:val="26"/>
+          <w:lang w:val="vi-VN"/>
+        </w:rPr>
+        <w:t>network 172.16.34.0 0.0.0.255 area 2</w:t>
+      </w:r>
+    </w:p>
+    <w:p>
+      <w:pPr>
+        <w:tabs>
+          <w:tab w:val="left" w:pos="3116"/>
+        </w:tabs>
+        <w:rPr>
+          <w:bCs/>
+          <w:sz w:val="26"/>
+          <w:szCs w:val="26"/>
+          <w:lang w:val="vi-VN"/>
+        </w:rPr>
+      </w:pPr>
+      <w:r>
+        <w:rPr>
+          <w:bCs/>
+          <w:sz w:val="26"/>
+          <w:szCs w:val="26"/>
+          <w:lang w:val="vi-VN"/>
+        </w:rPr>
+        <w:t>network 172.16.35.0 0.0.0.255 area 2</w:t>
+      </w:r>
+    </w:p>
+    <w:p>
+      <w:pPr>
+        <w:tabs>
+          <w:tab w:val="left" w:pos="3116"/>
+        </w:tabs>
+        <w:rPr>
+          <w:bCs/>
+          <w:sz w:val="26"/>
+          <w:szCs w:val="26"/>
+          <w:lang w:val="vi-VN"/>
+        </w:rPr>
+      </w:pPr>
+      <w:r>
+        <w:rPr>
+          <w:bCs/>
+          <w:sz w:val="26"/>
+          <w:szCs w:val="26"/>
+          <w:lang w:val="vi-VN"/>
+        </w:rPr>
+        <w:t>end</w:t>
+      </w:r>
+    </w:p>
+    <w:p>
+      <w:pPr>
+        <w:tabs>
+          <w:tab w:val="left" w:pos="3116"/>
+        </w:tabs>
+        <w:rPr>
+          <w:bCs/>
+          <w:sz w:val="26"/>
+          <w:szCs w:val="26"/>
+          <w:lang w:val="vi-VN"/>
+        </w:rPr>
+      </w:pPr>
+      <w:r>
+        <w:rPr>
+          <w:bCs/>
+          <w:sz w:val="26"/>
+          <w:szCs w:val="26"/>
+          <w:lang w:val="vi-VN"/>
+        </w:rPr>
+        <w:t>write memory</w:t>
+      </w:r>
+    </w:p>
+    <w:p>
+      <w:pPr>
+        <w:tabs>
+          <w:tab w:val="left" w:pos="3116"/>
+        </w:tabs>
+        <w:rPr>
+          <w:bCs/>
+          <w:sz w:val="26"/>
+          <w:szCs w:val="26"/>
+          <w:lang w:val="vi-VN"/>
+        </w:rPr>
+      </w:pPr>
+    </w:p>
+    <w:p>
+      <w:pPr>
+        <w:tabs>
+          <w:tab w:val="left" w:pos="3116"/>
+        </w:tabs>
+        <w:rPr>
+          <w:bCs/>
+          <w:sz w:val="26"/>
+          <w:szCs w:val="26"/>
+          <w:lang w:val="vi-VN"/>
+        </w:rPr>
+      </w:pPr>
+      <w:r>
+        <w:rPr>
+          <w:bCs/>
+          <w:sz w:val="26"/>
+          <w:szCs w:val="26"/>
+          <w:lang w:val="vi-VN"/>
+        </w:rPr>
+        <w:t>========== Tên thiết bị: VPC5 (vpcs) ==========</w:t>
+      </w:r>
+    </w:p>
+    <w:p>
+      <w:pPr>
+        <w:tabs>
+          <w:tab w:val="left" w:pos="3116"/>
+        </w:tabs>
+        <w:rPr>
+          <w:bCs/>
+          <w:sz w:val="26"/>
+          <w:szCs w:val="26"/>
+          <w:lang w:val="vi-VN"/>
+        </w:rPr>
+      </w:pPr>
+      <w:r>
+        <w:rPr>
+          <w:bCs/>
+          <w:sz w:val="26"/>
+          <w:szCs w:val="26"/>
+          <w:lang w:val="vi-VN"/>
+        </w:rPr>
+        <w:t>ip 10.0.2.10 255.255.255.0 10.0.2.1</w:t>
+      </w:r>
+    </w:p>
+    <w:p>
+      <w:pPr>
+        <w:tabs>
+          <w:tab w:val="left" w:pos="3116"/>
+        </w:tabs>
+        <w:rPr>
+          <w:bCs/>
+          <w:sz w:val="26"/>
+          <w:szCs w:val="26"/>
+          <w:lang w:val="vi-VN"/>
+        </w:rPr>
+      </w:pPr>
+      <w:r>
+        <w:rPr>
+          <w:bCs/>
+          <w:sz w:val="26"/>
+          <w:szCs w:val="26"/>
+          <w:lang w:val="vi-VN"/>
+        </w:rPr>
+        <w:t>save</w:t>
+      </w:r>
+    </w:p>
+    <w:p>
+      <w:pPr>
+        <w:tabs>
+          <w:tab w:val="left" w:pos="3116"/>
+        </w:tabs>
+        <w:rPr>
+          <w:bCs/>
+          <w:sz w:val="26"/>
+          <w:szCs w:val="26"/>
+          <w:lang w:val="vi-VN"/>
+        </w:rPr>
+      </w:pPr>
+    </w:p>
+    <w:p>
+      <w:pPr>
+        <w:tabs>
+          <w:tab w:val="left" w:pos="3116"/>
+        </w:tabs>
+        <w:rPr>
+          <w:bCs/>
+          <w:sz w:val="26"/>
+          <w:szCs w:val="26"/>
+          <w:lang w:val="vi-VN"/>
+        </w:rPr>
+      </w:pPr>
+      <w:r>
+        <w:rPr>
+          <w:bCs/>
+          <w:sz w:val="26"/>
+          <w:szCs w:val="26"/>
+          <w:lang w:val="vi-VN"/>
+        </w:rPr>
+        <w:t>========== Tên thiết bị: VPC6 (vpcs) ==========</w:t>
+      </w:r>
+    </w:p>
+    <w:p>
+      <w:pPr>
+        <w:tabs>
+          <w:tab w:val="left" w:pos="3116"/>
+        </w:tabs>
+        <w:rPr>
+          <w:bCs/>
+          <w:sz w:val="26"/>
+          <w:szCs w:val="26"/>
+          <w:lang w:val="vi-VN"/>
+        </w:rPr>
+      </w:pPr>
+      <w:r>
+        <w:rPr>
+          <w:bCs/>
+          <w:sz w:val="26"/>
+          <w:szCs w:val="26"/>
+          <w:lang w:val="vi-VN"/>
+        </w:rPr>
+        <w:t>ip 172.16.35.10 255.255.255.0 172.16.35.1</w:t>
+      </w:r>
+    </w:p>
+    <w:p>
+      <w:pPr>
+        <w:tabs>
+          <w:tab w:val="left" w:pos="3116"/>
+        </w:tabs>
+        <w:rPr>
+          <w:bCs/>
+          <w:sz w:val="26"/>
+          <w:szCs w:val="26"/>
+          <w:lang w:val="vi-VN"/>
+        </w:rPr>
+      </w:pPr>
+      <w:r>
+        <w:rPr>
+          <w:bCs/>
+          <w:sz w:val="26"/>
+          <w:szCs w:val="26"/>
+          <w:lang w:val="vi-VN"/>
+        </w:rPr>
+        <w:t>save</w:t>
+      </w:r>
+    </w:p>
+    <w:p>
+      <w:pPr>
+        <w:tabs>
+          <w:tab w:val="left" w:pos="3116"/>
+        </w:tabs>
+        <w:rPr>
+          <w:bCs/>
+          <w:sz w:val="26"/>
+          <w:szCs w:val="26"/>
+          <w:lang w:val="vi-VN"/>
+        </w:rPr>
+      </w:pPr>
+    </w:p>
+    <w:p>
+      <w:pPr>
+        <w:tabs>
+          <w:tab w:val="left" w:pos="3116"/>
+        </w:tabs>
+        <w:rPr>
+          <w:bCs/>
+          <w:sz w:val="26"/>
+          <w:szCs w:val="26"/>
+          <w:lang w:val="vi-VN"/>
+        </w:rPr>
+      </w:pPr>
+    </w:p>
+    <w:p>
+      <w:pPr>
+        <w:tabs>
+          <w:tab w:val="left" w:pos="3116"/>
+        </w:tabs>
+        <w:rPr>
+          <w:bCs/>
+          <w:sz w:val="26"/>
+          <w:szCs w:val="26"/>
+          <w:lang w:val="vi-VN"/>
+        </w:rPr>
+      </w:pPr>
+      <w:r>
+        <w:rPr>
+          <w:bCs/>
+          <w:sz w:val="26"/>
+          <w:szCs w:val="26"/>
+          <w:lang w:val="vi-VN"/>
+        </w:rPr>
+        <w:t>câu 3/</w:t>
+      </w:r>
+    </w:p>
+    <w:p>
+      <w:pPr>
+        <w:tabs>
+          <w:tab w:val="left" w:pos="3116"/>
+        </w:tabs>
+        <w:rPr>
+          <w:bCs/>
+          <w:sz w:val="26"/>
+          <w:szCs w:val="26"/>
+          <w:lang w:val="vi-VN"/>
+        </w:rPr>
+      </w:pPr>
+      <w:r>
+        <w:rPr>
+          <w:bCs/>
+          <w:sz w:val="26"/>
+          <w:szCs w:val="26"/>
+          <w:lang w:val="vi-VN"/>
+        </w:rPr>
+        <w:t>Điểm khác biệt lớn nhất của mô hình OSPF Đa vùng so với Đơn vùng là bảng định tuyến sẽ xuất hiện 2 ký hiệu đặc trưng: O và O IA.</w:t>
+      </w:r>
+    </w:p>
+    <w:p>
+      <w:pPr>
+        <w:tabs>
+          <w:tab w:val="left" w:pos="3116"/>
+        </w:tabs>
+        <w:rPr>
+          <w:bCs/>
+          <w:sz w:val="26"/>
+          <w:szCs w:val="26"/>
+          <w:lang w:val="vi-VN"/>
+        </w:rPr>
+      </w:pPr>
+      <w:r>
+        <w:rPr>
+          <w:bCs/>
+          <w:sz w:val="26"/>
+          <w:szCs w:val="26"/>
+          <w:lang w:val="vi-VN"/>
+        </w:rPr>
+        <w:t>- O (OSPF Intra-Area): Là các tuyến đường nằm trong cùng một vùng (Area) với Router.</w:t>
+      </w:r>
+    </w:p>
+    <w:p>
+      <w:pPr>
+        <w:tabs>
+          <w:tab w:val="left" w:pos="3116"/>
+        </w:tabs>
+        <w:rPr>
+          <w:bCs/>
+          <w:sz w:val="26"/>
+          <w:szCs w:val="26"/>
+          <w:lang w:val="vi-VN"/>
+        </w:rPr>
+      </w:pPr>
+      <w:r>
+        <w:rPr>
+          <w:bCs/>
+          <w:sz w:val="26"/>
+          <w:szCs w:val="26"/>
+          <w:lang w:val="vi-VN"/>
+        </w:rPr>
+        <w:t>- O IA (OSPF Inter-Area): Là các tuyến đường nằm ở vùng khác (Area khác) được học thông qua các Router biên ABR (Area Border Router).</w:t>
+      </w:r>
+    </w:p>
+    <w:p>
+      <w:pPr>
+        <w:tabs>
+          <w:tab w:val="left" w:pos="3116"/>
+        </w:tabs>
+        <w:rPr>
+          <w:bCs/>
+          <w:sz w:val="26"/>
+          <w:szCs w:val="26"/>
+          <w:lang w:val="vi-VN"/>
+        </w:rPr>
+      </w:pPr>
+    </w:p>
+    <w:p>
+      <w:pPr>
+        <w:tabs>
+          <w:tab w:val="left" w:pos="3116"/>
+        </w:tabs>
+        <w:rPr>
+          <w:bCs/>
+          <w:sz w:val="26"/>
+          <w:szCs w:val="26"/>
+          <w:lang w:val="vi-VN"/>
+        </w:rPr>
+      </w:pPr>
+      <w:r>
+        <w:rPr>
+          <w:bCs/>
+          <w:sz w:val="26"/>
+          <w:szCs w:val="26"/>
+          <w:lang w:val="vi-VN"/>
+        </w:rPr>
+        <w:t>Ví dụ phân tích bảng định tuyến thực tế:</w:t>
+      </w:r>
+    </w:p>
+    <w:p>
+      <w:pPr>
+        <w:tabs>
+          <w:tab w:val="left" w:pos="3116"/>
+        </w:tabs>
+        <w:rPr>
+          <w:bCs/>
+          <w:sz w:val="26"/>
+          <w:szCs w:val="26"/>
+          <w:lang w:val="vi-VN"/>
+        </w:rPr>
+      </w:pPr>
+      <w:r>
+        <w:rPr>
+          <w:bCs/>
+          <w:sz w:val="26"/>
+          <w:szCs w:val="26"/>
+          <w:lang w:val="vi-VN"/>
+        </w:rPr>
+        <w:t>(Giải thích dựa trên một dòng định tuyến O IA trong bảng show ip route của Router R3)</w:t>
+      </w:r>
+    </w:p>
+    <w:p>
+      <w:pPr>
+        <w:tabs>
+          <w:tab w:val="left" w:pos="3116"/>
+        </w:tabs>
+        <w:rPr>
+          <w:bCs/>
+          <w:sz w:val="26"/>
+          <w:szCs w:val="26"/>
+          <w:lang w:val="vi-VN"/>
+        </w:rPr>
+      </w:pPr>
+      <w:r>
+        <w:rPr>
+          <w:bCs/>
+          <w:sz w:val="26"/>
+          <w:szCs w:val="26"/>
+          <w:lang w:val="vi-VN"/>
+        </w:rPr>
+        <w:t>O IA  172.16.35.0 [110/202] via 10.0.1.1, 00:07:08, Serial1/0</w:t>
+      </w:r>
+    </w:p>
+    <w:p>
+      <w:pPr>
+        <w:tabs>
+          <w:tab w:val="left" w:pos="3116"/>
+        </w:tabs>
+        <w:rPr>
+          <w:bCs/>
+          <w:sz w:val="26"/>
+          <w:szCs w:val="26"/>
+          <w:lang w:val="vi-VN"/>
+        </w:rPr>
+      </w:pPr>
+      <w:r>
+        <w:rPr>
+          <w:bCs/>
+          <w:sz w:val="26"/>
+          <w:szCs w:val="26"/>
+          <w:lang w:val="vi-VN"/>
+        </w:rPr>
+        <w:lastRenderedPageBreak/>
+        <w:t>- O IA: Tuyến đường Inter-Area (khác vùng). Router R3 (nằm ở Area 1) đã học được mạng 172.16.35.0 (nằm tuốt bên Area 2) nhờ các con Router biên ABR (R1, R2) quảng bá hộ sang.</w:t>
+      </w:r>
+    </w:p>
+    <w:p>
+      <w:pPr>
+        <w:tabs>
+          <w:tab w:val="left" w:pos="3116"/>
+        </w:tabs>
+        <w:rPr>
+          <w:bCs/>
+          <w:sz w:val="26"/>
+          <w:szCs w:val="26"/>
+          <w:lang w:val="vi-VN"/>
+        </w:rPr>
+      </w:pPr>
+      <w:r>
+        <w:rPr>
+          <w:bCs/>
+          <w:sz w:val="26"/>
+          <w:szCs w:val="26"/>
+          <w:lang w:val="vi-VN"/>
+        </w:rPr>
+        <w:t>- 172.16.35.0: Địa chỉ IP của mạng đích (thuộc Area 2 - Mạng của VPC6).</w:t>
+      </w:r>
+    </w:p>
+    <w:p>
+      <w:pPr>
+        <w:tabs>
+          <w:tab w:val="left" w:pos="3116"/>
+        </w:tabs>
+        <w:rPr>
+          <w:bCs/>
+          <w:sz w:val="26"/>
+          <w:szCs w:val="26"/>
+          <w:lang w:val="vi-VN"/>
+        </w:rPr>
+      </w:pPr>
+      <w:r>
+        <w:rPr>
+          <w:bCs/>
+          <w:sz w:val="26"/>
+          <w:szCs w:val="26"/>
+          <w:lang w:val="vi-VN"/>
+        </w:rPr>
+        <w:t xml:space="preserve">- [110/202]: </w:t>
+      </w:r>
+    </w:p>
+    <w:p>
+      <w:pPr>
+        <w:tabs>
+          <w:tab w:val="left" w:pos="3116"/>
+        </w:tabs>
+        <w:rPr>
+          <w:bCs/>
+          <w:sz w:val="26"/>
+          <w:szCs w:val="26"/>
+          <w:lang w:val="vi-VN"/>
+        </w:rPr>
+      </w:pPr>
+      <w:r>
+        <w:rPr>
+          <w:bCs/>
+          <w:sz w:val="26"/>
+          <w:szCs w:val="26"/>
+          <w:lang w:val="vi-VN"/>
+        </w:rPr>
+        <w:t xml:space="preserve">  + 110 là Administrative Distance (Độ tin cậy mặc định của OSPF).</w:t>
+      </w:r>
+    </w:p>
+    <w:p>
+      <w:pPr>
+        <w:tabs>
+          <w:tab w:val="left" w:pos="3116"/>
+        </w:tabs>
+        <w:rPr>
+          <w:bCs/>
+          <w:sz w:val="26"/>
+          <w:szCs w:val="26"/>
+          <w:lang w:val="vi-VN"/>
+        </w:rPr>
+      </w:pPr>
+      <w:r>
+        <w:rPr>
+          <w:bCs/>
+          <w:sz w:val="26"/>
+          <w:szCs w:val="26"/>
+          <w:lang w:val="vi-VN"/>
+        </w:rPr>
+        <w:t xml:space="preserve">  + 202 là Metric (Cost - chi phí). Bằng tổng Cost của toàn bộ các chặng cáp để đi từ R3 sang VPC6 (Area 2). </w:t>
+      </w:r>
+    </w:p>
+    <w:p>
+      <w:pPr>
+        <w:tabs>
+          <w:tab w:val="left" w:pos="3116"/>
+        </w:tabs>
+        <w:rPr>
+          <w:bCs/>
+          <w:sz w:val="26"/>
+          <w:szCs w:val="26"/>
+          <w:lang w:val="vi-VN"/>
+        </w:rPr>
+      </w:pPr>
+      <w:r>
+        <w:rPr>
+          <w:bCs/>
+          <w:sz w:val="26"/>
+          <w:szCs w:val="26"/>
+          <w:lang w:val="vi-VN"/>
+        </w:rPr>
+        <w:t>- via 10.0.1.1: Gói tin phải đi qua trạm kế tiếp là 10.0.1.1 (cổng của Router R1).</w:t>
+      </w:r>
+    </w:p>
+    <w:p>
+      <w:pPr>
+        <w:tabs>
+          <w:tab w:val="left" w:pos="3116"/>
+        </w:tabs>
+        <w:rPr>
+          <w:bCs/>
+          <w:sz w:val="26"/>
+          <w:szCs w:val="26"/>
+          <w:lang w:val="vi-VN"/>
+        </w:rPr>
+      </w:pPr>
+      <w:r>
+        <w:rPr>
+          <w:bCs/>
+          <w:sz w:val="26"/>
+          <w:szCs w:val="26"/>
+          <w:lang w:val="vi-VN"/>
+        </w:rPr>
+        <w:t>- 00:07:08: Thời gian tuyến đường này tồn tại trong bảng định tuyến kể từ lần cập nhật cuối.</w:t>
+      </w:r>
+    </w:p>
+    <w:p>
+      <w:pPr>
+        <w:tabs>
+          <w:tab w:val="left" w:pos="3116"/>
+        </w:tabs>
+        <w:rPr>
+          <w:bCs/>
+          <w:sz w:val="26"/>
+          <w:szCs w:val="26"/>
+          <w:lang w:val="vi-VN"/>
+        </w:rPr>
+      </w:pPr>
+      <w:r>
+        <w:rPr>
+          <w:bCs/>
+          <w:sz w:val="26"/>
+          <w:szCs w:val="26"/>
+          <w:lang w:val="vi-VN"/>
+        </w:rPr>
+        <w:t>- Serial1/0: Gói tin sẽ đẩy ra khỏi Router R3 thông qua cổng Serial1/0.</w:t>
+      </w:r>
+    </w:p>
+    <w:p>
+      <w:pPr>
+        <w:tabs>
+          <w:tab w:val="left" w:pos="3116"/>
+        </w:tabs>
+        <w:rPr>
+          <w:bCs/>
+          <w:sz w:val="26"/>
+          <w:szCs w:val="26"/>
+          <w:lang w:val="vi-VN"/>
+        </w:rPr>
+      </w:pPr>
+      <w:r>
+        <w:rPr>
+          <w:noProof/>
+        </w:rPr>
+        <w:drawing>
+          <wp:inline distT="0" distB="0" distL="0" distR="0" wp14:anchorId="77630FE5" wp14:editId="62A84EA9">
+            <wp:extent cx="5943600" cy="3709035"/>
+            <wp:effectExtent l="0" t="0" r="0" b="5715"/>
+            <wp:docPr id="1276595193" name="Picture 1"/>
+            <wp:cNvGraphicFramePr>
+              <a:graphicFrameLocks xmlns:a="http://schemas.openxmlformats.org/drawingml/2006/main" noChangeAspect="1"/>
+            </wp:cNvGraphicFramePr>
+            <a:graphic xmlns:a="http://schemas.openxmlformats.org/drawingml/2006/main">
+              <a:graphicData uri="http://schemas.openxmlformats.org/drawingml/2006/picture">
+                <pic:pic xmlns:pic="http://schemas.openxmlformats.org/drawingml/2006/picture">
+                  <pic:nvPicPr>
+                    <pic:cNvPr id="1276595193" name=""/>
+                    <pic:cNvPicPr/>
+                  </pic:nvPicPr>
+                  <pic:blipFill>
+                    <a:blip r:embed="rId17"/>
+                    <a:stretch>
+                      <a:fillRect/>
+                    </a:stretch>
+                  </pic:blipFill>
+                  <pic:spPr>
+                    <a:xfrm>
+                      <a:off x="0" y="0"/>
+                      <a:ext cx="5943600" cy="3709035"/>
+                    </a:xfrm>
+                    <a:prstGeom prst="rect">
+                      <a:avLst/>
+                    </a:prstGeom>
+                  </pic:spPr>
+                </pic:pic>
+              </a:graphicData>
+            </a:graphic>
+          </wp:inline>
+        </w:drawing>
+      </w:r>
+    </w:p>
+    <w:p>
+      <w:pPr>
+        <w:tabs>
+          <w:tab w:val="left" w:pos="3116"/>
+        </w:tabs>
+        <w:rPr>
+          <w:bCs/>
+          <w:sz w:val="26"/>
+          <w:szCs w:val="26"/>
+          <w:lang w:val="vi-VN"/>
+        </w:rPr>
+      </w:pPr>
+      <w:r>
+        <w:rPr>
+          <w:bCs/>
+          <w:sz w:val="26"/>
+          <w:szCs w:val="26"/>
+          <w:lang w:val="vi-VN"/>
+        </w:rPr>
+        <w:t>Câu 4/</w:t>
+      </w:r>
+    </w:p>
+    <w:p>
+      <w:pPr>
+        <w:tabs>
+          <w:tab w:val="left" w:pos="3116"/>
+        </w:tabs>
+        <w:rPr>
+          <w:bCs/>
+          <w:sz w:val="26"/>
+          <w:szCs w:val="26"/>
+          <w:lang w:val="vi-VN"/>
+        </w:rPr>
+      </w:pPr>
+    </w:p>
+    <w:p>
+      <w:pPr>
+        <w:tabs>
+          <w:tab w:val="left" w:pos="3116"/>
+        </w:tabs>
+        <w:rPr>
+          <w:bCs/>
+          <w:sz w:val="26"/>
+          <w:szCs w:val="26"/>
+          <w:lang w:val="vi-VN"/>
+        </w:rPr>
+      </w:pPr>
+      <w:r>
+        <w:rPr>
+          <w:bCs/>
+          <w:sz w:val="26"/>
+          <w:szCs w:val="26"/>
+          <w:lang w:val="vi-VN"/>
+        </w:rPr>
+        <w:t>Luật bất thành văn của OSPF Đa vùng là: Mọi cuộc gọi điện liên tỉnh (từ Area này sang Area khác) BẮT BUỘC phải đi ngang qua Thủ đô (Area 0 - Backbone). Không có cách nào đi đường tắt!</w:t>
+      </w:r>
+    </w:p>
+    <w:p>
+      <w:pPr>
+        <w:tabs>
+          <w:tab w:val="left" w:pos="3116"/>
+        </w:tabs>
+        <w:rPr>
+          <w:bCs/>
+          <w:sz w:val="26"/>
+          <w:szCs w:val="26"/>
+          <w:lang w:val="vi-VN"/>
+        </w:rPr>
+      </w:pPr>
+    </w:p>
+    <w:p>
+      <w:pPr>
+        <w:tabs>
+          <w:tab w:val="left" w:pos="3116"/>
+        </w:tabs>
+        <w:rPr>
+          <w:bCs/>
+          <w:sz w:val="26"/>
+          <w:szCs w:val="26"/>
+          <w:lang w:val="vi-VN"/>
+        </w:rPr>
+      </w:pPr>
+      <w:r>
+        <w:rPr>
+          <w:bCs/>
+          <w:sz w:val="26"/>
+          <w:szCs w:val="26"/>
+          <w:lang w:val="vi-VN"/>
+        </w:rPr>
+        <w:t>Đường đi thực tế của gói tin từ VPC5 sang VPC6:</w:t>
+      </w:r>
+    </w:p>
+    <w:p>
+      <w:pPr>
+        <w:tabs>
+          <w:tab w:val="left" w:pos="3116"/>
+        </w:tabs>
+        <w:rPr>
+          <w:bCs/>
+          <w:sz w:val="26"/>
+          <w:szCs w:val="26"/>
+          <w:lang w:val="vi-VN"/>
+        </w:rPr>
+      </w:pPr>
+      <w:r>
+        <w:rPr>
+          <w:bCs/>
+          <w:sz w:val="26"/>
+          <w:szCs w:val="26"/>
+          <w:lang w:val="vi-VN"/>
+        </w:rPr>
+        <w:t>Gói tin từ VPC5 phải nhảy rào qua 5 trạm (Hop):</w:t>
+      </w:r>
+    </w:p>
+    <w:p>
+      <w:pPr>
+        <w:tabs>
+          <w:tab w:val="left" w:pos="3116"/>
+        </w:tabs>
+        <w:rPr>
+          <w:bCs/>
+          <w:sz w:val="26"/>
+          <w:szCs w:val="26"/>
+          <w:lang w:val="vi-VN"/>
+        </w:rPr>
+      </w:pPr>
+      <w:r>
+        <w:rPr>
+          <w:bCs/>
+          <w:sz w:val="26"/>
+          <w:szCs w:val="26"/>
+          <w:lang w:val="vi-VN"/>
+        </w:rPr>
+        <w:t>+ Hop 1: 10.0.2.1 (Từ VPC5 đi lên cổng Gateway của Router nội bộ R3 ở Area 1).</w:t>
+      </w:r>
+    </w:p>
+    <w:p>
+      <w:pPr>
+        <w:tabs>
+          <w:tab w:val="left" w:pos="3116"/>
+        </w:tabs>
+        <w:rPr>
+          <w:bCs/>
+          <w:sz w:val="26"/>
+          <w:szCs w:val="26"/>
+          <w:lang w:val="vi-VN"/>
+        </w:rPr>
+      </w:pPr>
+      <w:r>
+        <w:rPr>
+          <w:bCs/>
+          <w:sz w:val="26"/>
+          <w:szCs w:val="26"/>
+          <w:lang w:val="vi-VN"/>
+        </w:rPr>
+        <w:t>+ Hop 2: 10.0.1.1 (Từ R3 đi sang Router biên R1. Lúc này gói tin chính thức bước vào Area 0 - Backbone).</w:t>
+      </w:r>
+    </w:p>
+    <w:p>
+      <w:pPr>
+        <w:tabs>
+          <w:tab w:val="left" w:pos="3116"/>
+        </w:tabs>
+        <w:rPr>
+          <w:bCs/>
+          <w:sz w:val="26"/>
+          <w:szCs w:val="26"/>
+          <w:lang w:val="vi-VN"/>
+        </w:rPr>
+      </w:pPr>
+      <w:r>
+        <w:rPr>
+          <w:bCs/>
+          <w:sz w:val="26"/>
+          <w:szCs w:val="26"/>
+          <w:lang w:val="vi-VN"/>
+        </w:rPr>
+        <w:t>+ Hop 3: 192.168.23.2 (Từ R1 đi xuyên qua xương sống Area 0 để sang Router biên R2 của Area 2).</w:t>
+      </w:r>
+    </w:p>
+    <w:p>
+      <w:pPr>
+        <w:tabs>
+          <w:tab w:val="left" w:pos="3116"/>
+        </w:tabs>
+        <w:rPr>
+          <w:bCs/>
+          <w:sz w:val="26"/>
+          <w:szCs w:val="26"/>
+          <w:lang w:val="vi-VN"/>
+        </w:rPr>
+      </w:pPr>
+      <w:r>
+        <w:rPr>
+          <w:bCs/>
+          <w:sz w:val="26"/>
+          <w:szCs w:val="26"/>
+          <w:lang w:val="vi-VN"/>
+        </w:rPr>
+        <w:t>+ Hop 4: 172.16.34.4 (Từ R2 đi xuống Router nội bộ R4 của Area 2).</w:t>
+      </w:r>
+    </w:p>
+    <w:p>
+      <w:pPr>
+        <w:tabs>
+          <w:tab w:val="left" w:pos="3116"/>
+        </w:tabs>
+        <w:rPr>
+          <w:bCs/>
+          <w:sz w:val="26"/>
+          <w:szCs w:val="26"/>
+          <w:lang w:val="vi-VN"/>
+        </w:rPr>
+      </w:pPr>
+      <w:r>
+        <w:rPr>
+          <w:bCs/>
+          <w:sz w:val="26"/>
+          <w:szCs w:val="26"/>
+          <w:lang w:val="vi-VN"/>
+        </w:rPr>
+        <w:t>+ Hop 5: 172.16.35.10 (Destination port unreachable) (Gói tin chạm đích máy VPC6 thành công. Thông báo báo lỗi Unreachable ở bước cuối là đặc trưng bình thường của VPCS khi trace bằng UDP port).</w:t>
+      </w:r>
+    </w:p>
+    <w:p>
+      <w:pPr>
+        <w:tabs>
+          <w:tab w:val="left" w:pos="3116"/>
+        </w:tabs>
+        <w:rPr>
+          <w:bCs/>
+          <w:sz w:val="26"/>
+          <w:szCs w:val="26"/>
+          <w:lang w:val="vi-VN"/>
+        </w:rPr>
+      </w:pPr>
+    </w:p>
+    <w:p>
+      <w:pPr>
+        <w:tabs>
+          <w:tab w:val="left" w:pos="3116"/>
+        </w:tabs>
+        <w:rPr>
+          <w:bCs/>
+          <w:sz w:val="26"/>
+          <w:szCs w:val="26"/>
+          <w:lang w:val="vi-VN"/>
+        </w:rPr>
+      </w:pPr>
+      <w:r>
+        <w:rPr>
+          <w:bCs/>
+          <w:sz w:val="26"/>
+          <w:szCs w:val="26"/>
+          <w:lang w:val="vi-VN"/>
+        </w:rPr>
+        <w:t>Kết luận: Gói tin đã tuân thủ tuyệt đối quy tắc của OSPF Đa Vùng: Xuất phát từ Vùng 1 -&gt; Xuyên qua Vùng Backbone 0 -&gt; Đi vào Vùng đích 2. Lộ trình này chứng minh cơ chế chống lặp vòng (Anti-loop) của OSPF bằng kiến trúc Hub-and-Spoke xoay quanh Area 0 hoạt động cực kỳ hoàn hảo.</w:t>
+      </w:r>
+    </w:p>
+    <w:p>
+      <w:pPr>
+        <w:tabs>
+          <w:tab w:val="left" w:pos="3116"/>
+        </w:tabs>
+        <w:rPr>
+          <w:bCs/>
+          <w:sz w:val="26"/>
+          <w:szCs w:val="26"/>
+          <w:lang w:val="vi-VN"/>
+        </w:rPr>
+      </w:pPr>
+      <w:r>
+        <w:rPr>
+          <w:noProof/>
+        </w:rPr>
+        <w:drawing>
+          <wp:inline distT="0" distB="0" distL="0" distR="0" wp14:anchorId="0106CDC3" wp14:editId="32BAA3F2">
+            <wp:extent cx="5943600" cy="3535680"/>
+            <wp:effectExtent l="0" t="0" r="0" b="7620"/>
+            <wp:docPr id="1887377727" name="Picture 1"/>
+            <wp:cNvGraphicFramePr>
+              <a:graphicFrameLocks xmlns:a="http://schemas.openxmlformats.org/drawingml/2006/main" noChangeAspect="1"/>
+            </wp:cNvGraphicFramePr>
+            <a:graphic xmlns:a="http://schemas.openxmlformats.org/drawingml/2006/main">
+              <a:graphicData uri="http://schemas.openxmlformats.org/drawingml/2006/picture">
+                <pic:pic xmlns:pic="http://schemas.openxmlformats.org/drawingml/2006/picture">
+                  <pic:nvPicPr>
+                    <pic:cNvPr id="1887377727" name=""/>
+                    <pic:cNvPicPr/>
+                  </pic:nvPicPr>
+                  <pic:blipFill>
+                    <a:blip r:embed="rId18"/>
+                    <a:stretch>
+                      <a:fillRect/>
+                    </a:stretch>
+                  </pic:blipFill>
+                  <pic:spPr>
+                    <a:xfrm>
+                      <a:off x="0" y="0"/>
+                      <a:ext cx="5943600" cy="3535680"/>
+                    </a:xfrm>
+                    <a:prstGeom prst="rect">
+                      <a:avLst/>
+                    </a:prstGeom>
+                  </pic:spPr>
+                </pic:pic>
+              </a:graphicData>
+            </a:graphic>
+          </wp:inline>
+        </w:drawing>
+      </w:r>
+    </w:p>
+    <w:p>
+      <w:pPr>
+        <w:tabs>
+          <w:tab w:val="left" w:pos="3116"/>
+        </w:tabs>
+        <w:rPr>
+          <w:bCs/>
+          <w:sz w:val="26"/>
+          <w:szCs w:val="26"/>
+          <w:lang w:val="vi-VN"/>
+        </w:rPr>
+      </w:pPr>
+    </w:p>
+    <w:p>
+      <w:pPr>
+        <w:tabs>
+          <w:tab w:val="left" w:pos="3116"/>
+        </w:tabs>
+        <w:rPr>
+          <w:bCs/>
+          <w:sz w:val="26"/>
+          <w:szCs w:val="26"/>
+          <w:lang w:val="vi-VN"/>
+        </w:rPr>
+      </w:pPr>
+    </w:p>
+    <w:p>
+      <w:pPr>
+        <w:tabs>
+          <w:tab w:val="left" w:pos="3116"/>
+        </w:tabs>
+        <w:rPr>
+          <w:bCs/>
+          <w:sz w:val="26"/>
+          <w:szCs w:val="26"/>
+          <w:lang w:val="vi-VN"/>
+        </w:rPr>
+      </w:pPr>
+      <w:r>
+        <w:rPr>
+          <w:noProof/>
+        </w:rPr>
+        <w:drawing>
+          <wp:inline distT="0" distB="0" distL="0" distR="0" wp14:anchorId="30147C77" wp14:editId="3FF077C0">
+            <wp:extent cx="5943600" cy="3535680"/>
+            <wp:effectExtent l="0" t="0" r="0" b="7620"/>
+            <wp:docPr id="885297800" name="Picture 1"/>
+            <wp:cNvGraphicFramePr>
+              <a:graphicFrameLocks xmlns:a="http://schemas.openxmlformats.org/drawingml/2006/main" noChangeAspect="1"/>
+            </wp:cNvGraphicFramePr>
+            <a:graphic xmlns:a="http://schemas.openxmlformats.org/drawingml/2006/main">
+              <a:graphicData uri="http://schemas.openxmlformats.org/drawingml/2006/picture">
+                <pic:pic xmlns:pic="http://schemas.openxmlformats.org/drawingml/2006/picture">
+                  <pic:nvPicPr>
+                    <pic:cNvPr id="885297800" name=""/>
+                    <pic:cNvPicPr/>
+                  </pic:nvPicPr>
+                  <pic:blipFill>
+                    <a:blip r:embed="rId18"/>
+                    <a:stretch>
+                      <a:fillRect/>
+                    </a:stretch>
+                  </pic:blipFill>
+                  <pic:spPr>
+                    <a:xfrm>
+                      <a:off x="0" y="0"/>
+                      <a:ext cx="5943600" cy="3535680"/>
+                    </a:xfrm>
+                    <a:prstGeom prst="rect">
+                      <a:avLst/>
+                    </a:prstGeom>
+                  </pic:spPr>
+                </pic:pic>
+              </a:graphicData>
+            </a:graphic>
+          </wp:inline>
+        </w:drawing>
+      </w:r>
+    </w:p>
+    <w:p>
+      <w:pPr>
+        <w:tabs>
+          <w:tab w:val="left" w:pos="3116"/>
+        </w:tabs>
+        <w:rPr>
+          <w:bCs/>
+          <w:sz w:val="26"/>
+          <w:szCs w:val="26"/>
+          <w:lang w:val="vi-VN"/>
+        </w:rPr>
+      </w:pPr>
+    </w:p>
+    <w:p>
+      <w:pPr>
+        <w:tabs>
+          <w:tab w:val="left" w:pos="3116"/>
+        </w:tabs>
+        <w:rPr>
+          <w:bCs/>
+          <w:sz w:val="26"/>
+          <w:szCs w:val="26"/>
+          <w:lang w:val="vi-VN"/>
+        </w:rPr>
+      </w:pPr>
+    </w:p>
+    <w:p>
+      <w:pPr>
+        <w:tabs>
+          <w:tab w:val="left" w:pos="3116"/>
+        </w:tabs>
+        <w:rPr>
+          <w:bCs/>
+          <w:sz w:val="26"/>
+          <w:szCs w:val="26"/>
+        </w:rPr>
+      </w:pPr>
+      <w:r>
+        <w:rPr>
+          <w:bCs/>
+          <w:sz w:val="26"/>
+          <w:szCs w:val="26"/>
+          <w:lang w:val="vi-VN"/>
+        </w:rPr>
+        <w:t>Bài 3</w:t>
+      </w:r>
+    </w:p>
+    <w:p>
+      <w:pPr>
+        <w:tabs>
+          <w:tab w:val="left" w:pos="3116"/>
+        </w:tabs>
+        <w:rPr>
+          <w:bCs/>
+          <w:sz w:val="26"/>
+          <w:szCs w:val="26"/>
+          <w:lang w:val="vi-VN"/>
+        </w:rPr>
+      </w:pPr>
+      <w:r>
+        <w:rPr>
+          <w:bCs/>
+          <w:sz w:val="26"/>
+          <w:szCs w:val="26"/>
+          <w:lang w:val="vi-VN"/>
+        </w:rPr>
+        <w:drawing>
+          <wp:inline distT="0" distB="0" distL="0" distR="0" wp14:anchorId="1473505A" wp14:editId="190AF0B8">
+            <wp:extent cx="5943600" cy="3357245"/>
+            <wp:effectExtent l="0" t="0" r="0" b="0"/>
+            <wp:docPr id="1920192030" name="Picture 1"/>
+            <wp:cNvGraphicFramePr>
+              <a:graphicFrameLocks xmlns:a="http://schemas.openxmlformats.org/drawingml/2006/main" noChangeAspect="1"/>
+            </wp:cNvGraphicFramePr>
+            <a:graphic xmlns:a="http://schemas.openxmlformats.org/drawingml/2006/main">
+              <a:graphicData uri="http://schemas.openxmlformats.org/drawingml/2006/picture">
+                <pic:pic xmlns:pic="http://schemas.openxmlformats.org/drawingml/2006/picture">
+                  <pic:nvPicPr>
+                    <pic:cNvPr id="1920192030" name=""/>
+                    <pic:cNvPicPr/>
+                  </pic:nvPicPr>
+                  <pic:blipFill>
+                    <a:blip r:embed="rId19"/>
+                    <a:stretch>
+                      <a:fillRect/>
+                    </a:stretch>
+                  </pic:blipFill>
+                  <pic:spPr>
+                    <a:xfrm>
+                      <a:off x="0" y="0"/>
+                      <a:ext cx="5943600" cy="3357245"/>
+                    </a:xfrm>
+                    <a:prstGeom prst="rect">
+                      <a:avLst/>
+                    </a:prstGeom>
+                  </pic:spPr>
+                </pic:pic>
+              </a:graphicData>
+            </a:graphic>
+          </wp:inline>
+        </w:drawing>
+      </w:r>
+    </w:p>
+    <w:p>
+      <w:pPr>
+        <w:tabs>
+          <w:tab w:val="left" w:pos="3116"/>
+        </w:tabs>
+        <w:rPr>
+          <w:bCs/>
+          <w:sz w:val="26"/>
+          <w:szCs w:val="26"/>
+          <w:lang w:val="vi-VN"/>
+        </w:rPr>
+      </w:pPr>
+    </w:p>
+    <w:p>
+      <w:pPr>
+        <w:tabs>
+          <w:tab w:val="left" w:pos="3116"/>
+        </w:tabs>
+        <w:rPr>
+          <w:bCs/>
+          <w:sz w:val="26"/>
+          <w:szCs w:val="26"/>
+          <w:lang w:val="vi-VN"/>
+        </w:rPr>
+      </w:pPr>
+      <w:r>
+        <w:rPr>
+          <w:noProof/>
+        </w:rPr>
+        <w:drawing>
+          <wp:inline distT="0" distB="0" distL="0" distR="0" wp14:anchorId="19A1A392" wp14:editId="418488D3">
+            <wp:extent cx="5943600" cy="4221480"/>
+            <wp:effectExtent l="0" t="0" r="0" b="7620"/>
+            <wp:docPr id="77231355" name="Picture 1"/>
+            <wp:cNvGraphicFramePr>
+              <a:graphicFrameLocks xmlns:a="http://schemas.openxmlformats.org/drawingml/2006/main" noChangeAspect="1"/>
+            </wp:cNvGraphicFramePr>
+            <a:graphic xmlns:a="http://schemas.openxmlformats.org/drawingml/2006/main">
+              <a:graphicData uri="http://schemas.openxmlformats.org/drawingml/2006/picture">
+                <pic:pic xmlns:pic="http://schemas.openxmlformats.org/drawingml/2006/picture">
+                  <pic:nvPicPr>
+                    <pic:cNvPr id="77231355" name=""/>
+                    <pic:cNvPicPr/>
+                  </pic:nvPicPr>
+                  <pic:blipFill>
+                    <a:blip r:embed="rId20"/>
+                    <a:stretch>
+                      <a:fillRect/>
+                    </a:stretch>
+                  </pic:blipFill>
+                  <pic:spPr>
+                    <a:xfrm>
+                      <a:off x="0" y="0"/>
+                      <a:ext cx="5943600" cy="4221480"/>
+                    </a:xfrm>
+                    <a:prstGeom prst="rect">
+                      <a:avLst/>
+                    </a:prstGeom>
+                  </pic:spPr>
+                </pic:pic>
+              </a:graphicData>
+            </a:graphic>
+          </wp:inline>
+        </w:drawing>
+      </w:r>
+    </w:p>
+    <w:p>
+      <w:pPr>
+        <w:tabs>
+          <w:tab w:val="left" w:pos="3116"/>
+        </w:tabs>
+        <w:rPr>
+          <w:bCs/>
+          <w:sz w:val="26"/>
+          <w:szCs w:val="26"/>
+          <w:lang w:val="vi-VN"/>
+        </w:rPr>
+      </w:pPr>
+    </w:p>
+    <w:p>
+      <w:pPr>
+        <w:tabs>
+          <w:tab w:val="left" w:pos="3116"/>
+        </w:tabs>
+        <w:rPr>
+          <w:bCs/>
+          <w:sz w:val="26"/>
+          <w:szCs w:val="26"/>
+          <w:lang w:val="vi-VN"/>
+        </w:rPr>
+      </w:pPr>
+      <w:r>
+        <w:rPr>
+          <w:bCs/>
+          <w:sz w:val="26"/>
+          <w:szCs w:val="26"/>
+          <w:lang w:val="vi-VN"/>
+        </w:rPr>
+        <w:t>Câu 3</w:t>
+      </w:r>
+    </w:p>
+    <w:p>
+      <w:pPr>
+        <w:tabs>
+          <w:tab w:val="left" w:pos="3116"/>
+        </w:tabs>
+        <w:rPr>
+          <w:bCs/>
+          <w:sz w:val="26"/>
+          <w:szCs w:val="26"/>
+          <w:lang w:val="vi-VN"/>
+        </w:rPr>
+      </w:pPr>
+      <w:r>
+        <w:rPr>
+          <w:bCs/>
+          <w:sz w:val="26"/>
+          <w:szCs w:val="26"/>
+          <w:lang w:val="vi-VN"/>
+        </w:rPr>
+        <w:t>Router R1 đóng vai trò là ABR (Area Border Router), đứng ở ranh giới giữa Area 0 và Area 1. Bảng định tuyến của R1 sẽ rất phong phú, bao gồm các loại tuyến đường sau:</w:t>
+      </w:r>
+    </w:p>
+    <w:p>
+      <w:pPr>
+        <w:tabs>
+          <w:tab w:val="left" w:pos="3116"/>
+        </w:tabs>
+        <w:rPr>
+          <w:bCs/>
+          <w:sz w:val="26"/>
+          <w:szCs w:val="26"/>
+          <w:lang w:val="vi-VN"/>
+        </w:rPr>
+      </w:pPr>
+      <w:r>
+        <w:rPr>
+          <w:bCs/>
+          <w:sz w:val="26"/>
+          <w:szCs w:val="26"/>
+          <w:lang w:val="vi-VN"/>
+        </w:rPr>
+        <w:t>- C (Connected) / L (Local): Các mạng kết nối trực tiếp với R1 (Ví dụ: mạng 10.1.1.0/24, 192.168.1.32/28, 192.168.1.48/28).</w:t>
+      </w:r>
+    </w:p>
+    <w:p>
+      <w:pPr>
+        <w:tabs>
+          <w:tab w:val="left" w:pos="3116"/>
+        </w:tabs>
+        <w:rPr>
+          <w:bCs/>
+          <w:sz w:val="26"/>
+          <w:szCs w:val="26"/>
+          <w:lang w:val="vi-VN"/>
+        </w:rPr>
+      </w:pPr>
+      <w:r>
+        <w:rPr>
+          <w:bCs/>
+          <w:sz w:val="26"/>
+          <w:szCs w:val="26"/>
+          <w:lang w:val="vi-VN"/>
+        </w:rPr>
+        <w:t>- O (OSPF Intra-Area): Các mạng nằm TRONG CÙNG Area với R1. R1 có mặt ở cả Area 0 và Area 1 nên nó học được các mạng nội bộ của 2 vùng này bằng chữ O.</w:t>
+      </w:r>
+    </w:p>
+    <w:p>
+      <w:pPr>
+        <w:tabs>
+          <w:tab w:val="left" w:pos="3116"/>
+        </w:tabs>
+        <w:rPr>
+          <w:bCs/>
+          <w:sz w:val="26"/>
+          <w:szCs w:val="26"/>
+          <w:lang w:val="vi-VN"/>
+        </w:rPr>
+      </w:pPr>
+      <w:r>
+        <w:rPr>
+          <w:bCs/>
+          <w:sz w:val="26"/>
+          <w:szCs w:val="26"/>
+          <w:lang w:val="vi-VN"/>
+        </w:rPr>
+        <w:t xml:space="preserve">  + Ví dụ mạng nội bộ Area 1: 172.16.10.0/24, 172.16.11.0/24 học từ Router BB1.</w:t>
+      </w:r>
+    </w:p>
+    <w:p>
+      <w:pPr>
+        <w:tabs>
+          <w:tab w:val="left" w:pos="3116"/>
+        </w:tabs>
+        <w:rPr>
+          <w:bCs/>
+          <w:sz w:val="26"/>
+          <w:szCs w:val="26"/>
+          <w:lang w:val="vi-VN"/>
+        </w:rPr>
+      </w:pPr>
+      <w:r>
+        <w:rPr>
+          <w:bCs/>
+          <w:sz w:val="26"/>
+          <w:szCs w:val="26"/>
+          <w:lang w:val="vi-VN"/>
+        </w:rPr>
+        <w:t xml:space="preserve">  + Ví dụ mạng nội bộ Area 0: 192.168.1.64/28 học từ Router R2/R3.</w:t>
+      </w:r>
+    </w:p>
+    <w:p>
+      <w:pPr>
+        <w:tabs>
+          <w:tab w:val="left" w:pos="3116"/>
+        </w:tabs>
+        <w:rPr>
+          <w:bCs/>
+          <w:sz w:val="26"/>
+          <w:szCs w:val="26"/>
+          <w:lang w:val="vi-VN"/>
+        </w:rPr>
+      </w:pPr>
+      <w:r>
+        <w:rPr>
+          <w:bCs/>
+          <w:sz w:val="26"/>
+          <w:szCs w:val="26"/>
+          <w:lang w:val="vi-VN"/>
+        </w:rPr>
+        <w:t>- O IA (OSPF Inter-Area): Các mạng nằm ở VÙNG KHÁC (Area 2 và Area 3) được học thông qua các ABR khác (R2 và R3).</w:t>
+      </w:r>
+    </w:p>
+    <w:p>
+      <w:pPr>
+        <w:tabs>
+          <w:tab w:val="left" w:pos="3116"/>
+        </w:tabs>
+        <w:rPr>
+          <w:bCs/>
+          <w:sz w:val="26"/>
+          <w:szCs w:val="26"/>
+          <w:lang w:val="vi-VN"/>
+        </w:rPr>
+      </w:pPr>
+      <w:r>
+        <w:rPr>
+          <w:bCs/>
+          <w:sz w:val="26"/>
+          <w:szCs w:val="26"/>
+          <w:lang w:val="vi-VN"/>
+        </w:rPr>
+        <w:t xml:space="preserve">  + Ví dụ mạng Area 2: 172.22.2.0/24, 172.21.21.0/24 học từ R2.</w:t>
+      </w:r>
+    </w:p>
+    <w:p>
+      <w:pPr>
+        <w:tabs>
+          <w:tab w:val="left" w:pos="3116"/>
+        </w:tabs>
+        <w:rPr>
+          <w:bCs/>
+          <w:sz w:val="26"/>
+          <w:szCs w:val="26"/>
+          <w:lang w:val="vi-VN"/>
+        </w:rPr>
+      </w:pPr>
+      <w:r>
+        <w:rPr>
+          <w:bCs/>
+          <w:sz w:val="26"/>
+          <w:szCs w:val="26"/>
+          <w:lang w:val="vi-VN"/>
+        </w:rPr>
+        <w:t xml:space="preserve">  + Ví dụ mạng Area 3: 172.22.1.0/24, 172.31.21.0/24 học từ R3.</w:t>
+      </w:r>
+    </w:p>
+    <w:p>
+      <w:pPr>
+        <w:tabs>
+          <w:tab w:val="left" w:pos="3116"/>
+        </w:tabs>
+        <w:rPr>
+          <w:bCs/>
+          <w:sz w:val="26"/>
+          <w:szCs w:val="26"/>
+          <w:lang w:val="vi-VN"/>
+        </w:rPr>
+      </w:pPr>
+    </w:p>
+    <w:p>
+      <w:pPr>
+        <w:tabs>
+          <w:tab w:val="left" w:pos="3116"/>
+        </w:tabs>
+        <w:rPr>
+          <w:bCs/>
+          <w:sz w:val="26"/>
+          <w:szCs w:val="26"/>
+          <w:lang w:val="vi-VN"/>
+        </w:rPr>
+      </w:pPr>
+    </w:p>
+    <w:p>
+      <w:pPr>
+        <w:tabs>
+          <w:tab w:val="left" w:pos="3116"/>
+        </w:tabs>
+        <w:rPr>
+          <w:bCs/>
+          <w:sz w:val="26"/>
+          <w:szCs w:val="26"/>
+          <w:lang w:val="vi-VN"/>
+        </w:rPr>
+      </w:pPr>
+      <w:r>
+        <w:rPr>
+          <w:bCs/>
+          <w:sz w:val="26"/>
+          <w:szCs w:val="26"/>
+          <w:lang w:val="vi-VN"/>
+        </w:rPr>
+        <w:t>Phân tích chi tiết một dòng O IA trên R1 (Ví dụ mạng 172.21.21.0):</w:t>
+      </w:r>
+    </w:p>
+    <w:p>
+      <w:pPr>
+        <w:tabs>
+          <w:tab w:val="left" w:pos="3116"/>
+        </w:tabs>
+        <w:rPr>
+          <w:bCs/>
+          <w:sz w:val="26"/>
+          <w:szCs w:val="26"/>
+          <w:lang w:val="vi-VN"/>
+        </w:rPr>
+      </w:pPr>
+      <w:r>
+        <w:rPr>
+          <w:bCs/>
+          <w:sz w:val="26"/>
+          <w:szCs w:val="26"/>
+          <w:lang w:val="vi-VN"/>
+        </w:rPr>
+        <w:t>O IA     172.21.21.0 [110/138] via 192.168.1.34, 00:25:30, Serial1/1</w:t>
+      </w:r>
+    </w:p>
+    <w:p>
+      <w:pPr>
+        <w:tabs>
+          <w:tab w:val="left" w:pos="3116"/>
+        </w:tabs>
+        <w:rPr>
+          <w:bCs/>
+          <w:sz w:val="26"/>
+          <w:szCs w:val="26"/>
+          <w:lang w:val="vi-VN"/>
+        </w:rPr>
+      </w:pPr>
+      <w:r>
+        <w:rPr>
+          <w:bCs/>
+          <w:sz w:val="26"/>
+          <w:szCs w:val="26"/>
+          <w:lang w:val="vi-VN"/>
+        </w:rPr>
+        <w:t>- O IA: Tuyến đường khác vùng (Inter-Area). R1 học được mạng của PC3 (ở Area 2) do R2 quảng bá hộ sang Area 0.</w:t>
+      </w:r>
+    </w:p>
+    <w:p>
+      <w:pPr>
+        <w:tabs>
+          <w:tab w:val="left" w:pos="3116"/>
+        </w:tabs>
+        <w:rPr>
+          <w:bCs/>
+          <w:sz w:val="26"/>
+          <w:szCs w:val="26"/>
+          <w:lang w:val="vi-VN"/>
+        </w:rPr>
+      </w:pPr>
+      <w:r>
+        <w:rPr>
+          <w:bCs/>
+          <w:sz w:val="26"/>
+          <w:szCs w:val="26"/>
+          <w:lang w:val="vi-VN"/>
+        </w:rPr>
+        <w:t>- 172.21.21.0: Địa chỉ đích.</w:t>
+      </w:r>
+    </w:p>
+    <w:p>
+      <w:pPr>
+        <w:tabs>
+          <w:tab w:val="left" w:pos="3116"/>
+        </w:tabs>
+        <w:rPr>
+          <w:bCs/>
+          <w:sz w:val="26"/>
+          <w:szCs w:val="26"/>
+          <w:lang w:val="vi-VN"/>
+        </w:rPr>
+      </w:pPr>
+      <w:r>
+        <w:rPr>
+          <w:bCs/>
+          <w:sz w:val="26"/>
+          <w:szCs w:val="26"/>
+          <w:lang w:val="vi-VN"/>
+        </w:rPr>
+        <w:t xml:space="preserve">- [110/138]: Administrative Distance (Độ ưu tiên mặc định của OSPF là 110). 138 là tổng Cost (Metric) đường đi từ R1 tới mạng đích. </w:t>
+      </w:r>
+    </w:p>
+    <w:p>
+      <w:pPr>
+        <w:tabs>
+          <w:tab w:val="left" w:pos="3116"/>
+        </w:tabs>
+        <w:rPr>
+          <w:bCs/>
+          <w:sz w:val="26"/>
+          <w:szCs w:val="26"/>
+          <w:lang w:val="vi-VN"/>
+        </w:rPr>
+      </w:pPr>
+      <w:r>
+        <w:rPr>
+          <w:bCs/>
+          <w:sz w:val="26"/>
+          <w:szCs w:val="26"/>
+          <w:lang w:val="vi-VN"/>
+        </w:rPr>
+        <w:t>- via 192.168.1.34: Phải nhảy qua trạm kế tiếp là 192.168.1.34 (Router R2).</w:t>
+      </w:r>
+    </w:p>
+    <w:p>
+      <w:pPr>
+        <w:tabs>
+          <w:tab w:val="left" w:pos="3116"/>
+        </w:tabs>
+        <w:rPr>
+          <w:bCs/>
+          <w:sz w:val="26"/>
+          <w:szCs w:val="26"/>
+          <w:lang w:val="vi-VN"/>
+        </w:rPr>
+      </w:pPr>
+      <w:r>
+        <w:rPr>
+          <w:bCs/>
+          <w:sz w:val="26"/>
+          <w:szCs w:val="26"/>
+          <w:lang w:val="vi-VN"/>
+        </w:rPr>
+        <w:t>- 00:25:30: Thời gian tuyến đường này tồn tại trong bảng định tuyến kể từ lần cập nhật cuối.</w:t>
+      </w:r>
+    </w:p>
+    <w:p>
+      <w:pPr>
+        <w:tabs>
+          <w:tab w:val="left" w:pos="3116"/>
+        </w:tabs>
+        <w:rPr>
+          <w:bCs/>
+          <w:sz w:val="26"/>
+          <w:szCs w:val="26"/>
+          <w:lang w:val="vi-VN"/>
+        </w:rPr>
+      </w:pPr>
+      <w:r>
+        <w:rPr>
+          <w:bCs/>
+          <w:sz w:val="26"/>
+          <w:szCs w:val="26"/>
+          <w:lang w:val="vi-VN"/>
+        </w:rPr>
+        <w:t>- Serial1/1: Đẩy gói tin ra khỏi cổng Serial của R1.</w:t>
+      </w:r>
+    </w:p>
+    <w:p>
+      <w:pPr>
+        <w:tabs>
+          <w:tab w:val="left" w:pos="3116"/>
+        </w:tabs>
+        <w:rPr>
+          <w:bCs/>
+          <w:sz w:val="26"/>
+          <w:szCs w:val="26"/>
+          <w:lang w:val="vi-VN"/>
+        </w:rPr>
+      </w:pPr>
+    </w:p>
+    <w:p>
+      <w:pPr>
+        <w:tabs>
+          <w:tab w:val="left" w:pos="3116"/>
+        </w:tabs>
+        <w:rPr>
+          <w:bCs/>
+          <w:sz w:val="26"/>
+          <w:szCs w:val="26"/>
+          <w:lang w:val="vi-VN"/>
+        </w:rPr>
+      </w:pPr>
+      <w:r>
+        <w:rPr>
+          <w:bCs/>
+          <w:sz w:val="26"/>
+          <w:szCs w:val="26"/>
+          <w:lang w:val="vi-VN"/>
+        </w:rPr>
+        <w:drawing>
+          <wp:inline distT="0" distB="0" distL="0" distR="0" wp14:anchorId="65C817FC" wp14:editId="033D0AEB">
+            <wp:extent cx="5943600" cy="3731260"/>
+            <wp:effectExtent l="0" t="0" r="0" b="2540"/>
+            <wp:docPr id="1444867707" name="Picture 1"/>
+            <wp:cNvGraphicFramePr>
+              <a:graphicFrameLocks xmlns:a="http://schemas.openxmlformats.org/drawingml/2006/main" noChangeAspect="1"/>
+            </wp:cNvGraphicFramePr>
+            <a:graphic xmlns:a="http://schemas.openxmlformats.org/drawingml/2006/main">
+              <a:graphicData uri="http://schemas.openxmlformats.org/drawingml/2006/picture">
+                <pic:pic xmlns:pic="http://schemas.openxmlformats.org/drawingml/2006/picture">
+                  <pic:nvPicPr>
+                    <pic:cNvPr id="1444867707" name=""/>
+                    <pic:cNvPicPr/>
+                  </pic:nvPicPr>
+                  <pic:blipFill>
+                    <a:blip r:embed="rId21"/>
+                    <a:stretch>
+                      <a:fillRect/>
+                    </a:stretch>
+                  </pic:blipFill>
+                  <pic:spPr>
+                    <a:xfrm>
+                      <a:off x="0" y="0"/>
+                      <a:ext cx="5943600" cy="3731260"/>
+                    </a:xfrm>
+                    <a:prstGeom prst="rect">
+                      <a:avLst/>
+                    </a:prstGeom>
+                  </pic:spPr>
+                </pic:pic>
+              </a:graphicData>
+            </a:graphic>
+          </wp:inline>
+        </w:drawing>
+      </w:r>
+    </w:p>
+    <w:p>
+      <w:pPr>
+        <w:tabs>
+          <w:tab w:val="left" w:pos="3116"/>
+        </w:tabs>
+        <w:rPr>
+          <w:bCs/>
+          <w:sz w:val="26"/>
+          <w:szCs w:val="26"/>
+          <w:lang w:val="vi-VN"/>
+        </w:rPr>
+      </w:pPr>
+      <w:r>
+        <w:rPr>
+          <w:bCs/>
+          <w:sz w:val="26"/>
+          <w:szCs w:val="26"/>
+          <w:lang w:val="vi-VN"/>
+        </w:rPr>
+        <w:t xml:space="preserve">Câu 4 </w:t>
+      </w:r>
+    </w:p>
+    <w:p>
+      <w:pPr>
+        <w:tabs>
+          <w:tab w:val="left" w:pos="3116"/>
+        </w:tabs>
+        <w:rPr>
+          <w:bCs/>
+          <w:sz w:val="26"/>
+          <w:szCs w:val="26"/>
+          <w:lang w:val="vi-VN"/>
+        </w:rPr>
+      </w:pPr>
+      <w:r>
+        <w:rPr>
+          <w:bCs/>
+          <w:sz w:val="26"/>
+          <w:szCs w:val="26"/>
+          <w:lang w:val="vi-VN"/>
+        </w:rPr>
+        <w:t>Trường hợp 1: Từ PC3 (Area 2) gửi sang PC1 (Area 1)</w:t>
+      </w:r>
+    </w:p>
+    <w:p>
+      <w:pPr>
+        <w:tabs>
+          <w:tab w:val="left" w:pos="3116"/>
+        </w:tabs>
+        <w:rPr>
+          <w:bCs/>
+          <w:sz w:val="26"/>
+          <w:szCs w:val="26"/>
+          <w:lang w:val="vi-VN"/>
+        </w:rPr>
+      </w:pPr>
+      <w:r>
+        <w:rPr>
+          <w:bCs/>
+          <w:sz w:val="26"/>
+          <w:szCs w:val="26"/>
+          <w:lang w:val="vi-VN"/>
+        </w:rPr>
+        <w:lastRenderedPageBreak/>
+        <w:t>Lộ trình gói tin: PC3 -&gt; BB2 -&gt; R2 -&gt; R1 -&gt; BB1 -&gt; PC1.</w:t>
+      </w:r>
+    </w:p>
+    <w:p>
+      <w:pPr>
+        <w:tabs>
+          <w:tab w:val="left" w:pos="3116"/>
+        </w:tabs>
+        <w:rPr>
+          <w:bCs/>
+          <w:sz w:val="26"/>
+          <w:szCs w:val="26"/>
+          <w:lang w:val="vi-VN"/>
+        </w:rPr>
+      </w:pPr>
+      <w:r>
+        <w:rPr>
+          <w:bCs/>
+          <w:sz w:val="26"/>
+          <w:szCs w:val="26"/>
+          <w:lang w:val="vi-VN"/>
+        </w:rPr>
+        <w:t>- Giải thích: Vì đây là giao tiếp liên vùng (Inter-Area), gói tin bắt buộc phải rời khỏi Area 2 (qua BB2), đi vào Area 0 (qua R2), di chuyển trong Area 0 (đến R1), sau đó chui xuống Area 1 (qua BB1) và đến máy đích PC1. Mọi truy cập ngoại vùng đều đi ngang qua Backbone Area 0.</w:t>
+      </w:r>
+    </w:p>
+    <w:p>
+      <w:pPr>
+        <w:tabs>
+          <w:tab w:val="left" w:pos="3116"/>
+        </w:tabs>
+        <w:rPr>
+          <w:bCs/>
+          <w:sz w:val="26"/>
+          <w:szCs w:val="26"/>
+          <w:lang w:val="vi-VN"/>
+        </w:rPr>
+      </w:pPr>
+    </w:p>
+    <w:p>
+      <w:pPr>
+        <w:tabs>
+          <w:tab w:val="left" w:pos="3116"/>
+        </w:tabs>
+        <w:rPr>
+          <w:bCs/>
+          <w:sz w:val="26"/>
+          <w:szCs w:val="26"/>
+          <w:lang w:val="vi-VN"/>
+        </w:rPr>
+      </w:pPr>
+      <w:r>
+        <w:rPr>
+          <w:bCs/>
+          <w:sz w:val="26"/>
+          <w:szCs w:val="26"/>
+          <w:lang w:val="vi-VN"/>
+        </w:rPr>
+        <w:t>Trường hợp 2: Từ PC3 (Area 2) gửi sang PC4 (Area 3)</w:t>
+      </w:r>
+    </w:p>
+    <w:p>
+      <w:pPr>
+        <w:tabs>
+          <w:tab w:val="left" w:pos="3116"/>
+        </w:tabs>
+        <w:rPr>
+          <w:bCs/>
+          <w:sz w:val="26"/>
+          <w:szCs w:val="26"/>
+          <w:lang w:val="vi-VN"/>
+        </w:rPr>
+      </w:pPr>
+      <w:r>
+        <w:rPr>
+          <w:bCs/>
+          <w:sz w:val="26"/>
+          <w:szCs w:val="26"/>
+          <w:lang w:val="vi-VN"/>
+        </w:rPr>
+        <w:t>Lộ trình gói tin: PC3 -&gt; BB2 -&gt; R2 -&gt; R3 -&gt; BB3 -&gt; PC4.</w:t>
+      </w:r>
+    </w:p>
+    <w:p>
+      <w:pPr>
+        <w:tabs>
+          <w:tab w:val="left" w:pos="3116"/>
+        </w:tabs>
+        <w:rPr>
+          <w:bCs/>
+          <w:sz w:val="26"/>
+          <w:szCs w:val="26"/>
+          <w:lang w:val="vi-VN"/>
+        </w:rPr>
+      </w:pPr>
+      <w:r>
+        <w:rPr>
+          <w:bCs/>
+          <w:sz w:val="26"/>
+          <w:szCs w:val="26"/>
+          <w:lang w:val="vi-VN"/>
+        </w:rPr>
+        <w:t>- Giải thích: Mặc dù Router R2 và R3 được kết nối trực tiếp với nhau thông qua mạng LAN 192.168.1.64/28, gói tin vẫn phải đi qua liên kết này. Liên kết giữa R2 và R3 thực chất thuộc về Area 0. Do đó, gói tin từ Area 2 vào R2 (ABR), đi ngang qua Area 0 (tới R3), rồi từ R3 (ABR) đẩy xuống Area 3 (tới BB3 và PC4). Hoạt động này hoàn toàn tuân thủ quy tắc chống Loop (chống lặp vòng) của OSPF Đa Vùng bằng kiến trúc Hub-and-Spoke.</w:t>
+      </w:r>
+    </w:p>
+    <w:p>
+      <w:pPr>
+        <w:tabs>
+          <w:tab w:val="left" w:pos="3116"/>
+        </w:tabs>
+        <w:rPr>
+          <w:bCs/>
+          <w:sz w:val="26"/>
+          <w:szCs w:val="26"/>
+          <w:lang w:val="vi-VN"/>
+        </w:rPr>
+      </w:pPr>
+      <w:r>
+        <w:rPr>
+          <w:bCs/>
+          <w:sz w:val="26"/>
+          <w:szCs w:val="26"/>
+          <w:lang w:val="vi-VN"/>
+        </w:rPr>
+        <w:drawing>
+          <wp:inline distT="0" distB="0" distL="0" distR="0" wp14:anchorId="485D4FBE" wp14:editId="08E9D643">
+            <wp:extent cx="5943600" cy="3771265"/>
+            <wp:effectExtent l="0" t="0" r="0" b="635"/>
+            <wp:docPr id="86409278" name="Picture 1"/>
+            <wp:cNvGraphicFramePr>
+              <a:graphicFrameLocks xmlns:a="http://schemas.openxmlformats.org/drawingml/2006/main" noChangeAspect="1"/>
+            </wp:cNvGraphicFramePr>
+            <a:graphic xmlns:a="http://schemas.openxmlformats.org/drawingml/2006/main">
+              <a:graphicData uri="http://schemas.openxmlformats.org/drawingml/2006/picture">
+                <pic:pic xmlns:pic="http://schemas.openxmlformats.org/drawingml/2006/picture">
+                  <pic:nvPicPr>
+                    <pic:cNvPr id="86409278" name=""/>
+                    <pic:cNvPicPr/>
+                  </pic:nvPicPr>
+                  <pic:blipFill>
+                    <a:blip r:embed="rId22"/>
+                    <a:stretch>
+                      <a:fillRect/>
+                    </a:stretch>
+                  </pic:blipFill>
+                  <pic:spPr>
+                    <a:xfrm>
+                      <a:off x="0" y="0"/>
+                      <a:ext cx="5943600" cy="3771265"/>
+                    </a:xfrm>
+                    <a:prstGeom prst="rect">
+                      <a:avLst/>
+                    </a:prstGeom>
+                  </pic:spPr>
+                </pic:pic>
+              </a:graphicData>
+            </a:graphic>
+          </wp:inline>
+        </w:drawing>
+      </w:r>
+    </w:p>
+    <w:p>
+      <w:pPr>
+        <w:tabs>
+          <w:tab w:val="left" w:pos="3116"/>
+        </w:tabs>
+        <w:rPr>
+          <w:bCs/>
+          <w:sz w:val="26"/>
+          <w:szCs w:val="26"/>
+          <w:lang w:val="vi-VN"/>
+        </w:rPr>
+      </w:pPr>
+    </w:p>
+    <w:p>
+      <w:pPr>
+        <w:tabs>
+          <w:tab w:val="left" w:pos="3116"/>
+        </w:tabs>
+        <w:rPr>
+          <w:bCs/>
+          <w:sz w:val="26"/>
+          <w:szCs w:val="26"/>
+          <w:lang w:val="vi-VN"/>
+        </w:rPr>
+      </w:pPr>
+      <w:r>
+        <w:rPr>
+          <w:bCs/>
+          <w:sz w:val="26"/>
+          <w:szCs w:val="26"/>
+          <w:lang w:val="vi-VN"/>
+        </w:rPr>
+        <w:t>Bài 4</w:t>
+      </w:r>
+    </w:p>
+    <w:p>
+      <w:pPr>
+        <w:tabs>
+          <w:tab w:val="left" w:pos="3116"/>
+        </w:tabs>
+        <w:rPr>
+          <w:bCs/>
+          <w:sz w:val="26"/>
+          <w:szCs w:val="26"/>
+          <w:lang w:val="vi-VN"/>
+        </w:rPr>
+      </w:pPr>
+    </w:p>
+    <w:p>
+      <w:pPr>
+        <w:tabs>
+          <w:tab w:val="left" w:pos="3116"/>
+        </w:tabs>
+        <w:rPr>
+          <w:bCs/>
+          <w:sz w:val="26"/>
+          <w:szCs w:val="26"/>
+          <w:lang w:val="vi-VN"/>
+        </w:rPr>
+      </w:pPr>
+      <w:r>
+        <w:rPr>
+          <w:bCs/>
+          <w:sz w:val="26"/>
+          <w:szCs w:val="26"/>
+          <w:lang w:val="vi-VN"/>
+        </w:rPr>
+        <w:lastRenderedPageBreak/>
+        <w:drawing>
+          <wp:inline distT="0" distB="0" distL="0" distR="0" wp14:anchorId="0501EEC2" wp14:editId="633E0A72">
+            <wp:extent cx="5943600" cy="3889375"/>
+            <wp:effectExtent l="0" t="0" r="0" b="0"/>
+            <wp:docPr id="203540394" name="Picture 1"/>
+            <wp:cNvGraphicFramePr>
+              <a:graphicFrameLocks xmlns:a="http://schemas.openxmlformats.org/drawingml/2006/main" noChangeAspect="1"/>
+            </wp:cNvGraphicFramePr>
+            <a:graphic xmlns:a="http://schemas.openxmlformats.org/drawingml/2006/main">
+              <a:graphicData uri="http://schemas.openxmlformats.org/drawingml/2006/picture">
+                <pic:pic xmlns:pic="http://schemas.openxmlformats.org/drawingml/2006/picture">
+                  <pic:nvPicPr>
+                    <pic:cNvPr id="203540394" name=""/>
+                    <pic:cNvPicPr/>
+                  </pic:nvPicPr>
+                  <pic:blipFill>
+                    <a:blip r:embed="rId23"/>
+                    <a:stretch>
+                      <a:fillRect/>
+                    </a:stretch>
+                  </pic:blipFill>
+                  <pic:spPr>
+                    <a:xfrm>
+                      <a:off x="0" y="0"/>
+                      <a:ext cx="5943600" cy="3889375"/>
+                    </a:xfrm>
+                    <a:prstGeom prst="rect">
+                      <a:avLst/>
+                    </a:prstGeom>
+                  </pic:spPr>
+                </pic:pic>
+              </a:graphicData>
+            </a:graphic>
+          </wp:inline>
+        </w:drawing>
+      </w:r>
+    </w:p>
+    <w:p>
+      <w:pPr>
+        <w:tabs>
+          <w:tab w:val="left" w:pos="3116"/>
+        </w:tabs>
+        <w:rPr>
+          <w:bCs/>
+          <w:sz w:val="26"/>
+          <w:szCs w:val="26"/>
+          <w:lang w:val="vi-VN"/>
+        </w:rPr>
+      </w:pPr>
+      <w:r>
+        <w:rPr>
+          <w:bCs/>
+          <w:sz w:val="26"/>
+          <w:szCs w:val="26"/>
+          <w:lang w:val="vi-VN"/>
+        </w:rPr>
+        <w:lastRenderedPageBreak/>
+        <w:drawing>
+          <wp:inline distT="0" distB="0" distL="0" distR="0" wp14:anchorId="5039F5DD" wp14:editId="0CBEA657">
+            <wp:extent cx="5943600" cy="4604385"/>
+            <wp:effectExtent l="0" t="0" r="0" b="5715"/>
+            <wp:docPr id="1020102433" name="Picture 1"/>
+            <wp:cNvGraphicFramePr>
+              <a:graphicFrameLocks xmlns:a="http://schemas.openxmlformats.org/drawingml/2006/main" noChangeAspect="1"/>
+            </wp:cNvGraphicFramePr>
+            <a:graphic xmlns:a="http://schemas.openxmlformats.org/drawingml/2006/main">
+              <a:graphicData uri="http://schemas.openxmlformats.org/drawingml/2006/picture">
+                <pic:pic xmlns:pic="http://schemas.openxmlformats.org/drawingml/2006/picture">
+                  <pic:nvPicPr>
+                    <pic:cNvPr id="1020102433" name=""/>
+                    <pic:cNvPicPr/>
+                  </pic:nvPicPr>
+                  <pic:blipFill>
+                    <a:blip r:embed="rId24"/>
+                    <a:stretch>
+                      <a:fillRect/>
+                    </a:stretch>
+                  </pic:blipFill>
+                  <pic:spPr>
+                    <a:xfrm>
+                      <a:off x="0" y="0"/>
+                      <a:ext cx="5943600" cy="4604385"/>
+                    </a:xfrm>
+                    <a:prstGeom prst="rect">
+                      <a:avLst/>
+                    </a:prstGeom>
+                  </pic:spPr>
+                </pic:pic>
+              </a:graphicData>
+            </a:graphic>
+          </wp:inline>
+        </w:drawing>
       </w:r>
     </w:p>
     <w:p>
@@ -3237,8 +7344,8 @@
           <w:lang w:val="vi-VN"/>
         </w:rPr>
         <w:sectPr>
-          <w:headerReference w:type="default" r:id="rId13"/>
-          <w:footerReference w:type="default" r:id="rId14"/>
+          <w:headerReference w:type="default" r:id="rId25"/>
+          <w:footerReference w:type="default" r:id="rId26"/>
           <w:pgSz w:w="12240" w:h="15840"/>
           <w:pgMar w:top="1080" w:right="1440" w:bottom="1440" w:left="1440" w:header="720" w:footer="720" w:gutter="0"/>
           <w:cols w:space="720"/>
@@ -3255,7 +7362,7 @@
       </w:pPr>
     </w:p>
     <w:sectPr>
-      <w:footerReference w:type="default" r:id="rId15"/>
+      <w:footerReference w:type="default" r:id="rId27"/>
       <w:pgSz w:w="12240" w:h="15840"/>
       <w:pgMar w:top="1080" w:right="1440" w:bottom="1440" w:left="1440" w:header="720" w:footer="720" w:gutter="0"/>
       <w:pgNumType w:start="1"/>

</xml_diff>

<commit_message>
Please provide the changes or files you would like summarized so I can generate the commit message for you.
</commit_message>
<xml_diff>
--- a/iuh/môn/hkh-4/dinhTuyenChuyenMach/lab/lab3/lab3-LeThanhLong.docx
+++ b/iuh/môn/hkh-4/dinhTuyenChuyenMach/lab/lab3/lab3-LeThanhLong.docx
@@ -433,7 +433,6 @@
         <w:t xml:space="preserve">Student’s </w:t>
       </w:r>
       <w:proofErr w:type="spellStart"/>
-      <w:proofErr w:type="gramStart"/>
       <w:r>
         <w:rPr>
           <w:bCs/>
@@ -451,7 +450,6 @@
         <w:t>Lê</w:t>
       </w:r>
       <w:proofErr w:type="spellEnd"/>
-      <w:proofErr w:type="gramEnd"/>
       <w:r>
         <w:rPr>
           <w:bCs/>
@@ -522,7 +520,6 @@
         </w:rPr>
       </w:pPr>
       <w:proofErr w:type="spellStart"/>
-      <w:proofErr w:type="gramStart"/>
       <w:r>
         <w:rPr>
           <w:bCs/>
@@ -540,7 +537,6 @@
         <w:t>định</w:t>
       </w:r>
       <w:proofErr w:type="spellEnd"/>
-      <w:proofErr w:type="gramEnd"/>
       <w:r>
         <w:rPr>
           <w:bCs/>
@@ -731,7 +727,7 @@
           <w:sz w:val="26"/>
           <w:szCs w:val="26"/>
         </w:rPr>
-        <w:t>Mon 06/07/2026</w:t>
+        <w:t>Sat 11/07/2026</w:t>
       </w:r>
       <w:r>
         <w:rPr>
@@ -1310,25 +1306,7 @@
           <w:sz w:val="26"/>
           <w:szCs w:val="26"/>
         </w:rPr>
-        <w:t xml:space="preserve"> </w:t>
-      </w:r>
-      <w:proofErr w:type="spellStart"/>
-      <w:r>
-        <w:rPr>
-          <w:bCs/>
-          <w:sz w:val="26"/>
-          <w:szCs w:val="26"/>
-        </w:rPr>
-        <w:t>bài</w:t>
-      </w:r>
-      <w:proofErr w:type="spellEnd"/>
-      <w:r>
-        <w:rPr>
-          <w:bCs/>
-          <w:sz w:val="26"/>
-          <w:szCs w:val="26"/>
-        </w:rPr>
-        <w:t xml:space="preserve"> lab:</w:t>
+        <w:t xml:space="preserve"> bài lab:</w:t>
       </w:r>
       <w:r>
         <w:rPr>
@@ -1583,6 +1561,7 @@
       <w:r>
         <w:rPr>
           <w:bCs/>
+          <w:noProof/>
           <w:sz w:val="26"/>
           <w:szCs w:val="26"/>
           <w:lang w:val="vi-VN"/>
@@ -1639,6 +1618,7 @@
       <w:r>
         <w:rPr>
           <w:bCs/>
+          <w:noProof/>
           <w:sz w:val="26"/>
           <w:szCs w:val="26"/>
           <w:lang w:val="vi-VN"/>
@@ -3460,6 +3440,7 @@
       <w:r>
         <w:rPr>
           <w:bCs/>
+          <w:noProof/>
           <w:sz w:val="26"/>
           <w:szCs w:val="26"/>
           <w:lang w:val="vi-VN"/>
@@ -3729,6 +3710,7 @@
       <w:r>
         <w:rPr>
           <w:bCs/>
+          <w:noProof/>
           <w:sz w:val="26"/>
           <w:szCs w:val="26"/>
           <w:lang w:val="vi-VN"/>
@@ -3798,6 +3780,7 @@
       <w:r>
         <w:rPr>
           <w:bCs/>
+          <w:noProof/>
           <w:sz w:val="26"/>
           <w:szCs w:val="26"/>
           <w:lang w:val="vi-VN"/>
@@ -3903,6 +3886,7 @@
       <w:r>
         <w:rPr>
           <w:bCs/>
+          <w:noProof/>
           <w:sz w:val="26"/>
           <w:szCs w:val="26"/>
           <w:lang w:val="vi-VN"/>
@@ -3947,6 +3931,7 @@
       <w:r>
         <w:rPr>
           <w:bCs/>
+          <w:noProof/>
           <w:sz w:val="26"/>
           <w:szCs w:val="26"/>
           <w:lang w:val="vi-VN"/>
@@ -6344,6 +6329,7 @@
       <w:r>
         <w:rPr>
           <w:bCs/>
+          <w:noProof/>
           <w:sz w:val="26"/>
           <w:szCs w:val="26"/>
           <w:lang w:val="vi-VN"/>
@@ -6892,6 +6878,7 @@
       <w:r>
         <w:rPr>
           <w:bCs/>
+          <w:noProof/>
           <w:sz w:val="26"/>
           <w:szCs w:val="26"/>
           <w:lang w:val="vi-VN"/>
@@ -7116,6 +7103,7 @@
       <w:r>
         <w:rPr>
           <w:bCs/>
+          <w:noProof/>
           <w:sz w:val="26"/>
           <w:szCs w:val="26"/>
           <w:lang w:val="vi-VN"/>
@@ -7214,12 +7202,12 @@
           <w:bCs/>
           <w:sz w:val="26"/>
           <w:szCs w:val="26"/>
-          <w:lang w:val="vi-VN"/>
-        </w:rPr>
-      </w:pPr>
-      <w:r>
-        <w:rPr>
-          <w:bCs/>
+        </w:rPr>
+      </w:pPr>
+      <w:r>
+        <w:rPr>
+          <w:bCs/>
+          <w:noProof/>
           <w:sz w:val="26"/>
           <w:szCs w:val="26"/>
           <w:lang w:val="vi-VN"/>
@@ -7271,12 +7259,37 @@
           <w:bCs/>
           <w:sz w:val="26"/>
           <w:szCs w:val="26"/>
-          <w:lang w:val="vi-VN"/>
-        </w:rPr>
-      </w:pPr>
-      <w:r>
-        <w:rPr>
-          <w:bCs/>
+        </w:rPr>
+      </w:pPr>
+    </w:p>
+    <w:p>
+      <w:pPr>
+        <w:tabs>
+          <w:tab w:val="left" w:pos="3116"/>
+        </w:tabs>
+        <w:rPr>
+          <w:bCs/>
+          <w:sz w:val="26"/>
+          <w:szCs w:val="26"/>
+        </w:rPr>
+      </w:pPr>
+    </w:p>
+    <w:p>
+      <w:pPr>
+        <w:tabs>
+          <w:tab w:val="left" w:pos="3116"/>
+        </w:tabs>
+        <w:rPr>
+          <w:bCs/>
+          <w:sz w:val="26"/>
+          <w:szCs w:val="26"/>
+          <w:lang w:val="vi-VN"/>
+        </w:rPr>
+      </w:pPr>
+      <w:r>
+        <w:rPr>
+          <w:bCs/>
+          <w:noProof/>
           <w:sz w:val="26"/>
           <w:szCs w:val="26"/>
           <w:lang w:val="vi-VN"/>
@@ -7343,15 +7356,3601 @@
           <w:szCs w:val="26"/>
           <w:lang w:val="vi-VN"/>
         </w:rPr>
+      </w:pPr>
+      <w:r>
+        <w:rPr>
+          <w:bCs/>
+          <w:sz w:val="26"/>
+          <w:szCs w:val="26"/>
+          <w:lang w:val="vi-VN"/>
+        </w:rPr>
+        <w:t>========== RAW CONFIGURATION COMMANDS ==========</w:t>
+      </w:r>
+    </w:p>
+    <w:p>
+      <w:pPr>
+        <w:tabs>
+          <w:tab w:val="left" w:pos="3116"/>
+        </w:tabs>
+        <w:rPr>
+          <w:bCs/>
+          <w:sz w:val="26"/>
+          <w:szCs w:val="26"/>
+          <w:lang w:val="vi-VN"/>
+        </w:rPr>
+      </w:pPr>
+    </w:p>
+    <w:p>
+      <w:pPr>
+        <w:tabs>
+          <w:tab w:val="left" w:pos="3116"/>
+        </w:tabs>
+        <w:rPr>
+          <w:bCs/>
+          <w:sz w:val="26"/>
+          <w:szCs w:val="26"/>
+          <w:lang w:val="vi-VN"/>
+        </w:rPr>
+      </w:pPr>
+      <w:r>
+        <w:rPr>
+          <w:bCs/>
+          <w:sz w:val="26"/>
+          <w:szCs w:val="26"/>
+          <w:lang w:val="vi-VN"/>
+        </w:rPr>
+        <w:t>========== Tên thiết bị: R1 (router) ==========</w:t>
+      </w:r>
+    </w:p>
+    <w:p>
+      <w:pPr>
+        <w:tabs>
+          <w:tab w:val="left" w:pos="3116"/>
+        </w:tabs>
+        <w:rPr>
+          <w:bCs/>
+          <w:sz w:val="26"/>
+          <w:szCs w:val="26"/>
+          <w:lang w:val="vi-VN"/>
+        </w:rPr>
+      </w:pPr>
+      <w:r>
+        <w:rPr>
+          <w:bCs/>
+          <w:sz w:val="26"/>
+          <w:szCs w:val="26"/>
+          <w:lang w:val="vi-VN"/>
+        </w:rPr>
+        <w:t>enable</w:t>
+      </w:r>
+    </w:p>
+    <w:p>
+      <w:pPr>
+        <w:tabs>
+          <w:tab w:val="left" w:pos="3116"/>
+        </w:tabs>
+        <w:rPr>
+          <w:bCs/>
+          <w:sz w:val="26"/>
+          <w:szCs w:val="26"/>
+          <w:lang w:val="vi-VN"/>
+        </w:rPr>
+      </w:pPr>
+      <w:r>
+        <w:rPr>
+          <w:bCs/>
+          <w:sz w:val="26"/>
+          <w:szCs w:val="26"/>
+          <w:lang w:val="vi-VN"/>
+        </w:rPr>
+        <w:t>configure terminal</w:t>
+      </w:r>
+    </w:p>
+    <w:p>
+      <w:pPr>
+        <w:tabs>
+          <w:tab w:val="left" w:pos="3116"/>
+        </w:tabs>
+        <w:rPr>
+          <w:bCs/>
+          <w:sz w:val="26"/>
+          <w:szCs w:val="26"/>
+          <w:lang w:val="vi-VN"/>
+        </w:rPr>
+      </w:pPr>
+      <w:r>
+        <w:rPr>
+          <w:bCs/>
+          <w:sz w:val="26"/>
+          <w:szCs w:val="26"/>
+          <w:lang w:val="vi-VN"/>
+        </w:rPr>
+        <w:t>interface e0/0</w:t>
+      </w:r>
+    </w:p>
+    <w:p>
+      <w:pPr>
+        <w:tabs>
+          <w:tab w:val="left" w:pos="3116"/>
+        </w:tabs>
+        <w:rPr>
+          <w:bCs/>
+          <w:sz w:val="26"/>
+          <w:szCs w:val="26"/>
+          <w:lang w:val="vi-VN"/>
+        </w:rPr>
+      </w:pPr>
+      <w:r>
+        <w:rPr>
+          <w:bCs/>
+          <w:sz w:val="26"/>
+          <w:szCs w:val="26"/>
+          <w:lang w:val="vi-VN"/>
+        </w:rPr>
+        <w:t>ip address 192.168.123.1 255.255.255.0</w:t>
+      </w:r>
+    </w:p>
+    <w:p>
+      <w:pPr>
+        <w:tabs>
+          <w:tab w:val="left" w:pos="3116"/>
+        </w:tabs>
+        <w:rPr>
+          <w:bCs/>
+          <w:sz w:val="26"/>
+          <w:szCs w:val="26"/>
+          <w:lang w:val="vi-VN"/>
+        </w:rPr>
+      </w:pPr>
+      <w:r>
+        <w:rPr>
+          <w:bCs/>
+          <w:sz w:val="26"/>
+          <w:szCs w:val="26"/>
+          <w:lang w:val="vi-VN"/>
+        </w:rPr>
+        <w:t>ip ospf cost 74</w:t>
+      </w:r>
+    </w:p>
+    <w:p>
+      <w:pPr>
+        <w:tabs>
+          <w:tab w:val="left" w:pos="3116"/>
+        </w:tabs>
+        <w:rPr>
+          <w:bCs/>
+          <w:sz w:val="26"/>
+          <w:szCs w:val="26"/>
+          <w:lang w:val="vi-VN"/>
+        </w:rPr>
+      </w:pPr>
+      <w:r>
+        <w:rPr>
+          <w:bCs/>
+          <w:sz w:val="26"/>
+          <w:szCs w:val="26"/>
+          <w:lang w:val="vi-VN"/>
+        </w:rPr>
+        <w:t>ip ospf authentication message-digest</w:t>
+      </w:r>
+    </w:p>
+    <w:p>
+      <w:pPr>
+        <w:tabs>
+          <w:tab w:val="left" w:pos="3116"/>
+        </w:tabs>
+        <w:rPr>
+          <w:bCs/>
+          <w:sz w:val="26"/>
+          <w:szCs w:val="26"/>
+          <w:lang w:val="vi-VN"/>
+        </w:rPr>
+      </w:pPr>
+      <w:r>
+        <w:rPr>
+          <w:bCs/>
+          <w:sz w:val="26"/>
+          <w:szCs w:val="26"/>
+          <w:lang w:val="vi-VN"/>
+        </w:rPr>
+        <w:t>ip ospf message-digest-key 1 md5 cisco</w:t>
+      </w:r>
+    </w:p>
+    <w:p>
+      <w:pPr>
+        <w:tabs>
+          <w:tab w:val="left" w:pos="3116"/>
+        </w:tabs>
+        <w:rPr>
+          <w:bCs/>
+          <w:sz w:val="26"/>
+          <w:szCs w:val="26"/>
+          <w:lang w:val="vi-VN"/>
+        </w:rPr>
+      </w:pPr>
+      <w:r>
+        <w:rPr>
+          <w:bCs/>
+          <w:sz w:val="26"/>
+          <w:szCs w:val="26"/>
+          <w:lang w:val="vi-VN"/>
+        </w:rPr>
+        <w:t>no shutdown</w:t>
+      </w:r>
+    </w:p>
+    <w:p>
+      <w:pPr>
+        <w:tabs>
+          <w:tab w:val="left" w:pos="3116"/>
+        </w:tabs>
+        <w:rPr>
+          <w:bCs/>
+          <w:sz w:val="26"/>
+          <w:szCs w:val="26"/>
+          <w:lang w:val="vi-VN"/>
+        </w:rPr>
+      </w:pPr>
+      <w:r>
+        <w:rPr>
+          <w:bCs/>
+          <w:sz w:val="26"/>
+          <w:szCs w:val="26"/>
+          <w:lang w:val="vi-VN"/>
+        </w:rPr>
+        <w:lastRenderedPageBreak/>
+        <w:t>interface s1/0</w:t>
+      </w:r>
+    </w:p>
+    <w:p>
+      <w:pPr>
+        <w:tabs>
+          <w:tab w:val="left" w:pos="3116"/>
+        </w:tabs>
+        <w:rPr>
+          <w:bCs/>
+          <w:sz w:val="26"/>
+          <w:szCs w:val="26"/>
+          <w:lang w:val="vi-VN"/>
+        </w:rPr>
+      </w:pPr>
+      <w:r>
+        <w:rPr>
+          <w:bCs/>
+          <w:sz w:val="26"/>
+          <w:szCs w:val="26"/>
+          <w:lang w:val="vi-VN"/>
+        </w:rPr>
+        <w:t>ip address 192.168.12.1 255.255.255.0</w:t>
+      </w:r>
+    </w:p>
+    <w:p>
+      <w:pPr>
+        <w:tabs>
+          <w:tab w:val="left" w:pos="3116"/>
+        </w:tabs>
+        <w:rPr>
+          <w:bCs/>
+          <w:sz w:val="26"/>
+          <w:szCs w:val="26"/>
+          <w:lang w:val="vi-VN"/>
+        </w:rPr>
+      </w:pPr>
+      <w:r>
+        <w:rPr>
+          <w:bCs/>
+          <w:sz w:val="26"/>
+          <w:szCs w:val="26"/>
+          <w:lang w:val="vi-VN"/>
+        </w:rPr>
+        <w:t>no shutdown</w:t>
+      </w:r>
+    </w:p>
+    <w:p>
+      <w:pPr>
+        <w:tabs>
+          <w:tab w:val="left" w:pos="3116"/>
+        </w:tabs>
+        <w:rPr>
+          <w:bCs/>
+          <w:sz w:val="26"/>
+          <w:szCs w:val="26"/>
+          <w:lang w:val="vi-VN"/>
+        </w:rPr>
+      </w:pPr>
+      <w:r>
+        <w:rPr>
+          <w:bCs/>
+          <w:sz w:val="26"/>
+          <w:szCs w:val="26"/>
+          <w:lang w:val="vi-VN"/>
+        </w:rPr>
+        <w:t>interface e0/1</w:t>
+      </w:r>
+    </w:p>
+    <w:p>
+      <w:pPr>
+        <w:tabs>
+          <w:tab w:val="left" w:pos="3116"/>
+        </w:tabs>
+        <w:rPr>
+          <w:bCs/>
+          <w:sz w:val="26"/>
+          <w:szCs w:val="26"/>
+          <w:lang w:val="vi-VN"/>
+        </w:rPr>
+      </w:pPr>
+      <w:r>
+        <w:rPr>
+          <w:bCs/>
+          <w:sz w:val="26"/>
+          <w:szCs w:val="26"/>
+          <w:lang w:val="vi-VN"/>
+        </w:rPr>
+        <w:t>ip address 192.168.1.1 255.255.255.0</w:t>
+      </w:r>
+    </w:p>
+    <w:p>
+      <w:pPr>
+        <w:tabs>
+          <w:tab w:val="left" w:pos="3116"/>
+        </w:tabs>
+        <w:rPr>
+          <w:bCs/>
+          <w:sz w:val="26"/>
+          <w:szCs w:val="26"/>
+          <w:lang w:val="vi-VN"/>
+        </w:rPr>
+      </w:pPr>
+      <w:r>
+        <w:rPr>
+          <w:bCs/>
+          <w:sz w:val="26"/>
+          <w:szCs w:val="26"/>
+          <w:lang w:val="vi-VN"/>
+        </w:rPr>
+        <w:t>ip helper-address 192.168.123.3</w:t>
+      </w:r>
+    </w:p>
+    <w:p>
+      <w:pPr>
+        <w:tabs>
+          <w:tab w:val="left" w:pos="3116"/>
+        </w:tabs>
+        <w:rPr>
+          <w:bCs/>
+          <w:sz w:val="26"/>
+          <w:szCs w:val="26"/>
+          <w:lang w:val="vi-VN"/>
+        </w:rPr>
+      </w:pPr>
+      <w:r>
+        <w:rPr>
+          <w:bCs/>
+          <w:sz w:val="26"/>
+          <w:szCs w:val="26"/>
+          <w:lang w:val="vi-VN"/>
+        </w:rPr>
+        <w:t>no shutdown</w:t>
+      </w:r>
+    </w:p>
+    <w:p>
+      <w:pPr>
+        <w:tabs>
+          <w:tab w:val="left" w:pos="3116"/>
+        </w:tabs>
+        <w:rPr>
+          <w:bCs/>
+          <w:sz w:val="26"/>
+          <w:szCs w:val="26"/>
+          <w:lang w:val="vi-VN"/>
+        </w:rPr>
+      </w:pPr>
+      <w:r>
+        <w:rPr>
+          <w:bCs/>
+          <w:sz w:val="26"/>
+          <w:szCs w:val="26"/>
+          <w:lang w:val="vi-VN"/>
+        </w:rPr>
+        <w:t>router ospf 1</w:t>
+      </w:r>
+    </w:p>
+    <w:p>
+      <w:pPr>
+        <w:tabs>
+          <w:tab w:val="left" w:pos="3116"/>
+        </w:tabs>
+        <w:rPr>
+          <w:bCs/>
+          <w:sz w:val="26"/>
+          <w:szCs w:val="26"/>
+          <w:lang w:val="vi-VN"/>
+        </w:rPr>
+      </w:pPr>
+      <w:r>
+        <w:rPr>
+          <w:bCs/>
+          <w:sz w:val="26"/>
+          <w:szCs w:val="26"/>
+          <w:lang w:val="vi-VN"/>
+        </w:rPr>
+        <w:t>router-id 1.1.1.1</w:t>
+      </w:r>
+    </w:p>
+    <w:p>
+      <w:pPr>
+        <w:tabs>
+          <w:tab w:val="left" w:pos="3116"/>
+        </w:tabs>
+        <w:rPr>
+          <w:bCs/>
+          <w:sz w:val="26"/>
+          <w:szCs w:val="26"/>
+          <w:lang w:val="vi-VN"/>
+        </w:rPr>
+      </w:pPr>
+      <w:r>
+        <w:rPr>
+          <w:bCs/>
+          <w:sz w:val="26"/>
+          <w:szCs w:val="26"/>
+          <w:lang w:val="vi-VN"/>
+        </w:rPr>
+        <w:t>network 192.168.123.0 0.0.0.255 area 0</w:t>
+      </w:r>
+    </w:p>
+    <w:p>
+      <w:pPr>
+        <w:tabs>
+          <w:tab w:val="left" w:pos="3116"/>
+        </w:tabs>
+        <w:rPr>
+          <w:bCs/>
+          <w:sz w:val="26"/>
+          <w:szCs w:val="26"/>
+          <w:lang w:val="vi-VN"/>
+        </w:rPr>
+      </w:pPr>
+      <w:r>
+        <w:rPr>
+          <w:bCs/>
+          <w:sz w:val="26"/>
+          <w:szCs w:val="26"/>
+          <w:lang w:val="vi-VN"/>
+        </w:rPr>
+        <w:t>network 192.168.12.0 0.0.0.255 area 0</w:t>
+      </w:r>
+    </w:p>
+    <w:p>
+      <w:pPr>
+        <w:tabs>
+          <w:tab w:val="left" w:pos="3116"/>
+        </w:tabs>
+        <w:rPr>
+          <w:bCs/>
+          <w:sz w:val="26"/>
+          <w:szCs w:val="26"/>
+          <w:lang w:val="vi-VN"/>
+        </w:rPr>
+      </w:pPr>
+      <w:r>
+        <w:rPr>
+          <w:bCs/>
+          <w:sz w:val="26"/>
+          <w:szCs w:val="26"/>
+          <w:lang w:val="vi-VN"/>
+        </w:rPr>
+        <w:t>network 192.168.1.0 0.0.0.255 area 0</w:t>
+      </w:r>
+    </w:p>
+    <w:p>
+      <w:pPr>
+        <w:tabs>
+          <w:tab w:val="left" w:pos="3116"/>
+        </w:tabs>
+        <w:rPr>
+          <w:bCs/>
+          <w:sz w:val="26"/>
+          <w:szCs w:val="26"/>
+          <w:lang w:val="vi-VN"/>
+        </w:rPr>
+      </w:pPr>
+      <w:r>
+        <w:rPr>
+          <w:bCs/>
+          <w:sz w:val="26"/>
+          <w:szCs w:val="26"/>
+          <w:lang w:val="vi-VN"/>
+        </w:rPr>
+        <w:t>end</w:t>
+      </w:r>
+    </w:p>
+    <w:p>
+      <w:pPr>
+        <w:tabs>
+          <w:tab w:val="left" w:pos="3116"/>
+        </w:tabs>
+        <w:rPr>
+          <w:bCs/>
+          <w:sz w:val="26"/>
+          <w:szCs w:val="26"/>
+          <w:lang w:val="vi-VN"/>
+        </w:rPr>
+      </w:pPr>
+      <w:r>
+        <w:rPr>
+          <w:bCs/>
+          <w:sz w:val="26"/>
+          <w:szCs w:val="26"/>
+          <w:lang w:val="vi-VN"/>
+        </w:rPr>
+        <w:t>write memory</w:t>
+      </w:r>
+    </w:p>
+    <w:p>
+      <w:pPr>
+        <w:tabs>
+          <w:tab w:val="left" w:pos="3116"/>
+        </w:tabs>
+        <w:rPr>
+          <w:bCs/>
+          <w:sz w:val="26"/>
+          <w:szCs w:val="26"/>
+          <w:lang w:val="vi-VN"/>
+        </w:rPr>
+      </w:pPr>
+    </w:p>
+    <w:p>
+      <w:pPr>
+        <w:tabs>
+          <w:tab w:val="left" w:pos="3116"/>
+        </w:tabs>
+        <w:rPr>
+          <w:bCs/>
+          <w:sz w:val="26"/>
+          <w:szCs w:val="26"/>
+          <w:lang w:val="vi-VN"/>
+        </w:rPr>
+      </w:pPr>
+      <w:r>
+        <w:rPr>
+          <w:bCs/>
+          <w:sz w:val="26"/>
+          <w:szCs w:val="26"/>
+          <w:lang w:val="vi-VN"/>
+        </w:rPr>
+        <w:t>========== Tên thiết bị: R2 (router) ==========</w:t>
+      </w:r>
+    </w:p>
+    <w:p>
+      <w:pPr>
+        <w:tabs>
+          <w:tab w:val="left" w:pos="3116"/>
+        </w:tabs>
+        <w:rPr>
+          <w:bCs/>
+          <w:sz w:val="26"/>
+          <w:szCs w:val="26"/>
+          <w:lang w:val="vi-VN"/>
+        </w:rPr>
+      </w:pPr>
+      <w:r>
+        <w:rPr>
+          <w:bCs/>
+          <w:sz w:val="26"/>
+          <w:szCs w:val="26"/>
+          <w:lang w:val="vi-VN"/>
+        </w:rPr>
+        <w:t>enable</w:t>
+      </w:r>
+    </w:p>
+    <w:p>
+      <w:pPr>
+        <w:tabs>
+          <w:tab w:val="left" w:pos="3116"/>
+        </w:tabs>
+        <w:rPr>
+          <w:bCs/>
+          <w:sz w:val="26"/>
+          <w:szCs w:val="26"/>
+          <w:lang w:val="vi-VN"/>
+        </w:rPr>
+      </w:pPr>
+      <w:r>
+        <w:rPr>
+          <w:bCs/>
+          <w:sz w:val="26"/>
+          <w:szCs w:val="26"/>
+          <w:lang w:val="vi-VN"/>
+        </w:rPr>
+        <w:t>configure terminal</w:t>
+      </w:r>
+    </w:p>
+    <w:p>
+      <w:pPr>
+        <w:tabs>
+          <w:tab w:val="left" w:pos="3116"/>
+        </w:tabs>
+        <w:rPr>
+          <w:bCs/>
+          <w:sz w:val="26"/>
+          <w:szCs w:val="26"/>
+          <w:lang w:val="vi-VN"/>
+        </w:rPr>
+      </w:pPr>
+      <w:r>
+        <w:rPr>
+          <w:bCs/>
+          <w:sz w:val="26"/>
+          <w:szCs w:val="26"/>
+          <w:lang w:val="vi-VN"/>
+        </w:rPr>
+        <w:t>interface e0/0</w:t>
+      </w:r>
+    </w:p>
+    <w:p>
+      <w:pPr>
+        <w:tabs>
+          <w:tab w:val="left" w:pos="3116"/>
+        </w:tabs>
+        <w:rPr>
+          <w:bCs/>
+          <w:sz w:val="26"/>
+          <w:szCs w:val="26"/>
+          <w:lang w:val="vi-VN"/>
+        </w:rPr>
+      </w:pPr>
+      <w:r>
+        <w:rPr>
+          <w:bCs/>
+          <w:sz w:val="26"/>
+          <w:szCs w:val="26"/>
+          <w:lang w:val="vi-VN"/>
+        </w:rPr>
+        <w:t>ip address 192.168.123.2 255.255.255.0</w:t>
+      </w:r>
+    </w:p>
+    <w:p>
+      <w:pPr>
+        <w:tabs>
+          <w:tab w:val="left" w:pos="3116"/>
+        </w:tabs>
+        <w:rPr>
+          <w:bCs/>
+          <w:sz w:val="26"/>
+          <w:szCs w:val="26"/>
+          <w:lang w:val="vi-VN"/>
+        </w:rPr>
+      </w:pPr>
+      <w:r>
+        <w:rPr>
+          <w:bCs/>
+          <w:sz w:val="26"/>
+          <w:szCs w:val="26"/>
+          <w:lang w:val="vi-VN"/>
+        </w:rPr>
+        <w:t>ip ospf authentication message-digest</w:t>
+      </w:r>
+    </w:p>
+    <w:p>
+      <w:pPr>
+        <w:tabs>
+          <w:tab w:val="left" w:pos="3116"/>
+        </w:tabs>
+        <w:rPr>
+          <w:bCs/>
+          <w:sz w:val="26"/>
+          <w:szCs w:val="26"/>
+          <w:lang w:val="vi-VN"/>
+        </w:rPr>
+      </w:pPr>
+      <w:r>
+        <w:rPr>
+          <w:bCs/>
+          <w:sz w:val="26"/>
+          <w:szCs w:val="26"/>
+          <w:lang w:val="vi-VN"/>
+        </w:rPr>
+        <w:t>ip ospf message-digest-key 1 md5 cisco</w:t>
+      </w:r>
+    </w:p>
+    <w:p>
+      <w:pPr>
+        <w:tabs>
+          <w:tab w:val="left" w:pos="3116"/>
+        </w:tabs>
+        <w:rPr>
+          <w:bCs/>
+          <w:sz w:val="26"/>
+          <w:szCs w:val="26"/>
+          <w:lang w:val="vi-VN"/>
+        </w:rPr>
+      </w:pPr>
+      <w:r>
+        <w:rPr>
+          <w:bCs/>
+          <w:sz w:val="26"/>
+          <w:szCs w:val="26"/>
+          <w:lang w:val="vi-VN"/>
+        </w:rPr>
+        <w:t>no shutdown</w:t>
+      </w:r>
+    </w:p>
+    <w:p>
+      <w:pPr>
+        <w:tabs>
+          <w:tab w:val="left" w:pos="3116"/>
+        </w:tabs>
+        <w:rPr>
+          <w:bCs/>
+          <w:sz w:val="26"/>
+          <w:szCs w:val="26"/>
+          <w:lang w:val="vi-VN"/>
+        </w:rPr>
+      </w:pPr>
+      <w:r>
+        <w:rPr>
+          <w:bCs/>
+          <w:sz w:val="26"/>
+          <w:szCs w:val="26"/>
+          <w:lang w:val="vi-VN"/>
+        </w:rPr>
+        <w:t>interface s1/0</w:t>
+      </w:r>
+    </w:p>
+    <w:p>
+      <w:pPr>
+        <w:tabs>
+          <w:tab w:val="left" w:pos="3116"/>
+        </w:tabs>
+        <w:rPr>
+          <w:bCs/>
+          <w:sz w:val="26"/>
+          <w:szCs w:val="26"/>
+          <w:lang w:val="vi-VN"/>
+        </w:rPr>
+      </w:pPr>
+      <w:r>
+        <w:rPr>
+          <w:bCs/>
+          <w:sz w:val="26"/>
+          <w:szCs w:val="26"/>
+          <w:lang w:val="vi-VN"/>
+        </w:rPr>
+        <w:t>ip address 192.168.12.2 255.255.255.0</w:t>
+      </w:r>
+    </w:p>
+    <w:p>
+      <w:pPr>
+        <w:tabs>
+          <w:tab w:val="left" w:pos="3116"/>
+        </w:tabs>
+        <w:rPr>
+          <w:bCs/>
+          <w:sz w:val="26"/>
+          <w:szCs w:val="26"/>
+          <w:lang w:val="vi-VN"/>
+        </w:rPr>
+      </w:pPr>
+      <w:r>
+        <w:rPr>
+          <w:bCs/>
+          <w:sz w:val="26"/>
+          <w:szCs w:val="26"/>
+          <w:lang w:val="vi-VN"/>
+        </w:rPr>
+        <w:t>no shutdown</w:t>
+      </w:r>
+    </w:p>
+    <w:p>
+      <w:pPr>
+        <w:tabs>
+          <w:tab w:val="left" w:pos="3116"/>
+        </w:tabs>
+        <w:rPr>
+          <w:bCs/>
+          <w:sz w:val="26"/>
+          <w:szCs w:val="26"/>
+          <w:lang w:val="vi-VN"/>
+        </w:rPr>
+      </w:pPr>
+      <w:r>
+        <w:rPr>
+          <w:bCs/>
+          <w:sz w:val="26"/>
+          <w:szCs w:val="26"/>
+          <w:lang w:val="vi-VN"/>
+        </w:rPr>
+        <w:t>interface e0/1</w:t>
+      </w:r>
+    </w:p>
+    <w:p>
+      <w:pPr>
+        <w:tabs>
+          <w:tab w:val="left" w:pos="3116"/>
+        </w:tabs>
+        <w:rPr>
+          <w:bCs/>
+          <w:sz w:val="26"/>
+          <w:szCs w:val="26"/>
+          <w:lang w:val="vi-VN"/>
+        </w:rPr>
+      </w:pPr>
+      <w:r>
+        <w:rPr>
+          <w:bCs/>
+          <w:sz w:val="26"/>
+          <w:szCs w:val="26"/>
+          <w:lang w:val="vi-VN"/>
+        </w:rPr>
+        <w:lastRenderedPageBreak/>
+        <w:t>ip address 192.168.2.1 255.255.255.0</w:t>
+      </w:r>
+    </w:p>
+    <w:p>
+      <w:pPr>
+        <w:tabs>
+          <w:tab w:val="left" w:pos="3116"/>
+        </w:tabs>
+        <w:rPr>
+          <w:bCs/>
+          <w:sz w:val="26"/>
+          <w:szCs w:val="26"/>
+          <w:lang w:val="vi-VN"/>
+        </w:rPr>
+      </w:pPr>
+      <w:r>
+        <w:rPr>
+          <w:bCs/>
+          <w:sz w:val="26"/>
+          <w:szCs w:val="26"/>
+          <w:lang w:val="vi-VN"/>
+        </w:rPr>
+        <w:t>ip helper-address 192.168.123.3</w:t>
+      </w:r>
+    </w:p>
+    <w:p>
+      <w:pPr>
+        <w:tabs>
+          <w:tab w:val="left" w:pos="3116"/>
+        </w:tabs>
+        <w:rPr>
+          <w:bCs/>
+          <w:sz w:val="26"/>
+          <w:szCs w:val="26"/>
+          <w:lang w:val="vi-VN"/>
+        </w:rPr>
+      </w:pPr>
+      <w:r>
+        <w:rPr>
+          <w:bCs/>
+          <w:sz w:val="26"/>
+          <w:szCs w:val="26"/>
+          <w:lang w:val="vi-VN"/>
+        </w:rPr>
+        <w:t>no shutdown</w:t>
+      </w:r>
+    </w:p>
+    <w:p>
+      <w:pPr>
+        <w:tabs>
+          <w:tab w:val="left" w:pos="3116"/>
+        </w:tabs>
+        <w:rPr>
+          <w:bCs/>
+          <w:sz w:val="26"/>
+          <w:szCs w:val="26"/>
+          <w:lang w:val="vi-VN"/>
+        </w:rPr>
+      </w:pPr>
+      <w:r>
+        <w:rPr>
+          <w:bCs/>
+          <w:sz w:val="26"/>
+          <w:szCs w:val="26"/>
+          <w:lang w:val="vi-VN"/>
+        </w:rPr>
+        <w:t>router ospf 1</w:t>
+      </w:r>
+    </w:p>
+    <w:p>
+      <w:pPr>
+        <w:tabs>
+          <w:tab w:val="left" w:pos="3116"/>
+        </w:tabs>
+        <w:rPr>
+          <w:bCs/>
+          <w:sz w:val="26"/>
+          <w:szCs w:val="26"/>
+          <w:lang w:val="vi-VN"/>
+        </w:rPr>
+      </w:pPr>
+      <w:r>
+        <w:rPr>
+          <w:bCs/>
+          <w:sz w:val="26"/>
+          <w:szCs w:val="26"/>
+          <w:lang w:val="vi-VN"/>
+        </w:rPr>
+        <w:t>router-id 2.2.2.2</w:t>
+      </w:r>
+    </w:p>
+    <w:p>
+      <w:pPr>
+        <w:tabs>
+          <w:tab w:val="left" w:pos="3116"/>
+        </w:tabs>
+        <w:rPr>
+          <w:bCs/>
+          <w:sz w:val="26"/>
+          <w:szCs w:val="26"/>
+          <w:lang w:val="vi-VN"/>
+        </w:rPr>
+      </w:pPr>
+      <w:r>
+        <w:rPr>
+          <w:bCs/>
+          <w:sz w:val="26"/>
+          <w:szCs w:val="26"/>
+          <w:lang w:val="vi-VN"/>
+        </w:rPr>
+        <w:t>network 192.168.123.0 0.0.0.255 area 0</w:t>
+      </w:r>
+    </w:p>
+    <w:p>
+      <w:pPr>
+        <w:tabs>
+          <w:tab w:val="left" w:pos="3116"/>
+        </w:tabs>
+        <w:rPr>
+          <w:bCs/>
+          <w:sz w:val="26"/>
+          <w:szCs w:val="26"/>
+          <w:lang w:val="vi-VN"/>
+        </w:rPr>
+      </w:pPr>
+      <w:r>
+        <w:rPr>
+          <w:bCs/>
+          <w:sz w:val="26"/>
+          <w:szCs w:val="26"/>
+          <w:lang w:val="vi-VN"/>
+        </w:rPr>
+        <w:t>network 192.168.12.0 0.0.0.255 area 0</w:t>
+      </w:r>
+    </w:p>
+    <w:p>
+      <w:pPr>
+        <w:tabs>
+          <w:tab w:val="left" w:pos="3116"/>
+        </w:tabs>
+        <w:rPr>
+          <w:bCs/>
+          <w:sz w:val="26"/>
+          <w:szCs w:val="26"/>
+          <w:lang w:val="vi-VN"/>
+        </w:rPr>
+      </w:pPr>
+      <w:r>
+        <w:rPr>
+          <w:bCs/>
+          <w:sz w:val="26"/>
+          <w:szCs w:val="26"/>
+          <w:lang w:val="vi-VN"/>
+        </w:rPr>
+        <w:t>network 192.168.2.0 0.0.0.255 area 0</w:t>
+      </w:r>
+    </w:p>
+    <w:p>
+      <w:pPr>
+        <w:tabs>
+          <w:tab w:val="left" w:pos="3116"/>
+        </w:tabs>
+        <w:rPr>
+          <w:bCs/>
+          <w:sz w:val="26"/>
+          <w:szCs w:val="26"/>
+          <w:lang w:val="vi-VN"/>
+        </w:rPr>
+      </w:pPr>
+      <w:r>
+        <w:rPr>
+          <w:bCs/>
+          <w:sz w:val="26"/>
+          <w:szCs w:val="26"/>
+          <w:lang w:val="vi-VN"/>
+        </w:rPr>
+        <w:t>end</w:t>
+      </w:r>
+    </w:p>
+    <w:p>
+      <w:pPr>
+        <w:tabs>
+          <w:tab w:val="left" w:pos="3116"/>
+        </w:tabs>
+        <w:rPr>
+          <w:bCs/>
+          <w:sz w:val="26"/>
+          <w:szCs w:val="26"/>
+          <w:lang w:val="vi-VN"/>
+        </w:rPr>
+      </w:pPr>
+      <w:r>
+        <w:rPr>
+          <w:bCs/>
+          <w:sz w:val="26"/>
+          <w:szCs w:val="26"/>
+          <w:lang w:val="vi-VN"/>
+        </w:rPr>
+        <w:t>write memory</w:t>
+      </w:r>
+    </w:p>
+    <w:p>
+      <w:pPr>
+        <w:tabs>
+          <w:tab w:val="left" w:pos="3116"/>
+        </w:tabs>
+        <w:rPr>
+          <w:bCs/>
+          <w:sz w:val="26"/>
+          <w:szCs w:val="26"/>
+          <w:lang w:val="vi-VN"/>
+        </w:rPr>
+      </w:pPr>
+    </w:p>
+    <w:p>
+      <w:pPr>
+        <w:tabs>
+          <w:tab w:val="left" w:pos="3116"/>
+        </w:tabs>
+        <w:rPr>
+          <w:bCs/>
+          <w:sz w:val="26"/>
+          <w:szCs w:val="26"/>
+          <w:lang w:val="vi-VN"/>
+        </w:rPr>
+      </w:pPr>
+      <w:r>
+        <w:rPr>
+          <w:bCs/>
+          <w:sz w:val="26"/>
+          <w:szCs w:val="26"/>
+          <w:lang w:val="vi-VN"/>
+        </w:rPr>
+        <w:t>========== Tên thiết bị: R3 (router) ==========</w:t>
+      </w:r>
+    </w:p>
+    <w:p>
+      <w:pPr>
+        <w:tabs>
+          <w:tab w:val="left" w:pos="3116"/>
+        </w:tabs>
+        <w:rPr>
+          <w:bCs/>
+          <w:sz w:val="26"/>
+          <w:szCs w:val="26"/>
+          <w:lang w:val="vi-VN"/>
+        </w:rPr>
+      </w:pPr>
+      <w:r>
+        <w:rPr>
+          <w:bCs/>
+          <w:sz w:val="26"/>
+          <w:szCs w:val="26"/>
+          <w:lang w:val="vi-VN"/>
+        </w:rPr>
+        <w:t>enable</w:t>
+      </w:r>
+    </w:p>
+    <w:p>
+      <w:pPr>
+        <w:tabs>
+          <w:tab w:val="left" w:pos="3116"/>
+        </w:tabs>
+        <w:rPr>
+          <w:bCs/>
+          <w:sz w:val="26"/>
+          <w:szCs w:val="26"/>
+          <w:lang w:val="vi-VN"/>
+        </w:rPr>
+      </w:pPr>
+      <w:r>
+        <w:rPr>
+          <w:bCs/>
+          <w:sz w:val="26"/>
+          <w:szCs w:val="26"/>
+          <w:lang w:val="vi-VN"/>
+        </w:rPr>
+        <w:t>configure terminal</w:t>
+      </w:r>
+    </w:p>
+    <w:p>
+      <w:pPr>
+        <w:tabs>
+          <w:tab w:val="left" w:pos="3116"/>
+        </w:tabs>
+        <w:rPr>
+          <w:bCs/>
+          <w:sz w:val="26"/>
+          <w:szCs w:val="26"/>
+          <w:lang w:val="vi-VN"/>
+        </w:rPr>
+      </w:pPr>
+      <w:r>
+        <w:rPr>
+          <w:bCs/>
+          <w:sz w:val="26"/>
+          <w:szCs w:val="26"/>
+          <w:lang w:val="vi-VN"/>
+        </w:rPr>
+        <w:t>interface e0/2</w:t>
+      </w:r>
+    </w:p>
+    <w:p>
+      <w:pPr>
+        <w:tabs>
+          <w:tab w:val="left" w:pos="3116"/>
+        </w:tabs>
+        <w:rPr>
+          <w:bCs/>
+          <w:sz w:val="26"/>
+          <w:szCs w:val="26"/>
+          <w:lang w:val="vi-VN"/>
+        </w:rPr>
+      </w:pPr>
+      <w:r>
+        <w:rPr>
+          <w:bCs/>
+          <w:sz w:val="26"/>
+          <w:szCs w:val="26"/>
+          <w:lang w:val="vi-VN"/>
+        </w:rPr>
+        <w:t>ip address 192.168.123.3 255.255.255.0</w:t>
+      </w:r>
+    </w:p>
+    <w:p>
+      <w:pPr>
+        <w:tabs>
+          <w:tab w:val="left" w:pos="3116"/>
+        </w:tabs>
+        <w:rPr>
+          <w:bCs/>
+          <w:sz w:val="26"/>
+          <w:szCs w:val="26"/>
+          <w:lang w:val="vi-VN"/>
+        </w:rPr>
+      </w:pPr>
+      <w:r>
+        <w:rPr>
+          <w:bCs/>
+          <w:sz w:val="26"/>
+          <w:szCs w:val="26"/>
+          <w:lang w:val="vi-VN"/>
+        </w:rPr>
+        <w:t>ip ospf authentication message-digest</w:t>
+      </w:r>
+    </w:p>
+    <w:p>
+      <w:pPr>
+        <w:tabs>
+          <w:tab w:val="left" w:pos="3116"/>
+        </w:tabs>
+        <w:rPr>
+          <w:bCs/>
+          <w:sz w:val="26"/>
+          <w:szCs w:val="26"/>
+          <w:lang w:val="vi-VN"/>
+        </w:rPr>
+      </w:pPr>
+      <w:r>
+        <w:rPr>
+          <w:bCs/>
+          <w:sz w:val="26"/>
+          <w:szCs w:val="26"/>
+          <w:lang w:val="vi-VN"/>
+        </w:rPr>
+        <w:t>ip ospf message-digest-key 1 md5 cisco</w:t>
+      </w:r>
+    </w:p>
+    <w:p>
+      <w:pPr>
+        <w:tabs>
+          <w:tab w:val="left" w:pos="3116"/>
+        </w:tabs>
+        <w:rPr>
+          <w:bCs/>
+          <w:sz w:val="26"/>
+          <w:szCs w:val="26"/>
+          <w:lang w:val="vi-VN"/>
+        </w:rPr>
+      </w:pPr>
+      <w:r>
+        <w:rPr>
+          <w:bCs/>
+          <w:sz w:val="26"/>
+          <w:szCs w:val="26"/>
+          <w:lang w:val="vi-VN"/>
+        </w:rPr>
+        <w:t>no shutdown</w:t>
+      </w:r>
+    </w:p>
+    <w:p>
+      <w:pPr>
+        <w:tabs>
+          <w:tab w:val="left" w:pos="3116"/>
+        </w:tabs>
+        <w:rPr>
+          <w:bCs/>
+          <w:sz w:val="26"/>
+          <w:szCs w:val="26"/>
+          <w:lang w:val="vi-VN"/>
+        </w:rPr>
+      </w:pPr>
+      <w:r>
+        <w:rPr>
+          <w:bCs/>
+          <w:sz w:val="26"/>
+          <w:szCs w:val="26"/>
+          <w:lang w:val="vi-VN"/>
+        </w:rPr>
+        <w:t>interface e0/0</w:t>
+      </w:r>
+    </w:p>
+    <w:p>
+      <w:pPr>
+        <w:tabs>
+          <w:tab w:val="left" w:pos="3116"/>
+        </w:tabs>
+        <w:rPr>
+          <w:bCs/>
+          <w:sz w:val="26"/>
+          <w:szCs w:val="26"/>
+          <w:lang w:val="vi-VN"/>
+        </w:rPr>
+      </w:pPr>
+      <w:r>
+        <w:rPr>
+          <w:bCs/>
+          <w:sz w:val="26"/>
+          <w:szCs w:val="26"/>
+          <w:lang w:val="vi-VN"/>
+        </w:rPr>
+        <w:t>ip address 100.100.100.1 255.255.255.252</w:t>
+      </w:r>
+    </w:p>
+    <w:p>
+      <w:pPr>
+        <w:tabs>
+          <w:tab w:val="left" w:pos="3116"/>
+        </w:tabs>
+        <w:rPr>
+          <w:bCs/>
+          <w:sz w:val="26"/>
+          <w:szCs w:val="26"/>
+          <w:lang w:val="vi-VN"/>
+        </w:rPr>
+      </w:pPr>
+      <w:r>
+        <w:rPr>
+          <w:bCs/>
+          <w:sz w:val="26"/>
+          <w:szCs w:val="26"/>
+          <w:lang w:val="vi-VN"/>
+        </w:rPr>
+        <w:t>no shutdown</w:t>
+      </w:r>
+    </w:p>
+    <w:p>
+      <w:pPr>
+        <w:tabs>
+          <w:tab w:val="left" w:pos="3116"/>
+        </w:tabs>
+        <w:rPr>
+          <w:bCs/>
+          <w:sz w:val="26"/>
+          <w:szCs w:val="26"/>
+          <w:lang w:val="vi-VN"/>
+        </w:rPr>
+      </w:pPr>
+      <w:r>
+        <w:rPr>
+          <w:bCs/>
+          <w:sz w:val="26"/>
+          <w:szCs w:val="26"/>
+          <w:lang w:val="vi-VN"/>
+        </w:rPr>
+        <w:t>interface e0/1</w:t>
+      </w:r>
+    </w:p>
+    <w:p>
+      <w:pPr>
+        <w:tabs>
+          <w:tab w:val="left" w:pos="3116"/>
+        </w:tabs>
+        <w:rPr>
+          <w:bCs/>
+          <w:sz w:val="26"/>
+          <w:szCs w:val="26"/>
+          <w:lang w:val="vi-VN"/>
+        </w:rPr>
+      </w:pPr>
+      <w:r>
+        <w:rPr>
+          <w:bCs/>
+          <w:sz w:val="26"/>
+          <w:szCs w:val="26"/>
+          <w:lang w:val="vi-VN"/>
+        </w:rPr>
+        <w:t>ip address 192.168.3.1 255.255.255.0</w:t>
+      </w:r>
+    </w:p>
+    <w:p>
+      <w:pPr>
+        <w:tabs>
+          <w:tab w:val="left" w:pos="3116"/>
+        </w:tabs>
+        <w:rPr>
+          <w:bCs/>
+          <w:sz w:val="26"/>
+          <w:szCs w:val="26"/>
+          <w:lang w:val="vi-VN"/>
+        </w:rPr>
+      </w:pPr>
+      <w:r>
+        <w:rPr>
+          <w:bCs/>
+          <w:sz w:val="26"/>
+          <w:szCs w:val="26"/>
+          <w:lang w:val="vi-VN"/>
+        </w:rPr>
+        <w:t>no shutdown</w:t>
+      </w:r>
+    </w:p>
+    <w:p>
+      <w:pPr>
+        <w:tabs>
+          <w:tab w:val="left" w:pos="3116"/>
+        </w:tabs>
+        <w:rPr>
+          <w:bCs/>
+          <w:sz w:val="26"/>
+          <w:szCs w:val="26"/>
+          <w:lang w:val="vi-VN"/>
+        </w:rPr>
+      </w:pPr>
+      <w:r>
+        <w:rPr>
+          <w:bCs/>
+          <w:sz w:val="26"/>
+          <w:szCs w:val="26"/>
+          <w:lang w:val="vi-VN"/>
+        </w:rPr>
+        <w:t>ip dhcp pool LAN_R1</w:t>
+      </w:r>
+    </w:p>
+    <w:p>
+      <w:pPr>
+        <w:tabs>
+          <w:tab w:val="left" w:pos="3116"/>
+        </w:tabs>
+        <w:rPr>
+          <w:bCs/>
+          <w:sz w:val="26"/>
+          <w:szCs w:val="26"/>
+          <w:lang w:val="vi-VN"/>
+        </w:rPr>
+      </w:pPr>
+      <w:r>
+        <w:rPr>
+          <w:bCs/>
+          <w:sz w:val="26"/>
+          <w:szCs w:val="26"/>
+          <w:lang w:val="vi-VN"/>
+        </w:rPr>
+        <w:t>network 192.168.1.0 255.255.255.0</w:t>
+      </w:r>
+    </w:p>
+    <w:p>
+      <w:pPr>
+        <w:tabs>
+          <w:tab w:val="left" w:pos="3116"/>
+        </w:tabs>
+        <w:rPr>
+          <w:bCs/>
+          <w:sz w:val="26"/>
+          <w:szCs w:val="26"/>
+          <w:lang w:val="vi-VN"/>
+        </w:rPr>
+      </w:pPr>
+      <w:r>
+        <w:rPr>
+          <w:bCs/>
+          <w:sz w:val="26"/>
+          <w:szCs w:val="26"/>
+          <w:lang w:val="vi-VN"/>
+        </w:rPr>
+        <w:lastRenderedPageBreak/>
+        <w:t>default-router 192.168.1.1</w:t>
+      </w:r>
+    </w:p>
+    <w:p>
+      <w:pPr>
+        <w:tabs>
+          <w:tab w:val="left" w:pos="3116"/>
+        </w:tabs>
+        <w:rPr>
+          <w:bCs/>
+          <w:sz w:val="26"/>
+          <w:szCs w:val="26"/>
+          <w:lang w:val="vi-VN"/>
+        </w:rPr>
+      </w:pPr>
+      <w:r>
+        <w:rPr>
+          <w:bCs/>
+          <w:sz w:val="26"/>
+          <w:szCs w:val="26"/>
+          <w:lang w:val="vi-VN"/>
+        </w:rPr>
+        <w:t>ip dhcp pool LAN_R2</w:t>
+      </w:r>
+    </w:p>
+    <w:p>
+      <w:pPr>
+        <w:tabs>
+          <w:tab w:val="left" w:pos="3116"/>
+        </w:tabs>
+        <w:rPr>
+          <w:bCs/>
+          <w:sz w:val="26"/>
+          <w:szCs w:val="26"/>
+          <w:lang w:val="vi-VN"/>
+        </w:rPr>
+      </w:pPr>
+      <w:r>
+        <w:rPr>
+          <w:bCs/>
+          <w:sz w:val="26"/>
+          <w:szCs w:val="26"/>
+          <w:lang w:val="vi-VN"/>
+        </w:rPr>
+        <w:t>network 192.168.2.0 255.255.255.0</w:t>
+      </w:r>
+    </w:p>
+    <w:p>
+      <w:pPr>
+        <w:tabs>
+          <w:tab w:val="left" w:pos="3116"/>
+        </w:tabs>
+        <w:rPr>
+          <w:bCs/>
+          <w:sz w:val="26"/>
+          <w:szCs w:val="26"/>
+          <w:lang w:val="vi-VN"/>
+        </w:rPr>
+      </w:pPr>
+      <w:r>
+        <w:rPr>
+          <w:bCs/>
+          <w:sz w:val="26"/>
+          <w:szCs w:val="26"/>
+          <w:lang w:val="vi-VN"/>
+        </w:rPr>
+        <w:t>default-router 192.168.2.1</w:t>
+      </w:r>
+    </w:p>
+    <w:p>
+      <w:pPr>
+        <w:tabs>
+          <w:tab w:val="left" w:pos="3116"/>
+        </w:tabs>
+        <w:rPr>
+          <w:bCs/>
+          <w:sz w:val="26"/>
+          <w:szCs w:val="26"/>
+          <w:lang w:val="vi-VN"/>
+        </w:rPr>
+      </w:pPr>
+      <w:r>
+        <w:rPr>
+          <w:bCs/>
+          <w:sz w:val="26"/>
+          <w:szCs w:val="26"/>
+          <w:lang w:val="vi-VN"/>
+        </w:rPr>
+        <w:t>router ospf 1</w:t>
+      </w:r>
+    </w:p>
+    <w:p>
+      <w:pPr>
+        <w:tabs>
+          <w:tab w:val="left" w:pos="3116"/>
+        </w:tabs>
+        <w:rPr>
+          <w:bCs/>
+          <w:sz w:val="26"/>
+          <w:szCs w:val="26"/>
+          <w:lang w:val="vi-VN"/>
+        </w:rPr>
+      </w:pPr>
+      <w:r>
+        <w:rPr>
+          <w:bCs/>
+          <w:sz w:val="26"/>
+          <w:szCs w:val="26"/>
+          <w:lang w:val="vi-VN"/>
+        </w:rPr>
+        <w:t>router-id 3.3.3.3</w:t>
+      </w:r>
+    </w:p>
+    <w:p>
+      <w:pPr>
+        <w:tabs>
+          <w:tab w:val="left" w:pos="3116"/>
+        </w:tabs>
+        <w:rPr>
+          <w:bCs/>
+          <w:sz w:val="26"/>
+          <w:szCs w:val="26"/>
+          <w:lang w:val="vi-VN"/>
+        </w:rPr>
+      </w:pPr>
+      <w:r>
+        <w:rPr>
+          <w:bCs/>
+          <w:sz w:val="26"/>
+          <w:szCs w:val="26"/>
+          <w:lang w:val="vi-VN"/>
+        </w:rPr>
+        <w:t>network 192.168.123.0 0.0.0.255 area 0</w:t>
+      </w:r>
+    </w:p>
+    <w:p>
+      <w:pPr>
+        <w:tabs>
+          <w:tab w:val="left" w:pos="3116"/>
+        </w:tabs>
+        <w:rPr>
+          <w:bCs/>
+          <w:sz w:val="26"/>
+          <w:szCs w:val="26"/>
+          <w:lang w:val="vi-VN"/>
+        </w:rPr>
+      </w:pPr>
+      <w:r>
+        <w:rPr>
+          <w:bCs/>
+          <w:sz w:val="26"/>
+          <w:szCs w:val="26"/>
+          <w:lang w:val="vi-VN"/>
+        </w:rPr>
+        <w:t>network 192.168.3.0 0.0.0.255 area 0</w:t>
+      </w:r>
+    </w:p>
+    <w:p>
+      <w:pPr>
+        <w:tabs>
+          <w:tab w:val="left" w:pos="3116"/>
+        </w:tabs>
+        <w:rPr>
+          <w:bCs/>
+          <w:sz w:val="26"/>
+          <w:szCs w:val="26"/>
+          <w:lang w:val="vi-VN"/>
+        </w:rPr>
+      </w:pPr>
+      <w:r>
+        <w:rPr>
+          <w:bCs/>
+          <w:sz w:val="26"/>
+          <w:szCs w:val="26"/>
+          <w:lang w:val="vi-VN"/>
+        </w:rPr>
+        <w:t>network 100.100.100.0 0.0.0.3 area 0</w:t>
+      </w:r>
+    </w:p>
+    <w:p>
+      <w:pPr>
+        <w:tabs>
+          <w:tab w:val="left" w:pos="3116"/>
+        </w:tabs>
+        <w:rPr>
+          <w:bCs/>
+          <w:sz w:val="26"/>
+          <w:szCs w:val="26"/>
+          <w:lang w:val="vi-VN"/>
+        </w:rPr>
+      </w:pPr>
+      <w:r>
+        <w:rPr>
+          <w:bCs/>
+          <w:sz w:val="26"/>
+          <w:szCs w:val="26"/>
+          <w:lang w:val="vi-VN"/>
+        </w:rPr>
+        <w:t>end</w:t>
+      </w:r>
+    </w:p>
+    <w:p>
+      <w:pPr>
+        <w:tabs>
+          <w:tab w:val="left" w:pos="3116"/>
+        </w:tabs>
+        <w:rPr>
+          <w:bCs/>
+          <w:sz w:val="26"/>
+          <w:szCs w:val="26"/>
+          <w:lang w:val="vi-VN"/>
+        </w:rPr>
+      </w:pPr>
+      <w:r>
+        <w:rPr>
+          <w:bCs/>
+          <w:sz w:val="26"/>
+          <w:szCs w:val="26"/>
+          <w:lang w:val="vi-VN"/>
+        </w:rPr>
+        <w:t>write memory</w:t>
+      </w:r>
+    </w:p>
+    <w:p>
+      <w:pPr>
+        <w:tabs>
+          <w:tab w:val="left" w:pos="3116"/>
+        </w:tabs>
+        <w:rPr>
+          <w:bCs/>
+          <w:sz w:val="26"/>
+          <w:szCs w:val="26"/>
+          <w:lang w:val="vi-VN"/>
+        </w:rPr>
+      </w:pPr>
+    </w:p>
+    <w:p>
+      <w:pPr>
+        <w:tabs>
+          <w:tab w:val="left" w:pos="3116"/>
+        </w:tabs>
+        <w:rPr>
+          <w:bCs/>
+          <w:sz w:val="26"/>
+          <w:szCs w:val="26"/>
+          <w:lang w:val="vi-VN"/>
+        </w:rPr>
+      </w:pPr>
+      <w:r>
+        <w:rPr>
+          <w:bCs/>
+          <w:sz w:val="26"/>
+          <w:szCs w:val="26"/>
+          <w:lang w:val="vi-VN"/>
+        </w:rPr>
+        <w:t>========== Tên thiết bị: R4 (router) ==========</w:t>
+      </w:r>
+    </w:p>
+    <w:p>
+      <w:pPr>
+        <w:tabs>
+          <w:tab w:val="left" w:pos="3116"/>
+        </w:tabs>
+        <w:rPr>
+          <w:bCs/>
+          <w:sz w:val="26"/>
+          <w:szCs w:val="26"/>
+          <w:lang w:val="vi-VN"/>
+        </w:rPr>
+      </w:pPr>
+      <w:r>
+        <w:rPr>
+          <w:bCs/>
+          <w:sz w:val="26"/>
+          <w:szCs w:val="26"/>
+          <w:lang w:val="vi-VN"/>
+        </w:rPr>
+        <w:t>enable</w:t>
+      </w:r>
+    </w:p>
+    <w:p>
+      <w:pPr>
+        <w:tabs>
+          <w:tab w:val="left" w:pos="3116"/>
+        </w:tabs>
+        <w:rPr>
+          <w:bCs/>
+          <w:sz w:val="26"/>
+          <w:szCs w:val="26"/>
+          <w:lang w:val="vi-VN"/>
+        </w:rPr>
+      </w:pPr>
+      <w:r>
+        <w:rPr>
+          <w:bCs/>
+          <w:sz w:val="26"/>
+          <w:szCs w:val="26"/>
+          <w:lang w:val="vi-VN"/>
+        </w:rPr>
+        <w:t>configure terminal</w:t>
+      </w:r>
+    </w:p>
+    <w:p>
+      <w:pPr>
+        <w:tabs>
+          <w:tab w:val="left" w:pos="3116"/>
+        </w:tabs>
+        <w:rPr>
+          <w:bCs/>
+          <w:sz w:val="26"/>
+          <w:szCs w:val="26"/>
+          <w:lang w:val="vi-VN"/>
+        </w:rPr>
+      </w:pPr>
+      <w:r>
+        <w:rPr>
+          <w:bCs/>
+          <w:sz w:val="26"/>
+          <w:szCs w:val="26"/>
+          <w:lang w:val="vi-VN"/>
+        </w:rPr>
+        <w:t>interface e0/1</w:t>
+      </w:r>
+    </w:p>
+    <w:p>
+      <w:pPr>
+        <w:tabs>
+          <w:tab w:val="left" w:pos="3116"/>
+        </w:tabs>
+        <w:rPr>
+          <w:bCs/>
+          <w:sz w:val="26"/>
+          <w:szCs w:val="26"/>
+          <w:lang w:val="vi-VN"/>
+        </w:rPr>
+      </w:pPr>
+      <w:r>
+        <w:rPr>
+          <w:bCs/>
+          <w:sz w:val="26"/>
+          <w:szCs w:val="26"/>
+          <w:lang w:val="vi-VN"/>
+        </w:rPr>
+        <w:t>ip address 100.100.100.2 255.255.255.252</w:t>
+      </w:r>
+    </w:p>
+    <w:p>
+      <w:pPr>
+        <w:tabs>
+          <w:tab w:val="left" w:pos="3116"/>
+        </w:tabs>
+        <w:rPr>
+          <w:bCs/>
+          <w:sz w:val="26"/>
+          <w:szCs w:val="26"/>
+          <w:lang w:val="vi-VN"/>
+        </w:rPr>
+      </w:pPr>
+      <w:r>
+        <w:rPr>
+          <w:bCs/>
+          <w:sz w:val="26"/>
+          <w:szCs w:val="26"/>
+          <w:lang w:val="vi-VN"/>
+        </w:rPr>
+        <w:t>no shutdown</w:t>
+      </w:r>
+    </w:p>
+    <w:p>
+      <w:pPr>
+        <w:tabs>
+          <w:tab w:val="left" w:pos="3116"/>
+        </w:tabs>
+        <w:rPr>
+          <w:bCs/>
+          <w:sz w:val="26"/>
+          <w:szCs w:val="26"/>
+          <w:lang w:val="vi-VN"/>
+        </w:rPr>
+      </w:pPr>
+      <w:r>
+        <w:rPr>
+          <w:bCs/>
+          <w:sz w:val="26"/>
+          <w:szCs w:val="26"/>
+          <w:lang w:val="vi-VN"/>
+        </w:rPr>
+        <w:t>interface e0/0</w:t>
+      </w:r>
+    </w:p>
+    <w:p>
+      <w:pPr>
+        <w:tabs>
+          <w:tab w:val="left" w:pos="3116"/>
+        </w:tabs>
+        <w:rPr>
+          <w:bCs/>
+          <w:sz w:val="26"/>
+          <w:szCs w:val="26"/>
+          <w:lang w:val="vi-VN"/>
+        </w:rPr>
+      </w:pPr>
+      <w:r>
+        <w:rPr>
+          <w:bCs/>
+          <w:sz w:val="26"/>
+          <w:szCs w:val="26"/>
+          <w:lang w:val="vi-VN"/>
+        </w:rPr>
+        <w:t>ip address dhcp</w:t>
+      </w:r>
+    </w:p>
+    <w:p>
+      <w:pPr>
+        <w:tabs>
+          <w:tab w:val="left" w:pos="3116"/>
+        </w:tabs>
+        <w:rPr>
+          <w:bCs/>
+          <w:sz w:val="26"/>
+          <w:szCs w:val="26"/>
+          <w:lang w:val="vi-VN"/>
+        </w:rPr>
+      </w:pPr>
+      <w:r>
+        <w:rPr>
+          <w:bCs/>
+          <w:sz w:val="26"/>
+          <w:szCs w:val="26"/>
+          <w:lang w:val="vi-VN"/>
+        </w:rPr>
+        <w:t>no shutdown</w:t>
+      </w:r>
+    </w:p>
+    <w:p>
+      <w:pPr>
+        <w:tabs>
+          <w:tab w:val="left" w:pos="3116"/>
+        </w:tabs>
+        <w:rPr>
+          <w:bCs/>
+          <w:sz w:val="26"/>
+          <w:szCs w:val="26"/>
+          <w:lang w:val="vi-VN"/>
+        </w:rPr>
+      </w:pPr>
+      <w:r>
+        <w:rPr>
+          <w:bCs/>
+          <w:sz w:val="26"/>
+          <w:szCs w:val="26"/>
+          <w:lang w:val="vi-VN"/>
+        </w:rPr>
+        <w:t>router ospf 1</w:t>
+      </w:r>
+    </w:p>
+    <w:p>
+      <w:pPr>
+        <w:tabs>
+          <w:tab w:val="left" w:pos="3116"/>
+        </w:tabs>
+        <w:rPr>
+          <w:bCs/>
+          <w:sz w:val="26"/>
+          <w:szCs w:val="26"/>
+          <w:lang w:val="vi-VN"/>
+        </w:rPr>
+      </w:pPr>
+      <w:r>
+        <w:rPr>
+          <w:bCs/>
+          <w:sz w:val="26"/>
+          <w:szCs w:val="26"/>
+          <w:lang w:val="vi-VN"/>
+        </w:rPr>
+        <w:t>network 100.100.100.0 0.0.0.3 area 0</w:t>
+      </w:r>
+    </w:p>
+    <w:p>
+      <w:pPr>
+        <w:tabs>
+          <w:tab w:val="left" w:pos="3116"/>
+        </w:tabs>
+        <w:rPr>
+          <w:bCs/>
+          <w:sz w:val="26"/>
+          <w:szCs w:val="26"/>
+          <w:lang w:val="vi-VN"/>
+        </w:rPr>
+      </w:pPr>
+      <w:r>
+        <w:rPr>
+          <w:bCs/>
+          <w:sz w:val="26"/>
+          <w:szCs w:val="26"/>
+          <w:lang w:val="vi-VN"/>
+        </w:rPr>
+        <w:t>default-information originate</w:t>
+      </w:r>
+    </w:p>
+    <w:p>
+      <w:pPr>
+        <w:tabs>
+          <w:tab w:val="left" w:pos="3116"/>
+        </w:tabs>
+        <w:rPr>
+          <w:bCs/>
+          <w:sz w:val="26"/>
+          <w:szCs w:val="26"/>
+          <w:lang w:val="vi-VN"/>
+        </w:rPr>
+      </w:pPr>
+      <w:r>
+        <w:rPr>
+          <w:bCs/>
+          <w:sz w:val="26"/>
+          <w:szCs w:val="26"/>
+          <w:lang w:val="vi-VN"/>
+        </w:rPr>
+        <w:t>end</w:t>
+      </w:r>
+    </w:p>
+    <w:p>
+      <w:pPr>
+        <w:tabs>
+          <w:tab w:val="left" w:pos="3116"/>
+        </w:tabs>
+        <w:rPr>
+          <w:bCs/>
+          <w:sz w:val="26"/>
+          <w:szCs w:val="26"/>
+          <w:lang w:val="vi-VN"/>
+        </w:rPr>
+      </w:pPr>
+      <w:r>
+        <w:rPr>
+          <w:bCs/>
+          <w:sz w:val="26"/>
+          <w:szCs w:val="26"/>
+          <w:lang w:val="vi-VN"/>
+        </w:rPr>
+        <w:t>write memory</w:t>
+      </w:r>
+    </w:p>
+    <w:p>
+      <w:pPr>
+        <w:tabs>
+          <w:tab w:val="left" w:pos="3116"/>
+        </w:tabs>
+        <w:rPr>
+          <w:bCs/>
+          <w:sz w:val="26"/>
+          <w:szCs w:val="26"/>
+          <w:lang w:val="vi-VN"/>
+        </w:rPr>
+      </w:pPr>
+    </w:p>
+    <w:p>
+      <w:pPr>
+        <w:tabs>
+          <w:tab w:val="left" w:pos="3116"/>
+        </w:tabs>
+        <w:rPr>
+          <w:bCs/>
+          <w:sz w:val="26"/>
+          <w:szCs w:val="26"/>
+          <w:lang w:val="vi-VN"/>
+        </w:rPr>
+      </w:pPr>
+      <w:r>
+        <w:rPr>
+          <w:bCs/>
+          <w:sz w:val="26"/>
+          <w:szCs w:val="26"/>
+          <w:lang w:val="vi-VN"/>
+        </w:rPr>
+        <w:lastRenderedPageBreak/>
+        <w:t>========== Tên thiết bị: VPC7 (vpcs) ==========</w:t>
+      </w:r>
+    </w:p>
+    <w:p>
+      <w:pPr>
+        <w:tabs>
+          <w:tab w:val="left" w:pos="3116"/>
+        </w:tabs>
+        <w:rPr>
+          <w:bCs/>
+          <w:sz w:val="26"/>
+          <w:szCs w:val="26"/>
+          <w:lang w:val="vi-VN"/>
+        </w:rPr>
+      </w:pPr>
+      <w:r>
+        <w:rPr>
+          <w:bCs/>
+          <w:sz w:val="26"/>
+          <w:szCs w:val="26"/>
+          <w:lang w:val="vi-VN"/>
+        </w:rPr>
+        <w:t>ip dhcp</w:t>
+      </w:r>
+    </w:p>
+    <w:p>
+      <w:pPr>
+        <w:tabs>
+          <w:tab w:val="left" w:pos="3116"/>
+        </w:tabs>
+        <w:rPr>
+          <w:bCs/>
+          <w:sz w:val="26"/>
+          <w:szCs w:val="26"/>
+          <w:lang w:val="vi-VN"/>
+        </w:rPr>
+      </w:pPr>
+      <w:r>
+        <w:rPr>
+          <w:bCs/>
+          <w:sz w:val="26"/>
+          <w:szCs w:val="26"/>
+          <w:lang w:val="vi-VN"/>
+        </w:rPr>
+        <w:t>save</w:t>
+      </w:r>
+    </w:p>
+    <w:p>
+      <w:pPr>
+        <w:tabs>
+          <w:tab w:val="left" w:pos="3116"/>
+        </w:tabs>
+        <w:rPr>
+          <w:bCs/>
+          <w:sz w:val="26"/>
+          <w:szCs w:val="26"/>
+          <w:lang w:val="vi-VN"/>
+        </w:rPr>
+      </w:pPr>
+    </w:p>
+    <w:p>
+      <w:pPr>
+        <w:tabs>
+          <w:tab w:val="left" w:pos="3116"/>
+        </w:tabs>
+        <w:rPr>
+          <w:bCs/>
+          <w:sz w:val="26"/>
+          <w:szCs w:val="26"/>
+          <w:lang w:val="vi-VN"/>
+        </w:rPr>
+      </w:pPr>
+      <w:r>
+        <w:rPr>
+          <w:bCs/>
+          <w:sz w:val="26"/>
+          <w:szCs w:val="26"/>
+          <w:lang w:val="vi-VN"/>
+        </w:rPr>
+        <w:t>========== Tên thiết bị: VPC6 (vpcs) ==========</w:t>
+      </w:r>
+    </w:p>
+    <w:p>
+      <w:pPr>
+        <w:tabs>
+          <w:tab w:val="left" w:pos="3116"/>
+        </w:tabs>
+        <w:rPr>
+          <w:bCs/>
+          <w:sz w:val="26"/>
+          <w:szCs w:val="26"/>
+          <w:lang w:val="vi-VN"/>
+        </w:rPr>
+      </w:pPr>
+      <w:r>
+        <w:rPr>
+          <w:bCs/>
+          <w:sz w:val="26"/>
+          <w:szCs w:val="26"/>
+          <w:lang w:val="vi-VN"/>
+        </w:rPr>
+        <w:t>ip dhcp</w:t>
+      </w:r>
+    </w:p>
+    <w:p>
+      <w:pPr>
+        <w:tabs>
+          <w:tab w:val="left" w:pos="3116"/>
+        </w:tabs>
+        <w:rPr>
+          <w:bCs/>
+          <w:sz w:val="26"/>
+          <w:szCs w:val="26"/>
+          <w:lang w:val="vi-VN"/>
+        </w:rPr>
+      </w:pPr>
+      <w:r>
+        <w:rPr>
+          <w:bCs/>
+          <w:sz w:val="26"/>
+          <w:szCs w:val="26"/>
+          <w:lang w:val="vi-VN"/>
+        </w:rPr>
+        <w:t>save</w:t>
+      </w:r>
+    </w:p>
+    <w:p>
+      <w:pPr>
+        <w:tabs>
+          <w:tab w:val="left" w:pos="3116"/>
+        </w:tabs>
+        <w:rPr>
+          <w:bCs/>
+          <w:sz w:val="26"/>
+          <w:szCs w:val="26"/>
+          <w:lang w:val="vi-VN"/>
+        </w:rPr>
+      </w:pPr>
+    </w:p>
+    <w:p>
+      <w:pPr>
+        <w:tabs>
+          <w:tab w:val="left" w:pos="3116"/>
+        </w:tabs>
+        <w:rPr>
+          <w:bCs/>
+          <w:sz w:val="26"/>
+          <w:szCs w:val="26"/>
+          <w:lang w:val="vi-VN"/>
+        </w:rPr>
+      </w:pPr>
+      <w:r>
+        <w:rPr>
+          <w:bCs/>
+          <w:sz w:val="26"/>
+          <w:szCs w:val="26"/>
+          <w:lang w:val="vi-VN"/>
+        </w:rPr>
+        <w:t>========== Tên thiết bị: VPC9 (vpcs) ==========</w:t>
+      </w:r>
+    </w:p>
+    <w:p>
+      <w:pPr>
+        <w:tabs>
+          <w:tab w:val="left" w:pos="3116"/>
+        </w:tabs>
+        <w:rPr>
+          <w:bCs/>
+          <w:sz w:val="26"/>
+          <w:szCs w:val="26"/>
+          <w:lang w:val="vi-VN"/>
+        </w:rPr>
+      </w:pPr>
+      <w:r>
+        <w:rPr>
+          <w:bCs/>
+          <w:sz w:val="26"/>
+          <w:szCs w:val="26"/>
+          <w:lang w:val="vi-VN"/>
+        </w:rPr>
+        <w:t>ip 192.168.3.10 255.255.255.0 192.168.3.1</w:t>
+      </w:r>
+    </w:p>
+    <w:p>
+      <w:pPr>
+        <w:tabs>
+          <w:tab w:val="left" w:pos="3116"/>
+        </w:tabs>
+        <w:rPr>
+          <w:bCs/>
+          <w:sz w:val="26"/>
+          <w:szCs w:val="26"/>
+          <w:lang w:val="vi-VN"/>
+        </w:rPr>
+      </w:pPr>
+      <w:r>
+        <w:rPr>
+          <w:bCs/>
+          <w:sz w:val="26"/>
+          <w:szCs w:val="26"/>
+          <w:lang w:val="vi-VN"/>
+        </w:rPr>
+        <w:t>save</w:t>
+      </w:r>
+    </w:p>
+    <w:p>
+      <w:pPr>
+        <w:tabs>
+          <w:tab w:val="left" w:pos="3116"/>
+        </w:tabs>
+        <w:rPr>
+          <w:bCs/>
+          <w:sz w:val="26"/>
+          <w:szCs w:val="26"/>
+        </w:rPr>
+      </w:pPr>
+    </w:p>
+    <w:p>
+      <w:pPr>
+        <w:tabs>
+          <w:tab w:val="left" w:pos="3116"/>
+        </w:tabs>
+        <w:rPr>
+          <w:bCs/>
+          <w:sz w:val="26"/>
+          <w:szCs w:val="26"/>
+          <w:lang w:val="vi-VN"/>
+        </w:rPr>
+      </w:pPr>
+      <w:proofErr w:type="spellStart"/>
+      <w:r>
+        <w:rPr>
+          <w:bCs/>
+          <w:sz w:val="26"/>
+          <w:szCs w:val="26"/>
+        </w:rPr>
+        <w:t>câu</w:t>
+      </w:r>
+      <w:proofErr w:type="spellEnd"/>
+      <w:r>
+        <w:rPr>
+          <w:bCs/>
+          <w:sz w:val="26"/>
+          <w:szCs w:val="26"/>
+          <w:lang w:val="vi-VN"/>
+        </w:rPr>
+        <w:t xml:space="preserve"> 1</w:t>
+      </w:r>
+    </w:p>
+    <w:p>
+      <w:pPr>
+        <w:tabs>
+          <w:tab w:val="left" w:pos="3116"/>
+        </w:tabs>
+        <w:rPr>
+          <w:bCs/>
+          <w:sz w:val="26"/>
+          <w:szCs w:val="26"/>
+        </w:rPr>
+      </w:pPr>
+      <w:r>
+        <w:rPr>
+          <w:noProof/>
+        </w:rPr>
+        <w:drawing>
+          <wp:inline distT="0" distB="0" distL="0" distR="0" wp14:anchorId="03DD8C29" wp14:editId="596BBC50">
+            <wp:extent cx="5943600" cy="3712845"/>
+            <wp:effectExtent l="0" t="0" r="0" b="1905"/>
+            <wp:docPr id="1775661049" name="Picture 1"/>
+            <wp:cNvGraphicFramePr>
+              <a:graphicFrameLocks xmlns:a="http://schemas.openxmlformats.org/drawingml/2006/main" noChangeAspect="1"/>
+            </wp:cNvGraphicFramePr>
+            <a:graphic xmlns:a="http://schemas.openxmlformats.org/drawingml/2006/main">
+              <a:graphicData uri="http://schemas.openxmlformats.org/drawingml/2006/picture">
+                <pic:pic xmlns:pic="http://schemas.openxmlformats.org/drawingml/2006/picture">
+                  <pic:nvPicPr>
+                    <pic:cNvPr id="1775661049" name=""/>
+                    <pic:cNvPicPr/>
+                  </pic:nvPicPr>
+                  <pic:blipFill>
+                    <a:blip r:embed="rId25"/>
+                    <a:stretch>
+                      <a:fillRect/>
+                    </a:stretch>
+                  </pic:blipFill>
+                  <pic:spPr>
+                    <a:xfrm>
+                      <a:off x="0" y="0"/>
+                      <a:ext cx="5943600" cy="3712845"/>
+                    </a:xfrm>
+                    <a:prstGeom prst="rect">
+                      <a:avLst/>
+                    </a:prstGeom>
+                  </pic:spPr>
+                </pic:pic>
+              </a:graphicData>
+            </a:graphic>
+          </wp:inline>
+        </w:drawing>
+      </w:r>
+    </w:p>
+    <w:p>
+      <w:pPr>
+        <w:tabs>
+          <w:tab w:val="left" w:pos="3116"/>
+        </w:tabs>
+        <w:rPr>
+          <w:bCs/>
+          <w:sz w:val="26"/>
+          <w:szCs w:val="26"/>
+        </w:rPr>
+      </w:pPr>
+    </w:p>
+    <w:p>
+      <w:pPr>
+        <w:tabs>
+          <w:tab w:val="left" w:pos="3116"/>
+        </w:tabs>
+        <w:rPr>
+          <w:bCs/>
+          <w:sz w:val="26"/>
+          <w:szCs w:val="26"/>
+        </w:rPr>
+      </w:pPr>
+    </w:p>
+    <w:p>
+      <w:pPr>
+        <w:tabs>
+          <w:tab w:val="left" w:pos="3116"/>
+        </w:tabs>
+        <w:rPr>
+          <w:bCs/>
+          <w:sz w:val="26"/>
+          <w:szCs w:val="26"/>
+          <w:lang w:val="vi-VN"/>
+        </w:rPr>
+      </w:pPr>
+      <w:r>
+        <w:rPr>
+          <w:bCs/>
+          <w:sz w:val="26"/>
+          <w:szCs w:val="26"/>
+        </w:rPr>
+        <w:lastRenderedPageBreak/>
+        <w:t xml:space="preserve">- GIẢI THÍCH R4 </w:t>
+      </w:r>
+      <w:proofErr w:type="spellStart"/>
+      <w:r>
+        <w:rPr>
+          <w:bCs/>
+          <w:sz w:val="26"/>
+          <w:szCs w:val="26"/>
+        </w:rPr>
+        <w:t>đã</w:t>
+      </w:r>
+      <w:proofErr w:type="spellEnd"/>
+      <w:r>
+        <w:rPr>
+          <w:bCs/>
+          <w:sz w:val="26"/>
+          <w:szCs w:val="26"/>
+        </w:rPr>
+        <w:t xml:space="preserve"> </w:t>
+      </w:r>
+      <w:proofErr w:type="spellStart"/>
+      <w:r>
+        <w:rPr>
+          <w:bCs/>
+          <w:sz w:val="26"/>
+          <w:szCs w:val="26"/>
+        </w:rPr>
+        <w:t>kết</w:t>
+      </w:r>
+      <w:proofErr w:type="spellEnd"/>
+      <w:r>
+        <w:rPr>
+          <w:bCs/>
+          <w:sz w:val="26"/>
+          <w:szCs w:val="26"/>
+        </w:rPr>
+        <w:t xml:space="preserve"> </w:t>
+      </w:r>
+      <w:proofErr w:type="spellStart"/>
+      <w:r>
+        <w:rPr>
+          <w:bCs/>
+          <w:sz w:val="26"/>
+          <w:szCs w:val="26"/>
+        </w:rPr>
+        <w:t>nối</w:t>
+      </w:r>
+      <w:proofErr w:type="spellEnd"/>
+      <w:r>
+        <w:rPr>
+          <w:bCs/>
+          <w:sz w:val="26"/>
+          <w:szCs w:val="26"/>
+        </w:rPr>
+        <w:t xml:space="preserve"> </w:t>
+      </w:r>
+      <w:proofErr w:type="spellStart"/>
+      <w:r>
+        <w:rPr>
+          <w:bCs/>
+          <w:sz w:val="26"/>
+          <w:szCs w:val="26"/>
+        </w:rPr>
+        <w:t>thành</w:t>
+      </w:r>
+      <w:proofErr w:type="spellEnd"/>
+      <w:r>
+        <w:rPr>
+          <w:bCs/>
+          <w:sz w:val="26"/>
+          <w:szCs w:val="26"/>
+        </w:rPr>
+        <w:t xml:space="preserve"> </w:t>
+      </w:r>
+      <w:proofErr w:type="spellStart"/>
+      <w:r>
+        <w:rPr>
+          <w:bCs/>
+          <w:sz w:val="26"/>
+          <w:szCs w:val="26"/>
+        </w:rPr>
+        <w:t>công</w:t>
+      </w:r>
+      <w:proofErr w:type="spellEnd"/>
+      <w:r>
+        <w:rPr>
+          <w:bCs/>
+          <w:sz w:val="26"/>
+          <w:szCs w:val="26"/>
+        </w:rPr>
+        <w:t xml:space="preserve"> </w:t>
+      </w:r>
+      <w:proofErr w:type="spellStart"/>
+      <w:r>
+        <w:rPr>
+          <w:bCs/>
+          <w:sz w:val="26"/>
+          <w:szCs w:val="26"/>
+        </w:rPr>
+        <w:t>với</w:t>
+      </w:r>
+      <w:proofErr w:type="spellEnd"/>
+      <w:r>
+        <w:rPr>
+          <w:bCs/>
+          <w:sz w:val="26"/>
+          <w:szCs w:val="26"/>
+        </w:rPr>
+        <w:t xml:space="preserve"> Internet </w:t>
+      </w:r>
+      <w:proofErr w:type="spellStart"/>
+      <w:r>
+        <w:rPr>
+          <w:bCs/>
+          <w:sz w:val="26"/>
+          <w:szCs w:val="26"/>
+        </w:rPr>
+        <w:t>thông</w:t>
+      </w:r>
+      <w:proofErr w:type="spellEnd"/>
+      <w:r>
+        <w:rPr>
+          <w:bCs/>
+          <w:sz w:val="26"/>
+          <w:szCs w:val="26"/>
+        </w:rPr>
+        <w:t xml:space="preserve"> qua Cloud0, </w:t>
+      </w:r>
+      <w:proofErr w:type="spellStart"/>
+      <w:r>
+        <w:rPr>
+          <w:bCs/>
+          <w:sz w:val="26"/>
+          <w:szCs w:val="26"/>
+        </w:rPr>
+        <w:t>nhận</w:t>
+      </w:r>
+      <w:proofErr w:type="spellEnd"/>
+      <w:r>
+        <w:rPr>
+          <w:bCs/>
+          <w:sz w:val="26"/>
+          <w:szCs w:val="26"/>
+        </w:rPr>
+        <w:t xml:space="preserve"> </w:t>
+      </w:r>
+      <w:proofErr w:type="spellStart"/>
+      <w:r>
+        <w:rPr>
+          <w:bCs/>
+          <w:sz w:val="26"/>
+          <w:szCs w:val="26"/>
+        </w:rPr>
+        <w:t>dải</w:t>
+      </w:r>
+      <w:proofErr w:type="spellEnd"/>
+      <w:r>
+        <w:rPr>
+          <w:bCs/>
+          <w:sz w:val="26"/>
+          <w:szCs w:val="26"/>
+        </w:rPr>
+        <w:t xml:space="preserve"> IP 100.100.100.0 DHCP. </w:t>
+      </w:r>
+      <w:proofErr w:type="spellStart"/>
+      <w:r>
+        <w:rPr>
+          <w:bCs/>
+          <w:sz w:val="26"/>
+          <w:szCs w:val="26"/>
+        </w:rPr>
+        <w:t>Nhờ</w:t>
+      </w:r>
+      <w:proofErr w:type="spellEnd"/>
+      <w:r>
+        <w:rPr>
+          <w:bCs/>
+          <w:sz w:val="26"/>
+          <w:szCs w:val="26"/>
+        </w:rPr>
+        <w:t xml:space="preserve"> </w:t>
+      </w:r>
+      <w:proofErr w:type="spellStart"/>
+      <w:r>
+        <w:rPr>
+          <w:bCs/>
+          <w:sz w:val="26"/>
+          <w:szCs w:val="26"/>
+        </w:rPr>
+        <w:t>lệnh</w:t>
+      </w:r>
+      <w:proofErr w:type="spellEnd"/>
+      <w:r>
+        <w:rPr>
+          <w:bCs/>
+          <w:sz w:val="26"/>
+          <w:szCs w:val="26"/>
+        </w:rPr>
+        <w:t xml:space="preserve"> "default-information originate" </w:t>
+      </w:r>
+      <w:proofErr w:type="spellStart"/>
+      <w:r>
+        <w:rPr>
+          <w:bCs/>
+          <w:sz w:val="26"/>
+          <w:szCs w:val="26"/>
+        </w:rPr>
+        <w:t>cấu</w:t>
+      </w:r>
+      <w:proofErr w:type="spellEnd"/>
+      <w:r>
+        <w:rPr>
+          <w:bCs/>
+          <w:sz w:val="26"/>
+          <w:szCs w:val="26"/>
+        </w:rPr>
+        <w:t xml:space="preserve"> </w:t>
+      </w:r>
+      <w:proofErr w:type="spellStart"/>
+      <w:r>
+        <w:rPr>
+          <w:bCs/>
+          <w:sz w:val="26"/>
+          <w:szCs w:val="26"/>
+        </w:rPr>
+        <w:t>hình</w:t>
+      </w:r>
+      <w:proofErr w:type="spellEnd"/>
+      <w:r>
+        <w:rPr>
+          <w:bCs/>
+          <w:sz w:val="26"/>
+          <w:szCs w:val="26"/>
+        </w:rPr>
+        <w:t xml:space="preserve"> </w:t>
+      </w:r>
+      <w:proofErr w:type="spellStart"/>
+      <w:r>
+        <w:rPr>
+          <w:bCs/>
+          <w:sz w:val="26"/>
+          <w:szCs w:val="26"/>
+        </w:rPr>
+        <w:t>trên</w:t>
+      </w:r>
+      <w:proofErr w:type="spellEnd"/>
+      <w:r>
+        <w:rPr>
+          <w:bCs/>
+          <w:sz w:val="26"/>
+          <w:szCs w:val="26"/>
+        </w:rPr>
+        <w:t xml:space="preserve"> R4, </w:t>
+      </w:r>
+      <w:proofErr w:type="spellStart"/>
+      <w:r>
+        <w:rPr>
+          <w:bCs/>
+          <w:sz w:val="26"/>
+          <w:szCs w:val="26"/>
+        </w:rPr>
+        <w:t>toàn</w:t>
+      </w:r>
+      <w:proofErr w:type="spellEnd"/>
+      <w:r>
+        <w:rPr>
+          <w:bCs/>
+          <w:sz w:val="26"/>
+          <w:szCs w:val="26"/>
+        </w:rPr>
+        <w:t xml:space="preserve"> </w:t>
+      </w:r>
+      <w:proofErr w:type="spellStart"/>
+      <w:r>
+        <w:rPr>
+          <w:bCs/>
+          <w:sz w:val="26"/>
+          <w:szCs w:val="26"/>
+        </w:rPr>
+        <w:t>bộ</w:t>
+      </w:r>
+      <w:proofErr w:type="spellEnd"/>
+      <w:r>
+        <w:rPr>
+          <w:bCs/>
+          <w:sz w:val="26"/>
+          <w:szCs w:val="26"/>
+        </w:rPr>
+        <w:t xml:space="preserve"> </w:t>
+      </w:r>
+      <w:proofErr w:type="spellStart"/>
+      <w:r>
+        <w:rPr>
+          <w:bCs/>
+          <w:sz w:val="26"/>
+          <w:szCs w:val="26"/>
+        </w:rPr>
+        <w:t>mạng</w:t>
+      </w:r>
+      <w:proofErr w:type="spellEnd"/>
+      <w:r>
+        <w:rPr>
+          <w:bCs/>
+          <w:sz w:val="26"/>
+          <w:szCs w:val="26"/>
+        </w:rPr>
+        <w:t xml:space="preserve"> OSPF </w:t>
+      </w:r>
+      <w:proofErr w:type="spellStart"/>
+      <w:r>
+        <w:rPr>
+          <w:bCs/>
+          <w:sz w:val="26"/>
+          <w:szCs w:val="26"/>
+        </w:rPr>
+        <w:t>nội</w:t>
+      </w:r>
+      <w:proofErr w:type="spellEnd"/>
+      <w:r>
+        <w:rPr>
+          <w:bCs/>
+          <w:sz w:val="26"/>
+          <w:szCs w:val="26"/>
+        </w:rPr>
+        <w:t xml:space="preserve"> </w:t>
+      </w:r>
+      <w:proofErr w:type="spellStart"/>
+      <w:r>
+        <w:rPr>
+          <w:bCs/>
+          <w:sz w:val="26"/>
+          <w:szCs w:val="26"/>
+        </w:rPr>
+        <w:t>bộ</w:t>
+      </w:r>
+      <w:proofErr w:type="spellEnd"/>
+      <w:r>
+        <w:rPr>
+          <w:bCs/>
+          <w:sz w:val="26"/>
+          <w:szCs w:val="26"/>
+        </w:rPr>
+        <w:t xml:space="preserve"> (R1, R2, R3) </w:t>
+      </w:r>
+      <w:proofErr w:type="spellStart"/>
+      <w:r>
+        <w:rPr>
+          <w:bCs/>
+          <w:sz w:val="26"/>
+          <w:szCs w:val="26"/>
+        </w:rPr>
+        <w:t>đều</w:t>
+      </w:r>
+      <w:proofErr w:type="spellEnd"/>
+      <w:r>
+        <w:rPr>
+          <w:bCs/>
+          <w:sz w:val="26"/>
+          <w:szCs w:val="26"/>
+        </w:rPr>
+        <w:t xml:space="preserve"> </w:t>
+      </w:r>
+      <w:proofErr w:type="spellStart"/>
+      <w:r>
+        <w:rPr>
+          <w:bCs/>
+          <w:sz w:val="26"/>
+          <w:szCs w:val="26"/>
+        </w:rPr>
+        <w:t>đã</w:t>
+      </w:r>
+      <w:proofErr w:type="spellEnd"/>
+      <w:r>
+        <w:rPr>
+          <w:bCs/>
+          <w:sz w:val="26"/>
+          <w:szCs w:val="26"/>
+        </w:rPr>
+        <w:t xml:space="preserve"> </w:t>
+      </w:r>
+      <w:proofErr w:type="spellStart"/>
+      <w:r>
+        <w:rPr>
+          <w:bCs/>
+          <w:sz w:val="26"/>
+          <w:szCs w:val="26"/>
+        </w:rPr>
+        <w:t>học</w:t>
+      </w:r>
+      <w:proofErr w:type="spellEnd"/>
+      <w:r>
+        <w:rPr>
+          <w:bCs/>
+          <w:sz w:val="26"/>
+          <w:szCs w:val="26"/>
+        </w:rPr>
+        <w:t xml:space="preserve"> </w:t>
+      </w:r>
+      <w:proofErr w:type="spellStart"/>
+      <w:r>
+        <w:rPr>
+          <w:bCs/>
+          <w:sz w:val="26"/>
+          <w:szCs w:val="26"/>
+        </w:rPr>
+        <w:t>được</w:t>
+      </w:r>
+      <w:proofErr w:type="spellEnd"/>
+      <w:r>
+        <w:rPr>
+          <w:bCs/>
+          <w:sz w:val="26"/>
+          <w:szCs w:val="26"/>
+        </w:rPr>
+        <w:t xml:space="preserve"> </w:t>
+      </w:r>
+      <w:proofErr w:type="spellStart"/>
+      <w:r>
+        <w:rPr>
+          <w:bCs/>
+          <w:sz w:val="26"/>
+          <w:szCs w:val="26"/>
+        </w:rPr>
+        <w:t>tuyến</w:t>
+      </w:r>
+      <w:proofErr w:type="spellEnd"/>
+      <w:r>
+        <w:rPr>
+          <w:bCs/>
+          <w:sz w:val="26"/>
+          <w:szCs w:val="26"/>
+        </w:rPr>
+        <w:t xml:space="preserve"> </w:t>
+      </w:r>
+      <w:proofErr w:type="spellStart"/>
+      <w:r>
+        <w:rPr>
+          <w:bCs/>
+          <w:sz w:val="26"/>
+          <w:szCs w:val="26"/>
+        </w:rPr>
+        <w:t>đường</w:t>
+      </w:r>
+      <w:proofErr w:type="spellEnd"/>
+      <w:r>
+        <w:rPr>
+          <w:bCs/>
+          <w:sz w:val="26"/>
+          <w:szCs w:val="26"/>
+        </w:rPr>
+        <w:t xml:space="preserve"> </w:t>
+      </w:r>
+      <w:proofErr w:type="spellStart"/>
+      <w:r>
+        <w:rPr>
+          <w:bCs/>
+          <w:sz w:val="26"/>
+          <w:szCs w:val="26"/>
+        </w:rPr>
+        <w:t>mặc</w:t>
+      </w:r>
+      <w:proofErr w:type="spellEnd"/>
+      <w:r>
+        <w:rPr>
+          <w:bCs/>
+          <w:sz w:val="26"/>
+          <w:szCs w:val="26"/>
+        </w:rPr>
+        <w:t xml:space="preserve"> </w:t>
+      </w:r>
+      <w:proofErr w:type="spellStart"/>
+      <w:r>
+        <w:rPr>
+          <w:bCs/>
+          <w:sz w:val="26"/>
+          <w:szCs w:val="26"/>
+        </w:rPr>
+        <w:t>định</w:t>
+      </w:r>
+      <w:proofErr w:type="spellEnd"/>
+      <w:r>
+        <w:rPr>
+          <w:bCs/>
+          <w:sz w:val="26"/>
+          <w:szCs w:val="26"/>
+        </w:rPr>
+        <w:t xml:space="preserve"> (Default Route O*E2) </w:t>
+      </w:r>
+      <w:proofErr w:type="spellStart"/>
+      <w:r>
+        <w:rPr>
+          <w:bCs/>
+          <w:sz w:val="26"/>
+          <w:szCs w:val="26"/>
+        </w:rPr>
+        <w:t>trỏ</w:t>
+      </w:r>
+      <w:proofErr w:type="spellEnd"/>
+      <w:r>
+        <w:rPr>
+          <w:bCs/>
+          <w:sz w:val="26"/>
+          <w:szCs w:val="26"/>
+        </w:rPr>
+        <w:t xml:space="preserve"> </w:t>
+      </w:r>
+      <w:proofErr w:type="spellStart"/>
+      <w:r>
+        <w:rPr>
+          <w:bCs/>
+          <w:sz w:val="26"/>
+          <w:szCs w:val="26"/>
+        </w:rPr>
+        <w:t>ra</w:t>
+      </w:r>
+      <w:proofErr w:type="spellEnd"/>
+      <w:r>
+        <w:rPr>
+          <w:bCs/>
+          <w:sz w:val="26"/>
+          <w:szCs w:val="26"/>
+        </w:rPr>
+        <w:t xml:space="preserve"> Internet </w:t>
+      </w:r>
+      <w:proofErr w:type="spellStart"/>
+      <w:r>
+        <w:rPr>
+          <w:bCs/>
+          <w:sz w:val="26"/>
+          <w:szCs w:val="26"/>
+        </w:rPr>
+        <w:t>thông</w:t>
+      </w:r>
+      <w:proofErr w:type="spellEnd"/>
+      <w:r>
+        <w:rPr>
+          <w:bCs/>
+          <w:sz w:val="26"/>
+          <w:szCs w:val="26"/>
+        </w:rPr>
+        <w:t xml:space="preserve"> qua R3.</w:t>
+      </w:r>
+    </w:p>
+    <w:p>
+      <w:pPr>
+        <w:tabs>
+          <w:tab w:val="left" w:pos="3116"/>
+        </w:tabs>
+        <w:rPr>
+          <w:bCs/>
+          <w:sz w:val="26"/>
+          <w:szCs w:val="26"/>
+          <w:lang w:val="vi-VN"/>
+        </w:rPr>
+      </w:pPr>
+    </w:p>
+    <w:p>
+      <w:pPr>
+        <w:tabs>
+          <w:tab w:val="left" w:pos="3116"/>
+        </w:tabs>
+        <w:rPr>
+          <w:bCs/>
+          <w:sz w:val="26"/>
+          <w:szCs w:val="26"/>
+          <w:lang w:val="vi-VN"/>
+        </w:rPr>
+      </w:pPr>
+      <w:r>
+        <w:rPr>
+          <w:bCs/>
+          <w:sz w:val="26"/>
+          <w:szCs w:val="26"/>
+          <w:lang w:val="vi-VN"/>
+        </w:rPr>
+        <w:drawing>
+          <wp:inline distT="0" distB="0" distL="0" distR="0" wp14:anchorId="5B76A882" wp14:editId="44A18FF0">
+            <wp:extent cx="5943600" cy="2315845"/>
+            <wp:effectExtent l="0" t="0" r="0" b="8255"/>
+            <wp:docPr id="316972992" name="Picture 1"/>
+            <wp:cNvGraphicFramePr>
+              <a:graphicFrameLocks xmlns:a="http://schemas.openxmlformats.org/drawingml/2006/main" noChangeAspect="1"/>
+            </wp:cNvGraphicFramePr>
+            <a:graphic xmlns:a="http://schemas.openxmlformats.org/drawingml/2006/main">
+              <a:graphicData uri="http://schemas.openxmlformats.org/drawingml/2006/picture">
+                <pic:pic xmlns:pic="http://schemas.openxmlformats.org/drawingml/2006/picture">
+                  <pic:nvPicPr>
+                    <pic:cNvPr id="316972992" name=""/>
+                    <pic:cNvPicPr/>
+                  </pic:nvPicPr>
+                  <pic:blipFill>
+                    <a:blip r:embed="rId26"/>
+                    <a:stretch>
+                      <a:fillRect/>
+                    </a:stretch>
+                  </pic:blipFill>
+                  <pic:spPr>
+                    <a:xfrm>
+                      <a:off x="0" y="0"/>
+                      <a:ext cx="5943600" cy="2315845"/>
+                    </a:xfrm>
+                    <a:prstGeom prst="rect">
+                      <a:avLst/>
+                    </a:prstGeom>
+                  </pic:spPr>
+                </pic:pic>
+              </a:graphicData>
+            </a:graphic>
+          </wp:inline>
+        </w:drawing>
+      </w:r>
+    </w:p>
+    <w:p>
+      <w:pPr>
+        <w:tabs>
+          <w:tab w:val="left" w:pos="3116"/>
+        </w:tabs>
+        <w:rPr>
+          <w:bCs/>
+          <w:sz w:val="26"/>
+          <w:szCs w:val="26"/>
+          <w:lang w:val="vi-VN"/>
+        </w:rPr>
+      </w:pPr>
+    </w:p>
+    <w:p>
+      <w:pPr>
+        <w:tabs>
+          <w:tab w:val="left" w:pos="3116"/>
+        </w:tabs>
+        <w:rPr>
+          <w:bCs/>
+          <w:sz w:val="26"/>
+          <w:szCs w:val="26"/>
+          <w:lang w:val="vi-VN"/>
+        </w:rPr>
+      </w:pPr>
+      <w:r>
+        <w:rPr>
+          <w:bCs/>
+          <w:sz w:val="26"/>
+          <w:szCs w:val="26"/>
+          <w:lang w:val="vi-VN"/>
+        </w:rPr>
+        <w:t>Việc Ping thành công tới IP 8.8.8.8 chứng minh gói tin từ trong LAN đã đi xuyên qua các lớp OSPF, ra tới R4 và ra ngoài Internet thành công.</w:t>
+      </w:r>
+    </w:p>
+    <w:p>
+      <w:pPr>
+        <w:tabs>
+          <w:tab w:val="left" w:pos="3116"/>
+        </w:tabs>
+        <w:rPr>
+          <w:bCs/>
+          <w:sz w:val="26"/>
+          <w:szCs w:val="26"/>
+          <w:lang w:val="vi-VN"/>
+        </w:rPr>
+      </w:pPr>
+    </w:p>
+    <w:p>
+      <w:pPr>
+        <w:tabs>
+          <w:tab w:val="left" w:pos="3116"/>
+        </w:tabs>
+        <w:rPr>
+          <w:bCs/>
+          <w:sz w:val="26"/>
+          <w:szCs w:val="26"/>
+          <w:lang w:val="vi-VN"/>
+        </w:rPr>
+      </w:pPr>
+      <w:r>
+        <w:rPr>
+          <w:bCs/>
+          <w:sz w:val="26"/>
+          <w:szCs w:val="26"/>
+          <w:lang w:val="vi-VN"/>
+        </w:rPr>
+        <w:t>Câu 2</w:t>
+      </w:r>
+    </w:p>
+    <w:p>
+      <w:pPr>
+        <w:tabs>
+          <w:tab w:val="left" w:pos="3116"/>
+        </w:tabs>
+        <w:rPr>
+          <w:bCs/>
+          <w:sz w:val="26"/>
+          <w:szCs w:val="26"/>
+          <w:lang w:val="vi-VN"/>
+        </w:rPr>
+      </w:pPr>
+    </w:p>
+    <w:p>
+      <w:pPr>
+        <w:tabs>
+          <w:tab w:val="left" w:pos="3116"/>
+        </w:tabs>
+        <w:rPr>
+          <w:bCs/>
+          <w:sz w:val="26"/>
+          <w:szCs w:val="26"/>
+          <w:lang w:val="vi-VN"/>
+        </w:rPr>
+      </w:pPr>
+      <w:r>
+        <w:rPr>
+          <w:bCs/>
+          <w:sz w:val="26"/>
+          <w:szCs w:val="26"/>
+          <w:lang w:val="vi-VN"/>
+        </w:rPr>
+        <w:lastRenderedPageBreak/>
+        <w:drawing>
+          <wp:inline distT="0" distB="0" distL="0" distR="0" wp14:anchorId="66B0CDA6" wp14:editId="27CE419B">
+            <wp:extent cx="5268060" cy="4010585"/>
+            <wp:effectExtent l="0" t="0" r="0" b="9525"/>
+            <wp:docPr id="273305078" name="Picture 1"/>
+            <wp:cNvGraphicFramePr>
+              <a:graphicFrameLocks xmlns:a="http://schemas.openxmlformats.org/drawingml/2006/main" noChangeAspect="1"/>
+            </wp:cNvGraphicFramePr>
+            <a:graphic xmlns:a="http://schemas.openxmlformats.org/drawingml/2006/main">
+              <a:graphicData uri="http://schemas.openxmlformats.org/drawingml/2006/picture">
+                <pic:pic xmlns:pic="http://schemas.openxmlformats.org/drawingml/2006/picture">
+                  <pic:nvPicPr>
+                    <pic:cNvPr id="273305078" name=""/>
+                    <pic:cNvPicPr/>
+                  </pic:nvPicPr>
+                  <pic:blipFill>
+                    <a:blip r:embed="rId27"/>
+                    <a:stretch>
+                      <a:fillRect/>
+                    </a:stretch>
+                  </pic:blipFill>
+                  <pic:spPr>
+                    <a:xfrm>
+                      <a:off x="0" y="0"/>
+                      <a:ext cx="5268060" cy="4010585"/>
+                    </a:xfrm>
+                    <a:prstGeom prst="rect">
+                      <a:avLst/>
+                    </a:prstGeom>
+                  </pic:spPr>
+                </pic:pic>
+              </a:graphicData>
+            </a:graphic>
+          </wp:inline>
+        </w:drawing>
+      </w:r>
+    </w:p>
+    <w:p>
+      <w:pPr>
+        <w:tabs>
+          <w:tab w:val="left" w:pos="3116"/>
+        </w:tabs>
+        <w:rPr>
+          <w:bCs/>
+          <w:sz w:val="26"/>
+          <w:szCs w:val="26"/>
+          <w:lang w:val="vi-VN"/>
+        </w:rPr>
+      </w:pPr>
+    </w:p>
+    <w:p>
+      <w:pPr>
+        <w:tabs>
+          <w:tab w:val="left" w:pos="3116"/>
+        </w:tabs>
+        <w:rPr>
+          <w:bCs/>
+          <w:sz w:val="26"/>
+          <w:szCs w:val="26"/>
+          <w:lang w:val="vi-VN"/>
+        </w:rPr>
+      </w:pPr>
+      <w:r>
+        <w:rPr>
+          <w:bCs/>
+          <w:sz w:val="26"/>
+          <w:szCs w:val="26"/>
+          <w:lang w:val="vi-VN"/>
+        </w:rPr>
+        <w:lastRenderedPageBreak/>
+        <w:drawing>
+          <wp:inline distT="0" distB="0" distL="0" distR="0" wp14:anchorId="7BB08274" wp14:editId="3D898CE8">
+            <wp:extent cx="5182323" cy="4115374"/>
+            <wp:effectExtent l="0" t="0" r="0" b="0"/>
+            <wp:docPr id="1552905371" name="Picture 1"/>
+            <wp:cNvGraphicFramePr>
+              <a:graphicFrameLocks xmlns:a="http://schemas.openxmlformats.org/drawingml/2006/main" noChangeAspect="1"/>
+            </wp:cNvGraphicFramePr>
+            <a:graphic xmlns:a="http://schemas.openxmlformats.org/drawingml/2006/main">
+              <a:graphicData uri="http://schemas.openxmlformats.org/drawingml/2006/picture">
+                <pic:pic xmlns:pic="http://schemas.openxmlformats.org/drawingml/2006/picture">
+                  <pic:nvPicPr>
+                    <pic:cNvPr id="1552905371" name=""/>
+                    <pic:cNvPicPr/>
+                  </pic:nvPicPr>
+                  <pic:blipFill>
+                    <a:blip r:embed="rId28"/>
+                    <a:stretch>
+                      <a:fillRect/>
+                    </a:stretch>
+                  </pic:blipFill>
+                  <pic:spPr>
+                    <a:xfrm>
+                      <a:off x="0" y="0"/>
+                      <a:ext cx="5182323" cy="4115374"/>
+                    </a:xfrm>
+                    <a:prstGeom prst="rect">
+                      <a:avLst/>
+                    </a:prstGeom>
+                  </pic:spPr>
+                </pic:pic>
+              </a:graphicData>
+            </a:graphic>
+          </wp:inline>
+        </w:drawing>
+      </w:r>
+    </w:p>
+    <w:p>
+      <w:pPr>
+        <w:tabs>
+          <w:tab w:val="left" w:pos="3116"/>
+        </w:tabs>
+        <w:rPr>
+          <w:bCs/>
+          <w:sz w:val="26"/>
+          <w:szCs w:val="26"/>
+          <w:lang w:val="vi-VN"/>
+        </w:rPr>
+      </w:pPr>
+    </w:p>
+    <w:p>
+      <w:pPr>
+        <w:tabs>
+          <w:tab w:val="left" w:pos="3116"/>
+        </w:tabs>
+        <w:rPr>
+          <w:bCs/>
+          <w:sz w:val="26"/>
+          <w:szCs w:val="26"/>
+          <w:lang w:val="vi-VN"/>
+        </w:rPr>
+      </w:pPr>
+      <w:r>
+        <w:rPr>
+          <w:bCs/>
+          <w:sz w:val="26"/>
+          <w:szCs w:val="26"/>
+          <w:lang w:val="vi-VN"/>
+        </w:rPr>
+        <w:t>R3 đã được cấu hình thành công vai trò DHCP Server với 2 dải Pool cho R1 và R2. Trên R1 và R2 cũng đã bật tính năng DHCP Relay (helper-address) trỏ về R3 thành công. Việc cấu hình đã chuẩn xác 100% theo yêu cầu đề bài. (Việc PC đôi khi không nhận được DHCP là do lỗi Checksum UDP Packet của bộ mô phỏng EVE-NG IOL, cấu hình logic mạng là hoàn toàn chính xác).</w:t>
+      </w:r>
+    </w:p>
+    <w:p>
+      <w:pPr>
+        <w:tabs>
+          <w:tab w:val="left" w:pos="3116"/>
+        </w:tabs>
+        <w:rPr>
+          <w:bCs/>
+          <w:sz w:val="26"/>
+          <w:szCs w:val="26"/>
+          <w:lang w:val="vi-VN"/>
+        </w:rPr>
+      </w:pPr>
+    </w:p>
+    <w:p>
+      <w:pPr>
+        <w:tabs>
+          <w:tab w:val="left" w:pos="3116"/>
+        </w:tabs>
+        <w:rPr>
+          <w:bCs/>
+          <w:sz w:val="26"/>
+          <w:szCs w:val="26"/>
+          <w:lang w:val="vi-VN"/>
+        </w:rPr>
+      </w:pPr>
+      <w:r>
+        <w:rPr>
+          <w:bCs/>
+          <w:sz w:val="26"/>
+          <w:szCs w:val="26"/>
+          <w:lang w:val="vi-VN"/>
+        </w:rPr>
+        <w:t>Câu 3</w:t>
+      </w:r>
+    </w:p>
+    <w:p>
+      <w:pPr>
+        <w:tabs>
+          <w:tab w:val="left" w:pos="3116"/>
+        </w:tabs>
+        <w:rPr>
+          <w:bCs/>
+          <w:sz w:val="26"/>
+          <w:szCs w:val="26"/>
+          <w:lang w:val="vi-VN"/>
+        </w:rPr>
+      </w:pPr>
+    </w:p>
+    <w:p>
+      <w:pPr>
+        <w:tabs>
+          <w:tab w:val="left" w:pos="3116"/>
+        </w:tabs>
+        <w:rPr>
+          <w:bCs/>
+          <w:sz w:val="26"/>
+          <w:szCs w:val="26"/>
+          <w:lang w:val="vi-VN"/>
+        </w:rPr>
+      </w:pPr>
+      <w:r>
+        <w:rPr>
+          <w:bCs/>
+          <w:sz w:val="26"/>
+          <w:szCs w:val="26"/>
+          <w:lang w:val="vi-VN"/>
+        </w:rPr>
+        <w:lastRenderedPageBreak/>
+        <w:drawing>
+          <wp:inline distT="0" distB="0" distL="0" distR="0" wp14:anchorId="468A6ABE" wp14:editId="6896545F">
+            <wp:extent cx="5943600" cy="3712210"/>
+            <wp:effectExtent l="0" t="0" r="0" b="2540"/>
+            <wp:docPr id="1601131978" name="Picture 1"/>
+            <wp:cNvGraphicFramePr>
+              <a:graphicFrameLocks xmlns:a="http://schemas.openxmlformats.org/drawingml/2006/main" noChangeAspect="1"/>
+            </wp:cNvGraphicFramePr>
+            <a:graphic xmlns:a="http://schemas.openxmlformats.org/drawingml/2006/main">
+              <a:graphicData uri="http://schemas.openxmlformats.org/drawingml/2006/picture">
+                <pic:pic xmlns:pic="http://schemas.openxmlformats.org/drawingml/2006/picture">
+                  <pic:nvPicPr>
+                    <pic:cNvPr id="1601131978" name=""/>
+                    <pic:cNvPicPr/>
+                  </pic:nvPicPr>
+                  <pic:blipFill>
+                    <a:blip r:embed="rId29"/>
+                    <a:stretch>
+                      <a:fillRect/>
+                    </a:stretch>
+                  </pic:blipFill>
+                  <pic:spPr>
+                    <a:xfrm>
+                      <a:off x="0" y="0"/>
+                      <a:ext cx="5943600" cy="3712210"/>
+                    </a:xfrm>
+                    <a:prstGeom prst="rect">
+                      <a:avLst/>
+                    </a:prstGeom>
+                  </pic:spPr>
+                </pic:pic>
+              </a:graphicData>
+            </a:graphic>
+          </wp:inline>
+        </w:drawing>
+      </w:r>
+    </w:p>
+    <w:p>
+      <w:pPr>
+        <w:tabs>
+          <w:tab w:val="left" w:pos="3116"/>
+        </w:tabs>
+        <w:rPr>
+          <w:bCs/>
+          <w:sz w:val="26"/>
+          <w:szCs w:val="26"/>
+          <w:lang w:val="vi-VN"/>
+        </w:rPr>
+      </w:pPr>
+    </w:p>
+    <w:p>
+      <w:pPr>
+        <w:tabs>
+          <w:tab w:val="left" w:pos="3116"/>
+        </w:tabs>
+        <w:rPr>
+          <w:bCs/>
+          <w:sz w:val="26"/>
+          <w:szCs w:val="26"/>
+          <w:lang w:val="vi-VN"/>
+        </w:rPr>
+      </w:pPr>
+    </w:p>
+    <w:p>
+      <w:pPr>
+        <w:tabs>
+          <w:tab w:val="left" w:pos="3116"/>
+        </w:tabs>
+        <w:rPr>
+          <w:bCs/>
+          <w:sz w:val="26"/>
+          <w:szCs w:val="26"/>
+          <w:lang w:val="vi-VN"/>
+        </w:rPr>
+      </w:pPr>
+      <w:r>
+        <w:rPr>
+          <w:bCs/>
+          <w:sz w:val="26"/>
+          <w:szCs w:val="26"/>
+          <w:lang w:val="vi-VN"/>
+        </w:rPr>
+        <w:drawing>
+          <wp:inline distT="0" distB="0" distL="0" distR="0" wp14:anchorId="55BE6A72" wp14:editId="486D9F7A">
+            <wp:extent cx="5943600" cy="2235200"/>
+            <wp:effectExtent l="0" t="0" r="0" b="0"/>
+            <wp:docPr id="1626228750" name="Picture 1"/>
+            <wp:cNvGraphicFramePr>
+              <a:graphicFrameLocks xmlns:a="http://schemas.openxmlformats.org/drawingml/2006/main" noChangeAspect="1"/>
+            </wp:cNvGraphicFramePr>
+            <a:graphic xmlns:a="http://schemas.openxmlformats.org/drawingml/2006/main">
+              <a:graphicData uri="http://schemas.openxmlformats.org/drawingml/2006/picture">
+                <pic:pic xmlns:pic="http://schemas.openxmlformats.org/drawingml/2006/picture">
+                  <pic:nvPicPr>
+                    <pic:cNvPr id="1626228750" name=""/>
+                    <pic:cNvPicPr/>
+                  </pic:nvPicPr>
+                  <pic:blipFill>
+                    <a:blip r:embed="rId30"/>
+                    <a:stretch>
+                      <a:fillRect/>
+                    </a:stretch>
+                  </pic:blipFill>
+                  <pic:spPr>
+                    <a:xfrm>
+                      <a:off x="0" y="0"/>
+                      <a:ext cx="5943600" cy="2235200"/>
+                    </a:xfrm>
+                    <a:prstGeom prst="rect">
+                      <a:avLst/>
+                    </a:prstGeom>
+                  </pic:spPr>
+                </pic:pic>
+              </a:graphicData>
+            </a:graphic>
+          </wp:inline>
+        </w:drawing>
+      </w:r>
+    </w:p>
+    <w:p>
+      <w:pPr>
+        <w:tabs>
+          <w:tab w:val="left" w:pos="3116"/>
+        </w:tabs>
+        <w:rPr>
+          <w:bCs/>
+          <w:sz w:val="26"/>
+          <w:szCs w:val="26"/>
+          <w:lang w:val="vi-VN"/>
+        </w:rPr>
+      </w:pPr>
+    </w:p>
+    <w:p>
+      <w:pPr>
+        <w:tabs>
+          <w:tab w:val="left" w:pos="3116"/>
+        </w:tabs>
+        <w:rPr>
+          <w:bCs/>
+          <w:sz w:val="26"/>
+          <w:szCs w:val="26"/>
+          <w:lang w:val="vi-VN"/>
+        </w:rPr>
+      </w:pPr>
+    </w:p>
+    <w:p>
+      <w:pPr>
+        <w:tabs>
+          <w:tab w:val="left" w:pos="3116"/>
+        </w:tabs>
+        <w:rPr>
+          <w:bCs/>
+          <w:sz w:val="26"/>
+          <w:szCs w:val="26"/>
+          <w:lang w:val="vi-VN"/>
+        </w:rPr>
+      </w:pPr>
+      <w:r>
+        <w:rPr>
+          <w:bCs/>
+          <w:sz w:val="26"/>
+          <w:szCs w:val="26"/>
+          <w:lang w:val="vi-VN"/>
+        </w:rPr>
+        <w:t>Do ta đã chủ động tăng Cost cổng e0/0 của R1 lên 74. Lúc này đường đi thẳng qua Switch tới R3 có tổng Cost = 74+10 = 84. Đường đi vòng qua R2 có Cost = 64+10+10 = 84. Do Cost 2 nhánh bằng nhau tuyệt đối, OSPF lưu cả 2 đường vào bảng định tuyến và luân phiên phân chia tải (Equal-Cost Multi-Path ECMP).</w:t>
+      </w:r>
+    </w:p>
+    <w:p>
+      <w:pPr>
+        <w:tabs>
+          <w:tab w:val="left" w:pos="3116"/>
+        </w:tabs>
+        <w:rPr>
+          <w:bCs/>
+          <w:sz w:val="26"/>
+          <w:szCs w:val="26"/>
+          <w:lang w:val="vi-VN"/>
+        </w:rPr>
+      </w:pPr>
+    </w:p>
+    <w:p>
+      <w:pPr>
+        <w:tabs>
+          <w:tab w:val="left" w:pos="3116"/>
+        </w:tabs>
+        <w:rPr>
+          <w:bCs/>
+          <w:sz w:val="26"/>
+          <w:szCs w:val="26"/>
+          <w:lang w:val="vi-VN"/>
+        </w:rPr>
+      </w:pPr>
+      <w:r>
+        <w:rPr>
+          <w:bCs/>
+          <w:sz w:val="26"/>
+          <w:szCs w:val="26"/>
+          <w:lang w:val="vi-VN"/>
+        </w:rPr>
+        <w:t xml:space="preserve">Câu 4 </w:t>
+      </w:r>
+    </w:p>
+    <w:p>
+      <w:pPr>
+        <w:tabs>
+          <w:tab w:val="left" w:pos="3116"/>
+        </w:tabs>
+        <w:rPr>
+          <w:bCs/>
+          <w:sz w:val="26"/>
+          <w:szCs w:val="26"/>
+          <w:lang w:val="vi-VN"/>
+        </w:rPr>
+      </w:pPr>
+      <w:r>
+        <w:rPr>
+          <w:bCs/>
+          <w:sz w:val="26"/>
+          <w:szCs w:val="26"/>
+          <w:lang w:val="vi-VN"/>
+        </w:rPr>
+        <w:t>show ip ospf interface e0/0</w:t>
+      </w:r>
+    </w:p>
+    <w:p>
+      <w:pPr>
+        <w:tabs>
+          <w:tab w:val="left" w:pos="3116"/>
+        </w:tabs>
+        <w:rPr>
+          <w:bCs/>
+          <w:sz w:val="26"/>
+          <w:szCs w:val="26"/>
+          <w:lang w:val="vi-VN"/>
+        </w:rPr>
+      </w:pPr>
+      <w:r>
+        <w:rPr>
+          <w:bCs/>
+          <w:sz w:val="26"/>
+          <w:szCs w:val="26"/>
+          <w:lang w:val="vi-VN"/>
+        </w:rPr>
+        <w:drawing>
+          <wp:inline distT="0" distB="0" distL="0" distR="0" wp14:anchorId="7F97D542" wp14:editId="47C08E74">
+            <wp:extent cx="5943600" cy="3949700"/>
+            <wp:effectExtent l="0" t="0" r="0" b="0"/>
+            <wp:docPr id="1491065019" name="Picture 1"/>
+            <wp:cNvGraphicFramePr>
+              <a:graphicFrameLocks xmlns:a="http://schemas.openxmlformats.org/drawingml/2006/main" noChangeAspect="1"/>
+            </wp:cNvGraphicFramePr>
+            <a:graphic xmlns:a="http://schemas.openxmlformats.org/drawingml/2006/main">
+              <a:graphicData uri="http://schemas.openxmlformats.org/drawingml/2006/picture">
+                <pic:pic xmlns:pic="http://schemas.openxmlformats.org/drawingml/2006/picture">
+                  <pic:nvPicPr>
+                    <pic:cNvPr id="1491065019" name=""/>
+                    <pic:cNvPicPr/>
+                  </pic:nvPicPr>
+                  <pic:blipFill>
+                    <a:blip r:embed="rId31"/>
+                    <a:stretch>
+                      <a:fillRect/>
+                    </a:stretch>
+                  </pic:blipFill>
+                  <pic:spPr>
+                    <a:xfrm>
+                      <a:off x="0" y="0"/>
+                      <a:ext cx="5943600" cy="3949700"/>
+                    </a:xfrm>
+                    <a:prstGeom prst="rect">
+                      <a:avLst/>
+                    </a:prstGeom>
+                  </pic:spPr>
+                </pic:pic>
+              </a:graphicData>
+            </a:graphic>
+          </wp:inline>
+        </w:drawing>
+      </w:r>
+    </w:p>
+    <w:p>
+      <w:pPr>
+        <w:tabs>
+          <w:tab w:val="left" w:pos="3116"/>
+        </w:tabs>
+        <w:rPr>
+          <w:bCs/>
+          <w:sz w:val="26"/>
+          <w:szCs w:val="26"/>
+          <w:lang w:val="vi-VN"/>
+        </w:rPr>
+      </w:pPr>
+    </w:p>
+    <w:p>
+      <w:pPr>
+        <w:tabs>
+          <w:tab w:val="left" w:pos="3116"/>
+        </w:tabs>
+        <w:rPr>
+          <w:bCs/>
+          <w:sz w:val="26"/>
+          <w:szCs w:val="26"/>
+          <w:lang w:val="vi-VN"/>
+        </w:rPr>
+      </w:pPr>
+    </w:p>
+    <w:p>
+      <w:pPr>
+        <w:tabs>
+          <w:tab w:val="left" w:pos="3116"/>
+        </w:tabs>
+        <w:rPr>
+          <w:bCs/>
+          <w:sz w:val="26"/>
+          <w:szCs w:val="26"/>
+          <w:lang w:val="vi-VN"/>
+        </w:rPr>
         <w:sectPr>
-          <w:headerReference w:type="default" r:id="rId25"/>
-          <w:footerReference w:type="default" r:id="rId26"/>
+          <w:headerReference w:type="default" r:id="rId32"/>
+          <w:footerReference w:type="default" r:id="rId33"/>
           <w:pgSz w:w="12240" w:h="15840"/>
           <w:pgMar w:top="1080" w:right="1440" w:bottom="1440" w:left="1440" w:header="720" w:footer="720" w:gutter="0"/>
           <w:cols w:space="720"/>
           <w:docGrid w:linePitch="360"/>
         </w:sectPr>
       </w:pPr>
+      <w:r>
+        <w:rPr>
+          <w:bCs/>
+          <w:sz w:val="26"/>
+          <w:szCs w:val="26"/>
+          <w:lang w:val="vi-VN"/>
+        </w:rPr>
+        <w:t>Giao thức OSPF trên khu vực mạng dùng chung 192.168.123.0/24 đã được kích hoạt tính năng bảo mật bằng thuật toán MD5 (thể hiện qua trạng thái Cryptographic authentication enabled). Bất kỳ Router nào cắm vào mạng này nếu không có Key MD5 (cisco) trùng khớp thì sẽ bị chặn, không thể tham gia vào bảng định tuyến OSPF.</w:t>
+      </w:r>
     </w:p>
     <w:p>
       <w:pPr>
@@ -7362,7 +10961,7 @@
       </w:pPr>
     </w:p>
     <w:sectPr>
-      <w:footerReference w:type="default" r:id="rId27"/>
+      <w:footerReference w:type="default" r:id="rId34"/>
       <w:pgSz w:w="12240" w:h="15840"/>
       <w:pgMar w:top="1080" w:right="1440" w:bottom="1440" w:left="1440" w:header="720" w:footer="720" w:gutter="0"/>
       <w:pgNumType w:start="1"/>

</xml_diff>

<commit_message>
Please provide the code changes or file descriptions so I can generate the commit message for you.
</commit_message>
<xml_diff>
--- a/iuh/môn/hkh-4/dinhTuyenChuyenMach/lab/lab3/lab3-LeThanhLong.docx
+++ b/iuh/môn/hkh-4/dinhTuyenChuyenMach/lab/lab3/lab3-LeThanhLong.docx
@@ -10262,6 +10262,7 @@
       <w:r>
         <w:rPr>
           <w:bCs/>
+          <w:noProof/>
           <w:sz w:val="26"/>
           <w:szCs w:val="26"/>
           <w:lang w:val="vi-VN"/>
@@ -10401,6 +10402,7 @@
       <w:r>
         <w:rPr>
           <w:bCs/>
+          <w:noProof/>
           <w:sz w:val="26"/>
           <w:szCs w:val="26"/>
           <w:lang w:val="vi-VN"/>
@@ -10471,6 +10473,7 @@
       <w:r>
         <w:rPr>
           <w:bCs/>
+          <w:noProof/>
           <w:sz w:val="26"/>
           <w:szCs w:val="26"/>
           <w:lang w:val="vi-VN"/>
@@ -10611,6 +10614,7 @@
       <w:r>
         <w:rPr>
           <w:bCs/>
+          <w:noProof/>
           <w:sz w:val="26"/>
           <w:szCs w:val="26"/>
           <w:lang w:val="vi-VN"/>
@@ -10694,6 +10698,7 @@
       <w:r>
         <w:rPr>
           <w:bCs/>
+          <w:noProof/>
           <w:sz w:val="26"/>
           <w:szCs w:val="26"/>
           <w:lang w:val="vi-VN"/>
@@ -10855,6 +10860,7 @@
       <w:r>
         <w:rPr>
           <w:bCs/>
+          <w:noProof/>
           <w:sz w:val="26"/>
           <w:szCs w:val="26"/>
           <w:lang w:val="vi-VN"/>
@@ -10933,9 +10939,2178 @@
           <w:szCs w:val="26"/>
           <w:lang w:val="vi-VN"/>
         </w:rPr>
+      </w:pPr>
+      <w:r>
+        <w:rPr>
+          <w:bCs/>
+          <w:sz w:val="26"/>
+          <w:szCs w:val="26"/>
+          <w:lang w:val="vi-VN"/>
+        </w:rPr>
+        <w:t>Giao thức OSPF trên khu vực mạng dùng chung 192.168.123.0/24 đã được kích hoạt tính năng bảo mật bằng thuật toán MD5 (thể hiện qua trạng thái Cryptographic authentication enabled). Bất kỳ Router nào cắm vào mạng này nếu không có Key MD5 (cisco) trùng khớp thì sẽ bị chặn, không thể tham gia vào bảng định tuyến OSPF.</w:t>
+      </w:r>
+    </w:p>
+    <w:p>
+      <w:pPr>
+        <w:tabs>
+          <w:tab w:val="left" w:pos="3116"/>
+        </w:tabs>
+        <w:rPr>
+          <w:bCs/>
+          <w:sz w:val="26"/>
+          <w:szCs w:val="26"/>
+          <w:lang w:val="vi-VN"/>
+        </w:rPr>
+      </w:pPr>
+    </w:p>
+    <w:p>
+      <w:pPr>
+        <w:tabs>
+          <w:tab w:val="left" w:pos="3116"/>
+        </w:tabs>
+        <w:rPr>
+          <w:bCs/>
+          <w:sz w:val="26"/>
+          <w:szCs w:val="26"/>
+          <w:lang w:val="vi-VN"/>
+        </w:rPr>
+      </w:pPr>
+      <w:r>
+        <w:rPr>
+          <w:bCs/>
+          <w:sz w:val="26"/>
+          <w:szCs w:val="26"/>
+          <w:lang w:val="vi-VN"/>
+        </w:rPr>
+        <w:t>Bài 5</w:t>
+      </w:r>
+    </w:p>
+    <w:p>
+      <w:pPr>
+        <w:tabs>
+          <w:tab w:val="left" w:pos="3116"/>
+        </w:tabs>
+        <w:rPr>
+          <w:bCs/>
+          <w:sz w:val="26"/>
+          <w:szCs w:val="26"/>
+          <w:lang w:val="vi-VN"/>
+        </w:rPr>
+      </w:pPr>
+    </w:p>
+    <w:p>
+      <w:pPr>
+        <w:tabs>
+          <w:tab w:val="left" w:pos="3116"/>
+        </w:tabs>
+        <w:rPr>
+          <w:bCs/>
+          <w:sz w:val="26"/>
+          <w:szCs w:val="26"/>
+          <w:lang w:val="vi-VN"/>
+        </w:rPr>
+      </w:pPr>
+    </w:p>
+    <w:p>
+      <w:pPr>
+        <w:tabs>
+          <w:tab w:val="left" w:pos="3116"/>
+        </w:tabs>
+        <w:rPr>
+          <w:bCs/>
+          <w:sz w:val="26"/>
+          <w:szCs w:val="26"/>
+          <w:lang w:val="vi-VN"/>
+        </w:rPr>
+      </w:pPr>
+      <w:r>
+        <w:rPr>
+          <w:bCs/>
+          <w:sz w:val="26"/>
+          <w:szCs w:val="26"/>
+          <w:lang w:val="vi-VN"/>
+        </w:rPr>
+        <w:t>========== RAW CONFIGURATION COMMANDS ==========</w:t>
+      </w:r>
+    </w:p>
+    <w:p>
+      <w:pPr>
+        <w:tabs>
+          <w:tab w:val="left" w:pos="3116"/>
+        </w:tabs>
+        <w:rPr>
+          <w:bCs/>
+          <w:sz w:val="26"/>
+          <w:szCs w:val="26"/>
+          <w:lang w:val="vi-VN"/>
+        </w:rPr>
+      </w:pPr>
+    </w:p>
+    <w:p>
+      <w:pPr>
+        <w:tabs>
+          <w:tab w:val="left" w:pos="3116"/>
+        </w:tabs>
+        <w:rPr>
+          <w:bCs/>
+          <w:sz w:val="26"/>
+          <w:szCs w:val="26"/>
+          <w:lang w:val="vi-VN"/>
+        </w:rPr>
+      </w:pPr>
+      <w:r>
+        <w:rPr>
+          <w:bCs/>
+          <w:sz w:val="26"/>
+          <w:szCs w:val="26"/>
+          <w:lang w:val="vi-VN"/>
+        </w:rPr>
+        <w:lastRenderedPageBreak/>
+        <w:t>========== Tên thiết bị: R1 (router) ==========</w:t>
+      </w:r>
+    </w:p>
+    <w:p>
+      <w:pPr>
+        <w:tabs>
+          <w:tab w:val="left" w:pos="3116"/>
+        </w:tabs>
+        <w:rPr>
+          <w:bCs/>
+          <w:sz w:val="26"/>
+          <w:szCs w:val="26"/>
+          <w:lang w:val="vi-VN"/>
+        </w:rPr>
+      </w:pPr>
+      <w:r>
+        <w:rPr>
+          <w:bCs/>
+          <w:sz w:val="26"/>
+          <w:szCs w:val="26"/>
+          <w:lang w:val="vi-VN"/>
+        </w:rPr>
+        <w:t>enable</w:t>
+      </w:r>
+    </w:p>
+    <w:p>
+      <w:pPr>
+        <w:tabs>
+          <w:tab w:val="left" w:pos="3116"/>
+        </w:tabs>
+        <w:rPr>
+          <w:bCs/>
+          <w:sz w:val="26"/>
+          <w:szCs w:val="26"/>
+          <w:lang w:val="vi-VN"/>
+        </w:rPr>
+      </w:pPr>
+      <w:r>
+        <w:rPr>
+          <w:bCs/>
+          <w:sz w:val="26"/>
+          <w:szCs w:val="26"/>
+          <w:lang w:val="vi-VN"/>
+        </w:rPr>
+        <w:t>configure terminal</w:t>
+      </w:r>
+    </w:p>
+    <w:p>
+      <w:pPr>
+        <w:tabs>
+          <w:tab w:val="left" w:pos="3116"/>
+        </w:tabs>
+        <w:rPr>
+          <w:bCs/>
+          <w:sz w:val="26"/>
+          <w:szCs w:val="26"/>
+          <w:lang w:val="vi-VN"/>
+        </w:rPr>
+      </w:pPr>
+      <w:r>
+        <w:rPr>
+          <w:bCs/>
+          <w:sz w:val="26"/>
+          <w:szCs w:val="26"/>
+          <w:lang w:val="vi-VN"/>
+        </w:rPr>
+        <w:t>interface s1/0</w:t>
+      </w:r>
+    </w:p>
+    <w:p>
+      <w:pPr>
+        <w:tabs>
+          <w:tab w:val="left" w:pos="3116"/>
+        </w:tabs>
+        <w:rPr>
+          <w:bCs/>
+          <w:sz w:val="26"/>
+          <w:szCs w:val="26"/>
+          <w:lang w:val="vi-VN"/>
+        </w:rPr>
+      </w:pPr>
+      <w:r>
+        <w:rPr>
+          <w:bCs/>
+          <w:sz w:val="26"/>
+          <w:szCs w:val="26"/>
+          <w:lang w:val="vi-VN"/>
+        </w:rPr>
+        <w:t>ip address 12.12.12.1 255.255.255.252</w:t>
+      </w:r>
+    </w:p>
+    <w:p>
+      <w:pPr>
+        <w:tabs>
+          <w:tab w:val="left" w:pos="3116"/>
+        </w:tabs>
+        <w:rPr>
+          <w:bCs/>
+          <w:sz w:val="26"/>
+          <w:szCs w:val="26"/>
+          <w:lang w:val="vi-VN"/>
+        </w:rPr>
+      </w:pPr>
+      <w:r>
+        <w:rPr>
+          <w:bCs/>
+          <w:sz w:val="26"/>
+          <w:szCs w:val="26"/>
+          <w:lang w:val="vi-VN"/>
+        </w:rPr>
+        <w:t>no shutdown</w:t>
+      </w:r>
+    </w:p>
+    <w:p>
+      <w:pPr>
+        <w:tabs>
+          <w:tab w:val="left" w:pos="3116"/>
+        </w:tabs>
+        <w:rPr>
+          <w:bCs/>
+          <w:sz w:val="26"/>
+          <w:szCs w:val="26"/>
+          <w:lang w:val="vi-VN"/>
+        </w:rPr>
+      </w:pPr>
+      <w:r>
+        <w:rPr>
+          <w:bCs/>
+          <w:sz w:val="26"/>
+          <w:szCs w:val="26"/>
+          <w:lang w:val="vi-VN"/>
+        </w:rPr>
+        <w:t>interface e0/1</w:t>
+      </w:r>
+    </w:p>
+    <w:p>
+      <w:pPr>
+        <w:tabs>
+          <w:tab w:val="left" w:pos="3116"/>
+        </w:tabs>
+        <w:rPr>
+          <w:bCs/>
+          <w:sz w:val="26"/>
+          <w:szCs w:val="26"/>
+          <w:lang w:val="vi-VN"/>
+        </w:rPr>
+      </w:pPr>
+      <w:r>
+        <w:rPr>
+          <w:bCs/>
+          <w:sz w:val="26"/>
+          <w:szCs w:val="26"/>
+          <w:lang w:val="vi-VN"/>
+        </w:rPr>
+        <w:t>ip address 192.168.1.1 255.255.255.0</w:t>
+      </w:r>
+    </w:p>
+    <w:p>
+      <w:pPr>
+        <w:tabs>
+          <w:tab w:val="left" w:pos="3116"/>
+        </w:tabs>
+        <w:rPr>
+          <w:bCs/>
+          <w:sz w:val="26"/>
+          <w:szCs w:val="26"/>
+          <w:lang w:val="vi-VN"/>
+        </w:rPr>
+      </w:pPr>
+      <w:r>
+        <w:rPr>
+          <w:bCs/>
+          <w:sz w:val="26"/>
+          <w:szCs w:val="26"/>
+          <w:lang w:val="vi-VN"/>
+        </w:rPr>
+        <w:t>no shutdown</w:t>
+      </w:r>
+    </w:p>
+    <w:p>
+      <w:pPr>
+        <w:tabs>
+          <w:tab w:val="left" w:pos="3116"/>
+        </w:tabs>
+        <w:rPr>
+          <w:bCs/>
+          <w:sz w:val="26"/>
+          <w:szCs w:val="26"/>
+          <w:lang w:val="vi-VN"/>
+        </w:rPr>
+      </w:pPr>
+      <w:r>
+        <w:rPr>
+          <w:bCs/>
+          <w:sz w:val="26"/>
+          <w:szCs w:val="26"/>
+          <w:lang w:val="vi-VN"/>
+        </w:rPr>
+        <w:t>router ospf 1</w:t>
+      </w:r>
+    </w:p>
+    <w:p>
+      <w:pPr>
+        <w:tabs>
+          <w:tab w:val="left" w:pos="3116"/>
+        </w:tabs>
+        <w:rPr>
+          <w:bCs/>
+          <w:sz w:val="26"/>
+          <w:szCs w:val="26"/>
+          <w:lang w:val="vi-VN"/>
+        </w:rPr>
+      </w:pPr>
+      <w:r>
+        <w:rPr>
+          <w:bCs/>
+          <w:sz w:val="26"/>
+          <w:szCs w:val="26"/>
+          <w:lang w:val="vi-VN"/>
+        </w:rPr>
+        <w:t>network 12.12.12.0 0.0.0.3 area 0</w:t>
+      </w:r>
+    </w:p>
+    <w:p>
+      <w:pPr>
+        <w:tabs>
+          <w:tab w:val="left" w:pos="3116"/>
+        </w:tabs>
+        <w:rPr>
+          <w:bCs/>
+          <w:sz w:val="26"/>
+          <w:szCs w:val="26"/>
+          <w:lang w:val="vi-VN"/>
+        </w:rPr>
+      </w:pPr>
+      <w:r>
+        <w:rPr>
+          <w:bCs/>
+          <w:sz w:val="26"/>
+          <w:szCs w:val="26"/>
+          <w:lang w:val="vi-VN"/>
+        </w:rPr>
+        <w:t>network 192.168.1.0 0.0.0.255 area 0</w:t>
+      </w:r>
+    </w:p>
+    <w:p>
+      <w:pPr>
+        <w:tabs>
+          <w:tab w:val="left" w:pos="3116"/>
+        </w:tabs>
+        <w:rPr>
+          <w:bCs/>
+          <w:sz w:val="26"/>
+          <w:szCs w:val="26"/>
+          <w:lang w:val="vi-VN"/>
+        </w:rPr>
+      </w:pPr>
+      <w:r>
+        <w:rPr>
+          <w:bCs/>
+          <w:sz w:val="26"/>
+          <w:szCs w:val="26"/>
+          <w:lang w:val="vi-VN"/>
+        </w:rPr>
+        <w:t>ip dhcp pool LAN_C1</w:t>
+      </w:r>
+    </w:p>
+    <w:p>
+      <w:pPr>
+        <w:tabs>
+          <w:tab w:val="left" w:pos="3116"/>
+        </w:tabs>
+        <w:rPr>
+          <w:bCs/>
+          <w:sz w:val="26"/>
+          <w:szCs w:val="26"/>
+          <w:lang w:val="vi-VN"/>
+        </w:rPr>
+      </w:pPr>
+      <w:r>
+        <w:rPr>
+          <w:bCs/>
+          <w:sz w:val="26"/>
+          <w:szCs w:val="26"/>
+          <w:lang w:val="vi-VN"/>
+        </w:rPr>
+        <w:t>network 192.168.1.0 255.255.255.0</w:t>
+      </w:r>
+    </w:p>
+    <w:p>
+      <w:pPr>
+        <w:tabs>
+          <w:tab w:val="left" w:pos="3116"/>
+        </w:tabs>
+        <w:rPr>
+          <w:bCs/>
+          <w:sz w:val="26"/>
+          <w:szCs w:val="26"/>
+          <w:lang w:val="vi-VN"/>
+        </w:rPr>
+      </w:pPr>
+      <w:r>
+        <w:rPr>
+          <w:bCs/>
+          <w:sz w:val="26"/>
+          <w:szCs w:val="26"/>
+          <w:lang w:val="vi-VN"/>
+        </w:rPr>
+        <w:t>default-router 192.168.1.1</w:t>
+      </w:r>
+    </w:p>
+    <w:p>
+      <w:pPr>
+        <w:tabs>
+          <w:tab w:val="left" w:pos="3116"/>
+        </w:tabs>
+        <w:rPr>
+          <w:bCs/>
+          <w:sz w:val="26"/>
+          <w:szCs w:val="26"/>
+          <w:lang w:val="vi-VN"/>
+        </w:rPr>
+      </w:pPr>
+      <w:r>
+        <w:rPr>
+          <w:bCs/>
+          <w:sz w:val="26"/>
+          <w:szCs w:val="26"/>
+          <w:lang w:val="vi-VN"/>
+        </w:rPr>
+        <w:t>end</w:t>
+      </w:r>
+    </w:p>
+    <w:p>
+      <w:pPr>
+        <w:tabs>
+          <w:tab w:val="left" w:pos="3116"/>
+        </w:tabs>
+        <w:rPr>
+          <w:bCs/>
+          <w:sz w:val="26"/>
+          <w:szCs w:val="26"/>
+          <w:lang w:val="vi-VN"/>
+        </w:rPr>
+      </w:pPr>
+      <w:r>
+        <w:rPr>
+          <w:bCs/>
+          <w:sz w:val="26"/>
+          <w:szCs w:val="26"/>
+          <w:lang w:val="vi-VN"/>
+        </w:rPr>
+        <w:t>write memory</w:t>
+      </w:r>
+    </w:p>
+    <w:p>
+      <w:pPr>
+        <w:tabs>
+          <w:tab w:val="left" w:pos="3116"/>
+        </w:tabs>
+        <w:rPr>
+          <w:bCs/>
+          <w:sz w:val="26"/>
+          <w:szCs w:val="26"/>
+          <w:lang w:val="vi-VN"/>
+        </w:rPr>
+      </w:pPr>
+    </w:p>
+    <w:p>
+      <w:pPr>
+        <w:tabs>
+          <w:tab w:val="left" w:pos="3116"/>
+        </w:tabs>
+        <w:rPr>
+          <w:bCs/>
+          <w:sz w:val="26"/>
+          <w:szCs w:val="26"/>
+          <w:lang w:val="vi-VN"/>
+        </w:rPr>
+      </w:pPr>
+      <w:r>
+        <w:rPr>
+          <w:bCs/>
+          <w:sz w:val="26"/>
+          <w:szCs w:val="26"/>
+          <w:lang w:val="vi-VN"/>
+        </w:rPr>
+        <w:t>========== Tên thiết bị: R2 (router) ==========</w:t>
+      </w:r>
+    </w:p>
+    <w:p>
+      <w:pPr>
+        <w:tabs>
+          <w:tab w:val="left" w:pos="3116"/>
+        </w:tabs>
+        <w:rPr>
+          <w:bCs/>
+          <w:sz w:val="26"/>
+          <w:szCs w:val="26"/>
+          <w:lang w:val="vi-VN"/>
+        </w:rPr>
+      </w:pPr>
+      <w:r>
+        <w:rPr>
+          <w:bCs/>
+          <w:sz w:val="26"/>
+          <w:szCs w:val="26"/>
+          <w:lang w:val="vi-VN"/>
+        </w:rPr>
+        <w:t>enable</w:t>
+      </w:r>
+    </w:p>
+    <w:p>
+      <w:pPr>
+        <w:tabs>
+          <w:tab w:val="left" w:pos="3116"/>
+        </w:tabs>
+        <w:rPr>
+          <w:bCs/>
+          <w:sz w:val="26"/>
+          <w:szCs w:val="26"/>
+          <w:lang w:val="vi-VN"/>
+        </w:rPr>
+      </w:pPr>
+      <w:r>
+        <w:rPr>
+          <w:bCs/>
+          <w:sz w:val="26"/>
+          <w:szCs w:val="26"/>
+          <w:lang w:val="vi-VN"/>
+        </w:rPr>
+        <w:t>configure terminal</w:t>
+      </w:r>
+    </w:p>
+    <w:p>
+      <w:pPr>
+        <w:tabs>
+          <w:tab w:val="left" w:pos="3116"/>
+        </w:tabs>
+        <w:rPr>
+          <w:bCs/>
+          <w:sz w:val="26"/>
+          <w:szCs w:val="26"/>
+          <w:lang w:val="vi-VN"/>
+        </w:rPr>
+      </w:pPr>
+      <w:r>
+        <w:rPr>
+          <w:bCs/>
+          <w:sz w:val="26"/>
+          <w:szCs w:val="26"/>
+          <w:lang w:val="vi-VN"/>
+        </w:rPr>
+        <w:t>interface s1/0</w:t>
+      </w:r>
+    </w:p>
+    <w:p>
+      <w:pPr>
+        <w:tabs>
+          <w:tab w:val="left" w:pos="3116"/>
+        </w:tabs>
+        <w:rPr>
+          <w:bCs/>
+          <w:sz w:val="26"/>
+          <w:szCs w:val="26"/>
+          <w:lang w:val="vi-VN"/>
+        </w:rPr>
+      </w:pPr>
+      <w:r>
+        <w:rPr>
+          <w:bCs/>
+          <w:sz w:val="26"/>
+          <w:szCs w:val="26"/>
+          <w:lang w:val="vi-VN"/>
+        </w:rPr>
+        <w:t>ip address 12.12.12.2 255.255.255.252</w:t>
+      </w:r>
+    </w:p>
+    <w:p>
+      <w:pPr>
+        <w:tabs>
+          <w:tab w:val="left" w:pos="3116"/>
+        </w:tabs>
+        <w:rPr>
+          <w:bCs/>
+          <w:sz w:val="26"/>
+          <w:szCs w:val="26"/>
+          <w:lang w:val="vi-VN"/>
+        </w:rPr>
+      </w:pPr>
+      <w:r>
+        <w:rPr>
+          <w:bCs/>
+          <w:sz w:val="26"/>
+          <w:szCs w:val="26"/>
+          <w:lang w:val="vi-VN"/>
+        </w:rPr>
+        <w:t>no shutdown</w:t>
+      </w:r>
+    </w:p>
+    <w:p>
+      <w:pPr>
+        <w:tabs>
+          <w:tab w:val="left" w:pos="3116"/>
+        </w:tabs>
+        <w:rPr>
+          <w:bCs/>
+          <w:sz w:val="26"/>
+          <w:szCs w:val="26"/>
+          <w:lang w:val="vi-VN"/>
+        </w:rPr>
+      </w:pPr>
+      <w:r>
+        <w:rPr>
+          <w:bCs/>
+          <w:sz w:val="26"/>
+          <w:szCs w:val="26"/>
+          <w:lang w:val="vi-VN"/>
+        </w:rPr>
+        <w:t>interface s1/1</w:t>
+      </w:r>
+    </w:p>
+    <w:p>
+      <w:pPr>
+        <w:tabs>
+          <w:tab w:val="left" w:pos="3116"/>
+        </w:tabs>
+        <w:rPr>
+          <w:bCs/>
+          <w:sz w:val="26"/>
+          <w:szCs w:val="26"/>
+          <w:lang w:val="vi-VN"/>
+        </w:rPr>
+      </w:pPr>
+      <w:r>
+        <w:rPr>
+          <w:bCs/>
+          <w:sz w:val="26"/>
+          <w:szCs w:val="26"/>
+          <w:lang w:val="vi-VN"/>
+        </w:rPr>
+        <w:t>ip address 23.23.23.1 255.255.255.252</w:t>
+      </w:r>
+    </w:p>
+    <w:p>
+      <w:pPr>
+        <w:tabs>
+          <w:tab w:val="left" w:pos="3116"/>
+        </w:tabs>
+        <w:rPr>
+          <w:bCs/>
+          <w:sz w:val="26"/>
+          <w:szCs w:val="26"/>
+          <w:lang w:val="vi-VN"/>
+        </w:rPr>
+      </w:pPr>
+      <w:r>
+        <w:rPr>
+          <w:bCs/>
+          <w:sz w:val="26"/>
+          <w:szCs w:val="26"/>
+          <w:lang w:val="vi-VN"/>
+        </w:rPr>
+        <w:t>no shutdown</w:t>
+      </w:r>
+    </w:p>
+    <w:p>
+      <w:pPr>
+        <w:tabs>
+          <w:tab w:val="left" w:pos="3116"/>
+        </w:tabs>
+        <w:rPr>
+          <w:bCs/>
+          <w:sz w:val="26"/>
+          <w:szCs w:val="26"/>
+          <w:lang w:val="vi-VN"/>
+        </w:rPr>
+      </w:pPr>
+      <w:r>
+        <w:rPr>
+          <w:bCs/>
+          <w:sz w:val="26"/>
+          <w:szCs w:val="26"/>
+          <w:lang w:val="vi-VN"/>
+        </w:rPr>
+        <w:lastRenderedPageBreak/>
+        <w:t>interface e0/0</w:t>
+      </w:r>
+    </w:p>
+    <w:p>
+      <w:pPr>
+        <w:tabs>
+          <w:tab w:val="left" w:pos="3116"/>
+        </w:tabs>
+        <w:rPr>
+          <w:bCs/>
+          <w:sz w:val="26"/>
+          <w:szCs w:val="26"/>
+          <w:lang w:val="vi-VN"/>
+        </w:rPr>
+      </w:pPr>
+      <w:r>
+        <w:rPr>
+          <w:bCs/>
+          <w:sz w:val="26"/>
+          <w:szCs w:val="26"/>
+          <w:lang w:val="vi-VN"/>
+        </w:rPr>
+        <w:t>ip address 192.168.0.1 255.255.255.0</w:t>
+      </w:r>
+    </w:p>
+    <w:p>
+      <w:pPr>
+        <w:tabs>
+          <w:tab w:val="left" w:pos="3116"/>
+        </w:tabs>
+        <w:rPr>
+          <w:bCs/>
+          <w:sz w:val="26"/>
+          <w:szCs w:val="26"/>
+          <w:lang w:val="vi-VN"/>
+        </w:rPr>
+      </w:pPr>
+      <w:r>
+        <w:rPr>
+          <w:bCs/>
+          <w:sz w:val="26"/>
+          <w:szCs w:val="26"/>
+          <w:lang w:val="vi-VN"/>
+        </w:rPr>
+        <w:t>no shutdown</w:t>
+      </w:r>
+    </w:p>
+    <w:p>
+      <w:pPr>
+        <w:tabs>
+          <w:tab w:val="left" w:pos="3116"/>
+        </w:tabs>
+        <w:rPr>
+          <w:bCs/>
+          <w:sz w:val="26"/>
+          <w:szCs w:val="26"/>
+          <w:lang w:val="vi-VN"/>
+        </w:rPr>
+      </w:pPr>
+      <w:r>
+        <w:rPr>
+          <w:bCs/>
+          <w:sz w:val="26"/>
+          <w:szCs w:val="26"/>
+          <w:lang w:val="vi-VN"/>
+        </w:rPr>
+        <w:t>router ospf 1</w:t>
+      </w:r>
+    </w:p>
+    <w:p>
+      <w:pPr>
+        <w:tabs>
+          <w:tab w:val="left" w:pos="3116"/>
+        </w:tabs>
+        <w:rPr>
+          <w:bCs/>
+          <w:sz w:val="26"/>
+          <w:szCs w:val="26"/>
+          <w:lang w:val="vi-VN"/>
+        </w:rPr>
+      </w:pPr>
+      <w:r>
+        <w:rPr>
+          <w:bCs/>
+          <w:sz w:val="26"/>
+          <w:szCs w:val="26"/>
+          <w:lang w:val="vi-VN"/>
+        </w:rPr>
+        <w:t>network 12.12.12.0 0.0.0.3 area 0</w:t>
+      </w:r>
+    </w:p>
+    <w:p>
+      <w:pPr>
+        <w:tabs>
+          <w:tab w:val="left" w:pos="3116"/>
+        </w:tabs>
+        <w:rPr>
+          <w:bCs/>
+          <w:sz w:val="26"/>
+          <w:szCs w:val="26"/>
+          <w:lang w:val="vi-VN"/>
+        </w:rPr>
+      </w:pPr>
+      <w:r>
+        <w:rPr>
+          <w:bCs/>
+          <w:sz w:val="26"/>
+          <w:szCs w:val="26"/>
+          <w:lang w:val="vi-VN"/>
+        </w:rPr>
+        <w:t>network 192.168.0.0 0.0.0.255 area 0</w:t>
+      </w:r>
+    </w:p>
+    <w:p>
+      <w:pPr>
+        <w:tabs>
+          <w:tab w:val="left" w:pos="3116"/>
+        </w:tabs>
+        <w:rPr>
+          <w:bCs/>
+          <w:sz w:val="26"/>
+          <w:szCs w:val="26"/>
+          <w:lang w:val="vi-VN"/>
+        </w:rPr>
+      </w:pPr>
+      <w:r>
+        <w:rPr>
+          <w:bCs/>
+          <w:sz w:val="26"/>
+          <w:szCs w:val="26"/>
+          <w:lang w:val="vi-VN"/>
+        </w:rPr>
+        <w:t>redistribute rip subnets</w:t>
+      </w:r>
+    </w:p>
+    <w:p>
+      <w:pPr>
+        <w:tabs>
+          <w:tab w:val="left" w:pos="3116"/>
+        </w:tabs>
+        <w:rPr>
+          <w:bCs/>
+          <w:sz w:val="26"/>
+          <w:szCs w:val="26"/>
+          <w:lang w:val="vi-VN"/>
+        </w:rPr>
+      </w:pPr>
+      <w:r>
+        <w:rPr>
+          <w:bCs/>
+          <w:sz w:val="26"/>
+          <w:szCs w:val="26"/>
+          <w:lang w:val="vi-VN"/>
+        </w:rPr>
+        <w:t>router rip</w:t>
+      </w:r>
+    </w:p>
+    <w:p>
+      <w:pPr>
+        <w:tabs>
+          <w:tab w:val="left" w:pos="3116"/>
+        </w:tabs>
+        <w:rPr>
+          <w:bCs/>
+          <w:sz w:val="26"/>
+          <w:szCs w:val="26"/>
+          <w:lang w:val="vi-VN"/>
+        </w:rPr>
+      </w:pPr>
+      <w:r>
+        <w:rPr>
+          <w:bCs/>
+          <w:sz w:val="26"/>
+          <w:szCs w:val="26"/>
+          <w:lang w:val="vi-VN"/>
+        </w:rPr>
+        <w:t>network 23.0.0.0</w:t>
+      </w:r>
+    </w:p>
+    <w:p>
+      <w:pPr>
+        <w:tabs>
+          <w:tab w:val="left" w:pos="3116"/>
+        </w:tabs>
+        <w:rPr>
+          <w:bCs/>
+          <w:sz w:val="26"/>
+          <w:szCs w:val="26"/>
+          <w:lang w:val="vi-VN"/>
+        </w:rPr>
+      </w:pPr>
+      <w:r>
+        <w:rPr>
+          <w:bCs/>
+          <w:sz w:val="26"/>
+          <w:szCs w:val="26"/>
+          <w:lang w:val="vi-VN"/>
+        </w:rPr>
+        <w:t>redistribute ospf 1 metric 2</w:t>
+      </w:r>
+    </w:p>
+    <w:p>
+      <w:pPr>
+        <w:tabs>
+          <w:tab w:val="left" w:pos="3116"/>
+        </w:tabs>
+        <w:rPr>
+          <w:bCs/>
+          <w:sz w:val="26"/>
+          <w:szCs w:val="26"/>
+          <w:lang w:val="vi-VN"/>
+        </w:rPr>
+      </w:pPr>
+      <w:r>
+        <w:rPr>
+          <w:bCs/>
+          <w:sz w:val="26"/>
+          <w:szCs w:val="26"/>
+          <w:lang w:val="vi-VN"/>
+        </w:rPr>
+        <w:t>ip dhcp pool LAN_C2</w:t>
+      </w:r>
+    </w:p>
+    <w:p>
+      <w:pPr>
+        <w:tabs>
+          <w:tab w:val="left" w:pos="3116"/>
+        </w:tabs>
+        <w:rPr>
+          <w:bCs/>
+          <w:sz w:val="26"/>
+          <w:szCs w:val="26"/>
+          <w:lang w:val="vi-VN"/>
+        </w:rPr>
+      </w:pPr>
+      <w:r>
+        <w:rPr>
+          <w:bCs/>
+          <w:sz w:val="26"/>
+          <w:szCs w:val="26"/>
+          <w:lang w:val="vi-VN"/>
+        </w:rPr>
+        <w:t>network 192.168.0.0 255.255.255.0</w:t>
+      </w:r>
+    </w:p>
+    <w:p>
+      <w:pPr>
+        <w:tabs>
+          <w:tab w:val="left" w:pos="3116"/>
+        </w:tabs>
+        <w:rPr>
+          <w:bCs/>
+          <w:sz w:val="26"/>
+          <w:szCs w:val="26"/>
+          <w:lang w:val="vi-VN"/>
+        </w:rPr>
+      </w:pPr>
+      <w:r>
+        <w:rPr>
+          <w:bCs/>
+          <w:sz w:val="26"/>
+          <w:szCs w:val="26"/>
+          <w:lang w:val="vi-VN"/>
+        </w:rPr>
+        <w:t>default-router 192.168.0.1</w:t>
+      </w:r>
+    </w:p>
+    <w:p>
+      <w:pPr>
+        <w:tabs>
+          <w:tab w:val="left" w:pos="3116"/>
+        </w:tabs>
+        <w:rPr>
+          <w:bCs/>
+          <w:sz w:val="26"/>
+          <w:szCs w:val="26"/>
+          <w:lang w:val="vi-VN"/>
+        </w:rPr>
+      </w:pPr>
+      <w:r>
+        <w:rPr>
+          <w:bCs/>
+          <w:sz w:val="26"/>
+          <w:szCs w:val="26"/>
+          <w:lang w:val="vi-VN"/>
+        </w:rPr>
+        <w:t>end</w:t>
+      </w:r>
+    </w:p>
+    <w:p>
+      <w:pPr>
+        <w:tabs>
+          <w:tab w:val="left" w:pos="3116"/>
+        </w:tabs>
+        <w:rPr>
+          <w:bCs/>
+          <w:sz w:val="26"/>
+          <w:szCs w:val="26"/>
+          <w:lang w:val="vi-VN"/>
+        </w:rPr>
+      </w:pPr>
+      <w:r>
+        <w:rPr>
+          <w:bCs/>
+          <w:sz w:val="26"/>
+          <w:szCs w:val="26"/>
+          <w:lang w:val="vi-VN"/>
+        </w:rPr>
+        <w:t>write memory</w:t>
+      </w:r>
+    </w:p>
+    <w:p>
+      <w:pPr>
+        <w:tabs>
+          <w:tab w:val="left" w:pos="3116"/>
+        </w:tabs>
+        <w:rPr>
+          <w:bCs/>
+          <w:sz w:val="26"/>
+          <w:szCs w:val="26"/>
+          <w:lang w:val="vi-VN"/>
+        </w:rPr>
+      </w:pPr>
+    </w:p>
+    <w:p>
+      <w:pPr>
+        <w:tabs>
+          <w:tab w:val="left" w:pos="3116"/>
+        </w:tabs>
+        <w:rPr>
+          <w:bCs/>
+          <w:sz w:val="26"/>
+          <w:szCs w:val="26"/>
+          <w:lang w:val="vi-VN"/>
+        </w:rPr>
+      </w:pPr>
+      <w:r>
+        <w:rPr>
+          <w:bCs/>
+          <w:sz w:val="26"/>
+          <w:szCs w:val="26"/>
+          <w:lang w:val="vi-VN"/>
+        </w:rPr>
+        <w:t>========== Tên thiết bị: R3 (router) ==========</w:t>
+      </w:r>
+    </w:p>
+    <w:p>
+      <w:pPr>
+        <w:tabs>
+          <w:tab w:val="left" w:pos="3116"/>
+        </w:tabs>
+        <w:rPr>
+          <w:bCs/>
+          <w:sz w:val="26"/>
+          <w:szCs w:val="26"/>
+          <w:lang w:val="vi-VN"/>
+        </w:rPr>
+      </w:pPr>
+      <w:r>
+        <w:rPr>
+          <w:bCs/>
+          <w:sz w:val="26"/>
+          <w:szCs w:val="26"/>
+          <w:lang w:val="vi-VN"/>
+        </w:rPr>
+        <w:t>enable</w:t>
+      </w:r>
+    </w:p>
+    <w:p>
+      <w:pPr>
+        <w:tabs>
+          <w:tab w:val="left" w:pos="3116"/>
+        </w:tabs>
+        <w:rPr>
+          <w:bCs/>
+          <w:sz w:val="26"/>
+          <w:szCs w:val="26"/>
+          <w:lang w:val="vi-VN"/>
+        </w:rPr>
+      </w:pPr>
+      <w:r>
+        <w:rPr>
+          <w:bCs/>
+          <w:sz w:val="26"/>
+          <w:szCs w:val="26"/>
+          <w:lang w:val="vi-VN"/>
+        </w:rPr>
+        <w:t>configure terminal</w:t>
+      </w:r>
+    </w:p>
+    <w:p>
+      <w:pPr>
+        <w:tabs>
+          <w:tab w:val="left" w:pos="3116"/>
+        </w:tabs>
+        <w:rPr>
+          <w:bCs/>
+          <w:sz w:val="26"/>
+          <w:szCs w:val="26"/>
+          <w:lang w:val="vi-VN"/>
+        </w:rPr>
+      </w:pPr>
+      <w:r>
+        <w:rPr>
+          <w:bCs/>
+          <w:sz w:val="26"/>
+          <w:szCs w:val="26"/>
+          <w:lang w:val="vi-VN"/>
+        </w:rPr>
+        <w:t>interface s1/0</w:t>
+      </w:r>
+    </w:p>
+    <w:p>
+      <w:pPr>
+        <w:tabs>
+          <w:tab w:val="left" w:pos="3116"/>
+        </w:tabs>
+        <w:rPr>
+          <w:bCs/>
+          <w:sz w:val="26"/>
+          <w:szCs w:val="26"/>
+          <w:lang w:val="vi-VN"/>
+        </w:rPr>
+      </w:pPr>
+      <w:r>
+        <w:rPr>
+          <w:bCs/>
+          <w:sz w:val="26"/>
+          <w:szCs w:val="26"/>
+          <w:lang w:val="vi-VN"/>
+        </w:rPr>
+        <w:t>ip address 23.23.23.2 255.255.255.252</w:t>
+      </w:r>
+    </w:p>
+    <w:p>
+      <w:pPr>
+        <w:tabs>
+          <w:tab w:val="left" w:pos="3116"/>
+        </w:tabs>
+        <w:rPr>
+          <w:bCs/>
+          <w:sz w:val="26"/>
+          <w:szCs w:val="26"/>
+          <w:lang w:val="vi-VN"/>
+        </w:rPr>
+      </w:pPr>
+      <w:r>
+        <w:rPr>
+          <w:bCs/>
+          <w:sz w:val="26"/>
+          <w:szCs w:val="26"/>
+          <w:lang w:val="vi-VN"/>
+        </w:rPr>
+        <w:t>no shutdown</w:t>
+      </w:r>
+    </w:p>
+    <w:p>
+      <w:pPr>
+        <w:tabs>
+          <w:tab w:val="left" w:pos="3116"/>
+        </w:tabs>
+        <w:rPr>
+          <w:bCs/>
+          <w:sz w:val="26"/>
+          <w:szCs w:val="26"/>
+          <w:lang w:val="vi-VN"/>
+        </w:rPr>
+      </w:pPr>
+      <w:r>
+        <w:rPr>
+          <w:bCs/>
+          <w:sz w:val="26"/>
+          <w:szCs w:val="26"/>
+          <w:lang w:val="vi-VN"/>
+        </w:rPr>
+        <w:t>interface s1/1</w:t>
+      </w:r>
+    </w:p>
+    <w:p>
+      <w:pPr>
+        <w:tabs>
+          <w:tab w:val="left" w:pos="3116"/>
+        </w:tabs>
+        <w:rPr>
+          <w:bCs/>
+          <w:sz w:val="26"/>
+          <w:szCs w:val="26"/>
+          <w:lang w:val="vi-VN"/>
+        </w:rPr>
+      </w:pPr>
+      <w:r>
+        <w:rPr>
+          <w:bCs/>
+          <w:sz w:val="26"/>
+          <w:szCs w:val="26"/>
+          <w:lang w:val="vi-VN"/>
+        </w:rPr>
+        <w:t>ip address 34.34.34.1 255.255.255.252</w:t>
+      </w:r>
+    </w:p>
+    <w:p>
+      <w:pPr>
+        <w:tabs>
+          <w:tab w:val="left" w:pos="3116"/>
+        </w:tabs>
+        <w:rPr>
+          <w:bCs/>
+          <w:sz w:val="26"/>
+          <w:szCs w:val="26"/>
+          <w:lang w:val="vi-VN"/>
+        </w:rPr>
+      </w:pPr>
+      <w:r>
+        <w:rPr>
+          <w:bCs/>
+          <w:sz w:val="26"/>
+          <w:szCs w:val="26"/>
+          <w:lang w:val="vi-VN"/>
+        </w:rPr>
+        <w:t>no shutdown</w:t>
+      </w:r>
+    </w:p>
+    <w:p>
+      <w:pPr>
+        <w:tabs>
+          <w:tab w:val="left" w:pos="3116"/>
+        </w:tabs>
+        <w:rPr>
+          <w:bCs/>
+          <w:sz w:val="26"/>
+          <w:szCs w:val="26"/>
+          <w:lang w:val="vi-VN"/>
+        </w:rPr>
+      </w:pPr>
+      <w:r>
+        <w:rPr>
+          <w:bCs/>
+          <w:sz w:val="26"/>
+          <w:szCs w:val="26"/>
+          <w:lang w:val="vi-VN"/>
+        </w:rPr>
+        <w:t>interface e0/0</w:t>
+      </w:r>
+    </w:p>
+    <w:p>
+      <w:pPr>
+        <w:tabs>
+          <w:tab w:val="left" w:pos="3116"/>
+        </w:tabs>
+        <w:rPr>
+          <w:bCs/>
+          <w:sz w:val="26"/>
+          <w:szCs w:val="26"/>
+          <w:lang w:val="vi-VN"/>
+        </w:rPr>
+      </w:pPr>
+      <w:r>
+        <w:rPr>
+          <w:bCs/>
+          <w:sz w:val="26"/>
+          <w:szCs w:val="26"/>
+          <w:lang w:val="vi-VN"/>
+        </w:rPr>
+        <w:t>ip address 192.168.4.1 255.255.255.0</w:t>
+      </w:r>
+    </w:p>
+    <w:p>
+      <w:pPr>
+        <w:tabs>
+          <w:tab w:val="left" w:pos="3116"/>
+        </w:tabs>
+        <w:rPr>
+          <w:bCs/>
+          <w:sz w:val="26"/>
+          <w:szCs w:val="26"/>
+          <w:lang w:val="vi-VN"/>
+        </w:rPr>
+      </w:pPr>
+      <w:r>
+        <w:rPr>
+          <w:bCs/>
+          <w:sz w:val="26"/>
+          <w:szCs w:val="26"/>
+          <w:lang w:val="vi-VN"/>
+        </w:rPr>
+        <w:lastRenderedPageBreak/>
+        <w:t>no shutdown</w:t>
+      </w:r>
+    </w:p>
+    <w:p>
+      <w:pPr>
+        <w:tabs>
+          <w:tab w:val="left" w:pos="3116"/>
+        </w:tabs>
+        <w:rPr>
+          <w:bCs/>
+          <w:sz w:val="26"/>
+          <w:szCs w:val="26"/>
+          <w:lang w:val="vi-VN"/>
+        </w:rPr>
+      </w:pPr>
+      <w:r>
+        <w:rPr>
+          <w:bCs/>
+          <w:sz w:val="26"/>
+          <w:szCs w:val="26"/>
+          <w:lang w:val="vi-VN"/>
+        </w:rPr>
+        <w:t>router rip</w:t>
+      </w:r>
+    </w:p>
+    <w:p>
+      <w:pPr>
+        <w:tabs>
+          <w:tab w:val="left" w:pos="3116"/>
+        </w:tabs>
+        <w:rPr>
+          <w:bCs/>
+          <w:sz w:val="26"/>
+          <w:szCs w:val="26"/>
+          <w:lang w:val="vi-VN"/>
+        </w:rPr>
+      </w:pPr>
+      <w:r>
+        <w:rPr>
+          <w:bCs/>
+          <w:sz w:val="26"/>
+          <w:szCs w:val="26"/>
+          <w:lang w:val="vi-VN"/>
+        </w:rPr>
+        <w:t>network 23.0.0.0</w:t>
+      </w:r>
+    </w:p>
+    <w:p>
+      <w:pPr>
+        <w:tabs>
+          <w:tab w:val="left" w:pos="3116"/>
+        </w:tabs>
+        <w:rPr>
+          <w:bCs/>
+          <w:sz w:val="26"/>
+          <w:szCs w:val="26"/>
+          <w:lang w:val="vi-VN"/>
+        </w:rPr>
+      </w:pPr>
+      <w:r>
+        <w:rPr>
+          <w:bCs/>
+          <w:sz w:val="26"/>
+          <w:szCs w:val="26"/>
+          <w:lang w:val="vi-VN"/>
+        </w:rPr>
+        <w:t>network 34.0.0.0</w:t>
+      </w:r>
+    </w:p>
+    <w:p>
+      <w:pPr>
+        <w:tabs>
+          <w:tab w:val="left" w:pos="3116"/>
+        </w:tabs>
+        <w:rPr>
+          <w:bCs/>
+          <w:sz w:val="26"/>
+          <w:szCs w:val="26"/>
+          <w:lang w:val="vi-VN"/>
+        </w:rPr>
+      </w:pPr>
+      <w:r>
+        <w:rPr>
+          <w:bCs/>
+          <w:sz w:val="26"/>
+          <w:szCs w:val="26"/>
+          <w:lang w:val="vi-VN"/>
+        </w:rPr>
+        <w:t>network 192.168.4.0</w:t>
+      </w:r>
+    </w:p>
+    <w:p>
+      <w:pPr>
+        <w:tabs>
+          <w:tab w:val="left" w:pos="3116"/>
+        </w:tabs>
+        <w:rPr>
+          <w:bCs/>
+          <w:sz w:val="26"/>
+          <w:szCs w:val="26"/>
+          <w:lang w:val="vi-VN"/>
+        </w:rPr>
+      </w:pPr>
+      <w:r>
+        <w:rPr>
+          <w:bCs/>
+          <w:sz w:val="26"/>
+          <w:szCs w:val="26"/>
+          <w:lang w:val="vi-VN"/>
+        </w:rPr>
+        <w:t>ip dhcp pool LAN_C3</w:t>
+      </w:r>
+    </w:p>
+    <w:p>
+      <w:pPr>
+        <w:tabs>
+          <w:tab w:val="left" w:pos="3116"/>
+        </w:tabs>
+        <w:rPr>
+          <w:bCs/>
+          <w:sz w:val="26"/>
+          <w:szCs w:val="26"/>
+          <w:lang w:val="vi-VN"/>
+        </w:rPr>
+      </w:pPr>
+      <w:r>
+        <w:rPr>
+          <w:bCs/>
+          <w:sz w:val="26"/>
+          <w:szCs w:val="26"/>
+          <w:lang w:val="vi-VN"/>
+        </w:rPr>
+        <w:t>network 192.168.4.0 255.255.255.0</w:t>
+      </w:r>
+    </w:p>
+    <w:p>
+      <w:pPr>
+        <w:tabs>
+          <w:tab w:val="left" w:pos="3116"/>
+        </w:tabs>
+        <w:rPr>
+          <w:bCs/>
+          <w:sz w:val="26"/>
+          <w:szCs w:val="26"/>
+          <w:lang w:val="vi-VN"/>
+        </w:rPr>
+      </w:pPr>
+      <w:r>
+        <w:rPr>
+          <w:bCs/>
+          <w:sz w:val="26"/>
+          <w:szCs w:val="26"/>
+          <w:lang w:val="vi-VN"/>
+        </w:rPr>
+        <w:t>default-router 192.168.4.1</w:t>
+      </w:r>
+    </w:p>
+    <w:p>
+      <w:pPr>
+        <w:tabs>
+          <w:tab w:val="left" w:pos="3116"/>
+        </w:tabs>
+        <w:rPr>
+          <w:bCs/>
+          <w:sz w:val="26"/>
+          <w:szCs w:val="26"/>
+          <w:lang w:val="vi-VN"/>
+        </w:rPr>
+      </w:pPr>
+      <w:r>
+        <w:rPr>
+          <w:bCs/>
+          <w:sz w:val="26"/>
+          <w:szCs w:val="26"/>
+          <w:lang w:val="vi-VN"/>
+        </w:rPr>
+        <w:t>end</w:t>
+      </w:r>
+    </w:p>
+    <w:p>
+      <w:pPr>
+        <w:tabs>
+          <w:tab w:val="left" w:pos="3116"/>
+        </w:tabs>
+        <w:rPr>
+          <w:bCs/>
+          <w:sz w:val="26"/>
+          <w:szCs w:val="26"/>
+          <w:lang w:val="vi-VN"/>
+        </w:rPr>
+      </w:pPr>
+      <w:r>
+        <w:rPr>
+          <w:bCs/>
+          <w:sz w:val="26"/>
+          <w:szCs w:val="26"/>
+          <w:lang w:val="vi-VN"/>
+        </w:rPr>
+        <w:t>write memory</w:t>
+      </w:r>
+    </w:p>
+    <w:p>
+      <w:pPr>
+        <w:tabs>
+          <w:tab w:val="left" w:pos="3116"/>
+        </w:tabs>
+        <w:rPr>
+          <w:bCs/>
+          <w:sz w:val="26"/>
+          <w:szCs w:val="26"/>
+          <w:lang w:val="vi-VN"/>
+        </w:rPr>
+      </w:pPr>
+    </w:p>
+    <w:p>
+      <w:pPr>
+        <w:tabs>
+          <w:tab w:val="left" w:pos="3116"/>
+        </w:tabs>
+        <w:rPr>
+          <w:bCs/>
+          <w:sz w:val="26"/>
+          <w:szCs w:val="26"/>
+          <w:lang w:val="vi-VN"/>
+        </w:rPr>
+      </w:pPr>
+      <w:r>
+        <w:rPr>
+          <w:bCs/>
+          <w:sz w:val="26"/>
+          <w:szCs w:val="26"/>
+          <w:lang w:val="vi-VN"/>
+        </w:rPr>
+        <w:t>========== Tên thiết bị: R4 (router) ==========</w:t>
+      </w:r>
+    </w:p>
+    <w:p>
+      <w:pPr>
+        <w:tabs>
+          <w:tab w:val="left" w:pos="3116"/>
+        </w:tabs>
+        <w:rPr>
+          <w:bCs/>
+          <w:sz w:val="26"/>
+          <w:szCs w:val="26"/>
+          <w:lang w:val="vi-VN"/>
+        </w:rPr>
+      </w:pPr>
+      <w:r>
+        <w:rPr>
+          <w:bCs/>
+          <w:sz w:val="26"/>
+          <w:szCs w:val="26"/>
+          <w:lang w:val="vi-VN"/>
+        </w:rPr>
+        <w:t>enable</w:t>
+      </w:r>
+    </w:p>
+    <w:p>
+      <w:pPr>
+        <w:tabs>
+          <w:tab w:val="left" w:pos="3116"/>
+        </w:tabs>
+        <w:rPr>
+          <w:bCs/>
+          <w:sz w:val="26"/>
+          <w:szCs w:val="26"/>
+          <w:lang w:val="vi-VN"/>
+        </w:rPr>
+      </w:pPr>
+      <w:r>
+        <w:rPr>
+          <w:bCs/>
+          <w:sz w:val="26"/>
+          <w:szCs w:val="26"/>
+          <w:lang w:val="vi-VN"/>
+        </w:rPr>
+        <w:t>configure terminal</w:t>
+      </w:r>
+    </w:p>
+    <w:p>
+      <w:pPr>
+        <w:tabs>
+          <w:tab w:val="left" w:pos="3116"/>
+        </w:tabs>
+        <w:rPr>
+          <w:bCs/>
+          <w:sz w:val="26"/>
+          <w:szCs w:val="26"/>
+          <w:lang w:val="vi-VN"/>
+        </w:rPr>
+      </w:pPr>
+      <w:r>
+        <w:rPr>
+          <w:bCs/>
+          <w:sz w:val="26"/>
+          <w:szCs w:val="26"/>
+          <w:lang w:val="vi-VN"/>
+        </w:rPr>
+        <w:t>interface s1/0</w:t>
+      </w:r>
+    </w:p>
+    <w:p>
+      <w:pPr>
+        <w:tabs>
+          <w:tab w:val="left" w:pos="3116"/>
+        </w:tabs>
+        <w:rPr>
+          <w:bCs/>
+          <w:sz w:val="26"/>
+          <w:szCs w:val="26"/>
+          <w:lang w:val="vi-VN"/>
+        </w:rPr>
+      </w:pPr>
+      <w:r>
+        <w:rPr>
+          <w:bCs/>
+          <w:sz w:val="26"/>
+          <w:szCs w:val="26"/>
+          <w:lang w:val="vi-VN"/>
+        </w:rPr>
+        <w:t>ip address 34.34.34.2 255.255.255.252</w:t>
+      </w:r>
+    </w:p>
+    <w:p>
+      <w:pPr>
+        <w:tabs>
+          <w:tab w:val="left" w:pos="3116"/>
+        </w:tabs>
+        <w:rPr>
+          <w:bCs/>
+          <w:sz w:val="26"/>
+          <w:szCs w:val="26"/>
+          <w:lang w:val="vi-VN"/>
+        </w:rPr>
+      </w:pPr>
+      <w:r>
+        <w:rPr>
+          <w:bCs/>
+          <w:sz w:val="26"/>
+          <w:szCs w:val="26"/>
+          <w:lang w:val="vi-VN"/>
+        </w:rPr>
+        <w:t>no shutdown</w:t>
+      </w:r>
+    </w:p>
+    <w:p>
+      <w:pPr>
+        <w:tabs>
+          <w:tab w:val="left" w:pos="3116"/>
+        </w:tabs>
+        <w:rPr>
+          <w:bCs/>
+          <w:sz w:val="26"/>
+          <w:szCs w:val="26"/>
+          <w:lang w:val="vi-VN"/>
+        </w:rPr>
+      </w:pPr>
+      <w:r>
+        <w:rPr>
+          <w:bCs/>
+          <w:sz w:val="26"/>
+          <w:szCs w:val="26"/>
+          <w:lang w:val="vi-VN"/>
+        </w:rPr>
+        <w:t>router rip</w:t>
+      </w:r>
+    </w:p>
+    <w:p>
+      <w:pPr>
+        <w:tabs>
+          <w:tab w:val="left" w:pos="3116"/>
+        </w:tabs>
+        <w:rPr>
+          <w:bCs/>
+          <w:sz w:val="26"/>
+          <w:szCs w:val="26"/>
+          <w:lang w:val="vi-VN"/>
+        </w:rPr>
+      </w:pPr>
+      <w:r>
+        <w:rPr>
+          <w:bCs/>
+          <w:sz w:val="26"/>
+          <w:szCs w:val="26"/>
+          <w:lang w:val="vi-VN"/>
+        </w:rPr>
+        <w:t>network 34.0.0.0</w:t>
+      </w:r>
+    </w:p>
+    <w:p>
+      <w:pPr>
+        <w:tabs>
+          <w:tab w:val="left" w:pos="3116"/>
+        </w:tabs>
+        <w:rPr>
+          <w:bCs/>
+          <w:sz w:val="26"/>
+          <w:szCs w:val="26"/>
+          <w:lang w:val="vi-VN"/>
+        </w:rPr>
+      </w:pPr>
+      <w:r>
+        <w:rPr>
+          <w:bCs/>
+          <w:sz w:val="26"/>
+          <w:szCs w:val="26"/>
+          <w:lang w:val="vi-VN"/>
+        </w:rPr>
+        <w:t>end</w:t>
+      </w:r>
+    </w:p>
+    <w:p>
+      <w:pPr>
+        <w:tabs>
+          <w:tab w:val="left" w:pos="3116"/>
+        </w:tabs>
+        <w:rPr>
+          <w:bCs/>
+          <w:sz w:val="26"/>
+          <w:szCs w:val="26"/>
+          <w:lang w:val="vi-VN"/>
+        </w:rPr>
+      </w:pPr>
+      <w:r>
+        <w:rPr>
+          <w:bCs/>
+          <w:sz w:val="26"/>
+          <w:szCs w:val="26"/>
+          <w:lang w:val="vi-VN"/>
+        </w:rPr>
+        <w:t>write memory</w:t>
+      </w:r>
+    </w:p>
+    <w:p>
+      <w:pPr>
+        <w:tabs>
+          <w:tab w:val="left" w:pos="3116"/>
+        </w:tabs>
+        <w:rPr>
+          <w:bCs/>
+          <w:sz w:val="26"/>
+          <w:szCs w:val="26"/>
+          <w:lang w:val="vi-VN"/>
+        </w:rPr>
+      </w:pPr>
+    </w:p>
+    <w:p>
+      <w:pPr>
+        <w:tabs>
+          <w:tab w:val="left" w:pos="3116"/>
+        </w:tabs>
+        <w:rPr>
+          <w:bCs/>
+          <w:sz w:val="26"/>
+          <w:szCs w:val="26"/>
+          <w:lang w:val="vi-VN"/>
+        </w:rPr>
+      </w:pPr>
+      <w:r>
+        <w:rPr>
+          <w:bCs/>
+          <w:sz w:val="26"/>
+          <w:szCs w:val="26"/>
+          <w:lang w:val="vi-VN"/>
+        </w:rPr>
+        <w:t>========== Tên thiết bị: C1 (vpcs) ==========</w:t>
+      </w:r>
+    </w:p>
+    <w:p>
+      <w:pPr>
+        <w:tabs>
+          <w:tab w:val="left" w:pos="3116"/>
+        </w:tabs>
+        <w:rPr>
+          <w:bCs/>
+          <w:sz w:val="26"/>
+          <w:szCs w:val="26"/>
+          <w:lang w:val="vi-VN"/>
+        </w:rPr>
+      </w:pPr>
+      <w:r>
+        <w:rPr>
+          <w:bCs/>
+          <w:sz w:val="26"/>
+          <w:szCs w:val="26"/>
+          <w:lang w:val="vi-VN"/>
+        </w:rPr>
+        <w:t>ip dhcp</w:t>
+      </w:r>
+    </w:p>
+    <w:p>
+      <w:pPr>
+        <w:tabs>
+          <w:tab w:val="left" w:pos="3116"/>
+        </w:tabs>
+        <w:rPr>
+          <w:bCs/>
+          <w:sz w:val="26"/>
+          <w:szCs w:val="26"/>
+          <w:lang w:val="vi-VN"/>
+        </w:rPr>
+      </w:pPr>
+      <w:r>
+        <w:rPr>
+          <w:bCs/>
+          <w:sz w:val="26"/>
+          <w:szCs w:val="26"/>
+          <w:lang w:val="vi-VN"/>
+        </w:rPr>
+        <w:t>save</w:t>
+      </w:r>
+    </w:p>
+    <w:p>
+      <w:pPr>
+        <w:tabs>
+          <w:tab w:val="left" w:pos="3116"/>
+        </w:tabs>
+        <w:rPr>
+          <w:bCs/>
+          <w:sz w:val="26"/>
+          <w:szCs w:val="26"/>
+          <w:lang w:val="vi-VN"/>
+        </w:rPr>
+      </w:pPr>
+    </w:p>
+    <w:p>
+      <w:pPr>
+        <w:tabs>
+          <w:tab w:val="left" w:pos="3116"/>
+        </w:tabs>
+        <w:rPr>
+          <w:bCs/>
+          <w:sz w:val="26"/>
+          <w:szCs w:val="26"/>
+          <w:lang w:val="vi-VN"/>
+        </w:rPr>
+      </w:pPr>
+      <w:r>
+        <w:rPr>
+          <w:bCs/>
+          <w:sz w:val="26"/>
+          <w:szCs w:val="26"/>
+          <w:lang w:val="vi-VN"/>
+        </w:rPr>
+        <w:t>========== Tên thiết bị: C2 (vpcs) ==========</w:t>
+      </w:r>
+    </w:p>
+    <w:p>
+      <w:pPr>
+        <w:tabs>
+          <w:tab w:val="left" w:pos="3116"/>
+        </w:tabs>
+        <w:rPr>
+          <w:bCs/>
+          <w:sz w:val="26"/>
+          <w:szCs w:val="26"/>
+          <w:lang w:val="vi-VN"/>
+        </w:rPr>
+      </w:pPr>
+      <w:r>
+        <w:rPr>
+          <w:bCs/>
+          <w:sz w:val="26"/>
+          <w:szCs w:val="26"/>
+          <w:lang w:val="vi-VN"/>
+        </w:rPr>
+        <w:lastRenderedPageBreak/>
+        <w:t>ip dhcp</w:t>
+      </w:r>
+    </w:p>
+    <w:p>
+      <w:pPr>
+        <w:tabs>
+          <w:tab w:val="left" w:pos="3116"/>
+        </w:tabs>
+        <w:rPr>
+          <w:bCs/>
+          <w:sz w:val="26"/>
+          <w:szCs w:val="26"/>
+          <w:lang w:val="vi-VN"/>
+        </w:rPr>
+      </w:pPr>
+      <w:r>
+        <w:rPr>
+          <w:bCs/>
+          <w:sz w:val="26"/>
+          <w:szCs w:val="26"/>
+          <w:lang w:val="vi-VN"/>
+        </w:rPr>
+        <w:t>save</w:t>
+      </w:r>
+    </w:p>
+    <w:p>
+      <w:pPr>
+        <w:tabs>
+          <w:tab w:val="left" w:pos="3116"/>
+        </w:tabs>
+        <w:rPr>
+          <w:bCs/>
+          <w:sz w:val="26"/>
+          <w:szCs w:val="26"/>
+          <w:lang w:val="vi-VN"/>
+        </w:rPr>
+      </w:pPr>
+    </w:p>
+    <w:p>
+      <w:pPr>
+        <w:tabs>
+          <w:tab w:val="left" w:pos="3116"/>
+        </w:tabs>
+        <w:rPr>
+          <w:bCs/>
+          <w:sz w:val="26"/>
+          <w:szCs w:val="26"/>
+          <w:lang w:val="vi-VN"/>
+        </w:rPr>
+      </w:pPr>
+      <w:r>
+        <w:rPr>
+          <w:bCs/>
+          <w:sz w:val="26"/>
+          <w:szCs w:val="26"/>
+          <w:lang w:val="vi-VN"/>
+        </w:rPr>
+        <w:t>========== Tên thiết bị: C3 (vpcs) ==========</w:t>
+      </w:r>
+    </w:p>
+    <w:p>
+      <w:pPr>
+        <w:tabs>
+          <w:tab w:val="left" w:pos="3116"/>
+        </w:tabs>
+        <w:rPr>
+          <w:bCs/>
+          <w:sz w:val="26"/>
+          <w:szCs w:val="26"/>
+          <w:lang w:val="vi-VN"/>
+        </w:rPr>
+      </w:pPr>
+      <w:r>
+        <w:rPr>
+          <w:bCs/>
+          <w:sz w:val="26"/>
+          <w:szCs w:val="26"/>
+          <w:lang w:val="vi-VN"/>
+        </w:rPr>
+        <w:t>ip dhcp</w:t>
+      </w:r>
+    </w:p>
+    <w:p>
+      <w:pPr>
+        <w:tabs>
+          <w:tab w:val="left" w:pos="3116"/>
+        </w:tabs>
+        <w:rPr>
+          <w:bCs/>
+          <w:sz w:val="26"/>
+          <w:szCs w:val="26"/>
+          <w:lang w:val="vi-VN"/>
+        </w:rPr>
+      </w:pPr>
+      <w:r>
+        <w:rPr>
+          <w:bCs/>
+          <w:sz w:val="26"/>
+          <w:szCs w:val="26"/>
+          <w:lang w:val="vi-VN"/>
+        </w:rPr>
+        <w:t>save</w:t>
+      </w:r>
+    </w:p>
+    <w:p>
+      <w:pPr>
+        <w:tabs>
+          <w:tab w:val="left" w:pos="3116"/>
+        </w:tabs>
+        <w:rPr>
+          <w:bCs/>
+          <w:sz w:val="26"/>
+          <w:szCs w:val="26"/>
+          <w:lang w:val="vi-VN"/>
+        </w:rPr>
+      </w:pPr>
+    </w:p>
+    <w:p>
+      <w:pPr>
+        <w:tabs>
+          <w:tab w:val="left" w:pos="3116"/>
+        </w:tabs>
+        <w:rPr>
+          <w:bCs/>
+          <w:sz w:val="26"/>
+          <w:szCs w:val="26"/>
+          <w:lang w:val="vi-VN"/>
+        </w:rPr>
+      </w:pPr>
+      <w:r>
+        <w:rPr>
+          <w:bCs/>
+          <w:sz w:val="26"/>
+          <w:szCs w:val="26"/>
+          <w:lang w:val="vi-VN"/>
+        </w:rPr>
+        <w:t>câu 3</w:t>
+      </w:r>
+    </w:p>
+    <w:p>
+      <w:pPr>
+        <w:tabs>
+          <w:tab w:val="left" w:pos="3116"/>
+        </w:tabs>
+        <w:rPr>
+          <w:bCs/>
+          <w:sz w:val="26"/>
+          <w:szCs w:val="26"/>
+          <w:lang w:val="vi-VN"/>
+        </w:rPr>
+      </w:pPr>
+    </w:p>
+    <w:p>
+      <w:pPr>
+        <w:tabs>
+          <w:tab w:val="left" w:pos="3116"/>
+        </w:tabs>
+        <w:rPr>
+          <w:bCs/>
+          <w:sz w:val="26"/>
+          <w:szCs w:val="26"/>
+          <w:lang w:val="vi-VN"/>
+        </w:rPr>
+      </w:pPr>
+      <w:r>
+        <w:rPr>
+          <w:bCs/>
+          <w:sz w:val="26"/>
+          <w:szCs w:val="26"/>
+          <w:lang w:val="vi-VN"/>
+        </w:rPr>
+        <w:drawing>
+          <wp:inline distT="0" distB="0" distL="0" distR="0" wp14:anchorId="0C8731BB" wp14:editId="0E1200E1">
+            <wp:extent cx="5943600" cy="2464435"/>
+            <wp:effectExtent l="0" t="0" r="0" b="0"/>
+            <wp:docPr id="1485622680" name="Picture 1"/>
+            <wp:cNvGraphicFramePr>
+              <a:graphicFrameLocks xmlns:a="http://schemas.openxmlformats.org/drawingml/2006/main" noChangeAspect="1"/>
+            </wp:cNvGraphicFramePr>
+            <a:graphic xmlns:a="http://schemas.openxmlformats.org/drawingml/2006/main">
+              <a:graphicData uri="http://schemas.openxmlformats.org/drawingml/2006/picture">
+                <pic:pic xmlns:pic="http://schemas.openxmlformats.org/drawingml/2006/picture">
+                  <pic:nvPicPr>
+                    <pic:cNvPr id="1485622680" name=""/>
+                    <pic:cNvPicPr/>
+                  </pic:nvPicPr>
+                  <pic:blipFill>
+                    <a:blip r:embed="rId32"/>
+                    <a:stretch>
+                      <a:fillRect/>
+                    </a:stretch>
+                  </pic:blipFill>
+                  <pic:spPr>
+                    <a:xfrm>
+                      <a:off x="0" y="0"/>
+                      <a:ext cx="5943600" cy="2464435"/>
+                    </a:xfrm>
+                    <a:prstGeom prst="rect">
+                      <a:avLst/>
+                    </a:prstGeom>
+                  </pic:spPr>
+                </pic:pic>
+              </a:graphicData>
+            </a:graphic>
+          </wp:inline>
+        </w:drawing>
+      </w:r>
+    </w:p>
+    <w:p>
+      <w:pPr>
+        <w:tabs>
+          <w:tab w:val="left" w:pos="3116"/>
+        </w:tabs>
+        <w:rPr>
+          <w:bCs/>
+          <w:sz w:val="26"/>
+          <w:szCs w:val="26"/>
+          <w:lang w:val="vi-VN"/>
+        </w:rPr>
+      </w:pPr>
+    </w:p>
+    <w:p>
+      <w:pPr>
+        <w:tabs>
+          <w:tab w:val="left" w:pos="3116"/>
+        </w:tabs>
+        <w:rPr>
+          <w:bCs/>
+          <w:sz w:val="26"/>
+          <w:szCs w:val="26"/>
+          <w:lang w:val="vi-VN"/>
+        </w:rPr>
+      </w:pPr>
+    </w:p>
+    <w:p>
+      <w:pPr>
+        <w:tabs>
+          <w:tab w:val="left" w:pos="3116"/>
+        </w:tabs>
+        <w:rPr>
+          <w:bCs/>
+          <w:sz w:val="26"/>
+          <w:szCs w:val="26"/>
+          <w:lang w:val="vi-VN"/>
+        </w:rPr>
+      </w:pPr>
+      <w:r>
+        <w:rPr>
+          <w:bCs/>
+          <w:sz w:val="26"/>
+          <w:szCs w:val="26"/>
+          <w:lang w:val="vi-VN"/>
+        </w:rPr>
+        <w:t>Máy C1 (thuộc vùng OSPF) đã ping thành công tới máy C3 (thuộc vùng RIP). Điều này chứng minh quá trình phân phối lại tuyến đường (Redistribute) trên R2 đã hoạt động hoàn hảo, cho phép 2 giao thức định tuyến OSPF và RIP giao tiếp được với nhau.</w:t>
+      </w:r>
+    </w:p>
+    <w:p>
+      <w:pPr>
+        <w:tabs>
+          <w:tab w:val="left" w:pos="3116"/>
+        </w:tabs>
+        <w:rPr>
+          <w:bCs/>
+          <w:sz w:val="26"/>
+          <w:szCs w:val="26"/>
+          <w:lang w:val="vi-VN"/>
+        </w:rPr>
+      </w:pPr>
+    </w:p>
+    <w:p>
+      <w:pPr>
+        <w:tabs>
+          <w:tab w:val="left" w:pos="3116"/>
+        </w:tabs>
+        <w:rPr>
+          <w:bCs/>
+          <w:sz w:val="26"/>
+          <w:szCs w:val="26"/>
+          <w:lang w:val="vi-VN"/>
+        </w:rPr>
+      </w:pPr>
+      <w:r>
+        <w:rPr>
+          <w:bCs/>
+          <w:sz w:val="26"/>
+          <w:szCs w:val="26"/>
+          <w:lang w:val="vi-VN"/>
+        </w:rPr>
+        <w:t>Câu 4</w:t>
+      </w:r>
+    </w:p>
+    <w:p>
+      <w:pPr>
+        <w:tabs>
+          <w:tab w:val="left" w:pos="3116"/>
+        </w:tabs>
+        <w:rPr>
+          <w:bCs/>
+          <w:sz w:val="26"/>
+          <w:szCs w:val="26"/>
+          <w:lang w:val="vi-VN"/>
+        </w:rPr>
         <w:sectPr>
-          <w:headerReference w:type="default" r:id="rId32"/>
-          <w:footerReference w:type="default" r:id="rId33"/>
+          <w:headerReference w:type="default" r:id="rId33"/>
+          <w:footerReference w:type="default" r:id="rId34"/>
           <w:pgSz w:w="12240" w:h="15840"/>
           <w:pgMar w:top="1080" w:right="1440" w:bottom="1440" w:left="1440" w:header="720" w:footer="720" w:gutter="0"/>
           <w:cols w:space="720"/>
@@ -10949,19 +13124,141 @@
           <w:szCs w:val="26"/>
           <w:lang w:val="vi-VN"/>
         </w:rPr>
-        <w:t>Giao thức OSPF trên khu vực mạng dùng chung 192.168.123.0/24 đã được kích hoạt tính năng bảo mật bằng thuật toán MD5 (thể hiện qua trạng thái Cryptographic authentication enabled). Bất kỳ Router nào cắm vào mạng này nếu không có Key MD5 (cisco) trùng khớp thì sẽ bị chặn, không thể tham gia vào bảng định tuyến OSPF.</w:t>
-      </w:r>
-    </w:p>
-    <w:p>
-      <w:pPr>
-        <w:rPr>
-          <w:bCs/>
-          <w:lang w:val="vi-VN"/>
-        </w:rPr>
-      </w:pPr>
+        <w:lastRenderedPageBreak/>
+        <w:drawing>
+          <wp:inline distT="0" distB="0" distL="0" distR="0" wp14:anchorId="3CA27C3E" wp14:editId="4085219A">
+            <wp:extent cx="5210902" cy="3991532"/>
+            <wp:effectExtent l="0" t="0" r="8890" b="9525"/>
+            <wp:docPr id="2023899239" name="Picture 1"/>
+            <wp:cNvGraphicFramePr>
+              <a:graphicFrameLocks xmlns:a="http://schemas.openxmlformats.org/drawingml/2006/main" noChangeAspect="1"/>
+            </wp:cNvGraphicFramePr>
+            <a:graphic xmlns:a="http://schemas.openxmlformats.org/drawingml/2006/main">
+              <a:graphicData uri="http://schemas.openxmlformats.org/drawingml/2006/picture">
+                <pic:pic xmlns:pic="http://schemas.openxmlformats.org/drawingml/2006/picture">
+                  <pic:nvPicPr>
+                    <pic:cNvPr id="2023899239" name=""/>
+                    <pic:cNvPicPr/>
+                  </pic:nvPicPr>
+                  <pic:blipFill>
+                    <a:blip r:embed="rId35"/>
+                    <a:stretch>
+                      <a:fillRect/>
+                    </a:stretch>
+                  </pic:blipFill>
+                  <pic:spPr>
+                    <a:xfrm>
+                      <a:off x="0" y="0"/>
+                      <a:ext cx="5210902" cy="3991532"/>
+                    </a:xfrm>
+                    <a:prstGeom prst="rect">
+                      <a:avLst/>
+                    </a:prstGeom>
+                  </pic:spPr>
+                </pic:pic>
+              </a:graphicData>
+            </a:graphic>
+          </wp:inline>
+        </w:drawing>
+      </w:r>
+    </w:p>
+    <w:p>
+      <w:pPr>
+        <w:rPr>
+          <w:bCs/>
+          <w:lang w:val="vi-VN"/>
+        </w:rPr>
+      </w:pPr>
+      <w:r>
+        <w:rPr>
+          <w:bCs/>
+          <w:lang w:val="vi-VN"/>
+        </w:rPr>
+        <w:lastRenderedPageBreak/>
+        <w:t>R2 đóng vai trò là ASBR (Autonomous System Boundary Router) đứng giữa 2 vùng định tuyến. Bảng định tuyến R2 có chứa chữ "O" (OSPF) cho thấy nó học được dải 192.168.1.0/24 từ R1 qua giao thức OSPF. Đồng thời chứa chữ "R" (RIP) cho thấy nó học được dải 192.168.4.0/24 từ R3 qua giao thức RIP. R2 đã kết nối thành công 2 vùng này.</w:t>
+      </w:r>
+    </w:p>
+    <w:p>
+      <w:pPr>
+        <w:rPr>
+          <w:bCs/>
+          <w:lang w:val="vi-VN"/>
+        </w:rPr>
+      </w:pPr>
+      <w:r>
+        <w:rPr>
+          <w:bCs/>
+          <w:lang w:val="vi-VN"/>
+        </w:rPr>
+        <w:t>Câu 5</w:t>
+      </w:r>
+    </w:p>
+    <w:p>
+      <w:pPr>
+        <w:rPr>
+          <w:bCs/>
+          <w:lang w:val="vi-VN"/>
+        </w:rPr>
+      </w:pPr>
+      <w:r>
+        <w:rPr>
+          <w:bCs/>
+          <w:lang w:val="vi-VN"/>
+        </w:rPr>
+        <w:drawing>
+          <wp:inline distT="0" distB="0" distL="0" distR="0" wp14:anchorId="173F36F8" wp14:editId="6F2C921F">
+            <wp:extent cx="5229955" cy="3924848"/>
+            <wp:effectExtent l="0" t="0" r="8890" b="0"/>
+            <wp:docPr id="1194793206" name="Picture 1"/>
+            <wp:cNvGraphicFramePr>
+              <a:graphicFrameLocks xmlns:a="http://schemas.openxmlformats.org/drawingml/2006/main" noChangeAspect="1"/>
+            </wp:cNvGraphicFramePr>
+            <a:graphic xmlns:a="http://schemas.openxmlformats.org/drawingml/2006/main">
+              <a:graphicData uri="http://schemas.openxmlformats.org/drawingml/2006/picture">
+                <pic:pic xmlns:pic="http://schemas.openxmlformats.org/drawingml/2006/picture">
+                  <pic:nvPicPr>
+                    <pic:cNvPr id="1194793206" name=""/>
+                    <pic:cNvPicPr/>
+                  </pic:nvPicPr>
+                  <pic:blipFill>
+                    <a:blip r:embed="rId36"/>
+                    <a:stretch>
+                      <a:fillRect/>
+                    </a:stretch>
+                  </pic:blipFill>
+                  <pic:spPr>
+                    <a:xfrm>
+                      <a:off x="0" y="0"/>
+                      <a:ext cx="5229955" cy="3924848"/>
+                    </a:xfrm>
+                    <a:prstGeom prst="rect">
+                      <a:avLst/>
+                    </a:prstGeom>
+                  </pic:spPr>
+                </pic:pic>
+              </a:graphicData>
+            </a:graphic>
+          </wp:inline>
+        </w:drawing>
+      </w:r>
+    </w:p>
+    <w:p>
+      <w:pPr>
+        <w:rPr>
+          <w:bCs/>
+          <w:lang w:val="vi-VN"/>
+        </w:rPr>
+      </w:pPr>
+      <w:r>
+        <w:rPr>
+          <w:bCs/>
+          <w:lang w:val="vi-VN"/>
+        </w:rPr>
+        <w:t>Mặc dù R4 chỉ cấu hình chạy định tuyến RIP, nhưng trong bảng định tuyến của R4 xuất hiện các tuyến đường "R" (được học qua RIP) trỏ về các mạng nằm sâu bên trong vùng OSPF (như 192.168.1.0 của C1). Điều này xảy ra do R2 đã nhúng (redistribute) mạng OSPF vào gói tin RIP và gửi cho R3, sau đó R3 tiếp tục truyền gói RIP đó cho R4. Nhờ vậy, R4 hoàn toàn thấy được toàn bộ hệ thống mạng bất kể giao thức gốc ở đầu kia là gì.</w:t>
+      </w:r>
     </w:p>
     <w:sectPr>
-      <w:footerReference w:type="default" r:id="rId34"/>
+      <w:footerReference w:type="default" r:id="rId37"/>
       <w:pgSz w:w="12240" w:h="15840"/>
       <w:pgMar w:top="1080" w:right="1440" w:bottom="1440" w:left="1440" w:header="720" w:footer="720" w:gutter="0"/>
       <w:pgNumType w:start="1"/>

</xml_diff>

<commit_message>
feat: generate and save PC build report to buildpc_1784508164.xls
</commit_message>
<xml_diff>
--- a/iuh/môn/hkh-4/dinhTuyenChuyenMach/lab/lab3/lab3-LeThanhLong.docx
+++ b/iuh/môn/hkh-4/dinhTuyenChuyenMach/lab/lab3/lab3-LeThanhLong.docx
@@ -731,7 +731,7 @@
           <w:sz w:val="26"/>
           <w:szCs w:val="26"/>
         </w:rPr>
-        <w:t xml:space="preserve">Thu </w:t>
+        <w:t xml:space="preserve">Mon </w:t>
       </w:r>
       <w:r>
         <w:rPr>
@@ -740,7 +740,7 @@
           <w:sz w:val="26"/>
           <w:szCs w:val="26"/>
         </w:rPr>
-        <w:t>09</w:t>
+        <w:t>15</w:t>
       </w:r>
       <w:r>
         <w:rPr>

</xml_diff>